<commit_message>
feat: integrar base de datos y renderizar catálogo dinámico en el Home. - Conexión de la capa de Presentación (Web) con las capas de Negocio y Dominio en Default.aspx.cs. - Obtención de la lista de artículos desde SQL Server mediante ArticuloNegocio.listar(). - Implementación de bucle foreach en HTML (Default.aspx) para la generación dinámica del catálogo. - Maquetación de productos utilizando el componente Card de Bootstrap 5 con sistema de grilla responsivo (row-cols). - Mapeo de datos (Nombre, Descripción, Precio, Imagen) y manejo de excepciones visuales (onerror en JS) para URLs de imágenes rotas o vacías.
</commit_message>
<xml_diff>
--- a/TPFinal - Nivel 3 - Web/Documentación_desarrollo_tpFinal.docx
+++ b/TPFinal - Nivel 3 - Web/Documentación_desarrollo_tpFinal.docx
@@ -3098,7 +3098,1353 @@
       </w:r>
     </w:p>
     <w:p/>
-    <w:p/>
+    <w:p>
+      <w:pPr>
+        <w:rPr>
+          <w:b/>
+          <w:bCs/>
+        </w:rPr>
+      </w:pPr>
+      <w:r>
+        <w:rPr>
+          <w:rFonts w:ascii="Segoe UI Emoji" w:hAnsi="Segoe UI Emoji" w:cs="Segoe UI Emoji"/>
+          <w:b/>
+          <w:bCs/>
+        </w:rPr>
+        <w:t>🚀</w:t>
+      </w:r>
+      <w:r>
+        <w:rPr>
+          <w:b/>
+          <w:bCs/>
+        </w:rPr>
+        <w:t xml:space="preserve"> Fase 3: ¡A darle vida al Catálogo! (El </w:t>
+      </w:r>
+      <w:proofErr w:type="spellStart"/>
+      <w:r>
+        <w:rPr>
+          <w:b/>
+          <w:bCs/>
+        </w:rPr>
+        <w:t>Code-Behind</w:t>
+      </w:r>
+      <w:proofErr w:type="spellEnd"/>
+      <w:r>
+        <w:rPr>
+          <w:b/>
+          <w:bCs/>
+        </w:rPr>
+        <w:t>)</w:t>
+      </w:r>
+    </w:p>
+    <w:p>
+      <w:r>
+        <w:t xml:space="preserve">Ahora que hiciste el </w:t>
+      </w:r>
+      <w:proofErr w:type="spellStart"/>
+      <w:r>
+        <w:t>commit</w:t>
+      </w:r>
+      <w:proofErr w:type="spellEnd"/>
+      <w:r>
+        <w:t xml:space="preserve"> y salvamos nuestro progreso visual, estamos listos para meterle el motor de base de datos a la página de inicio.</w:t>
+      </w:r>
+    </w:p>
+    <w:p>
+      <w:pPr>
+        <w:numPr>
+          <w:ilvl w:val="0"/>
+          <w:numId w:val="14"/>
+        </w:numPr>
+      </w:pPr>
+      <w:proofErr w:type="spellStart"/>
+      <w:r>
+        <w:t>Desplegá</w:t>
+      </w:r>
+      <w:proofErr w:type="spellEnd"/>
+      <w:r>
+        <w:t xml:space="preserve"> tu archivo Default.aspx en el Explorador de Soluciones y abrí el archivo de código C# (</w:t>
+      </w:r>
+      <w:proofErr w:type="spellStart"/>
+      <w:r>
+        <w:rPr>
+          <w:b/>
+          <w:bCs/>
+        </w:rPr>
+        <w:t>Default.aspx.cs</w:t>
+      </w:r>
+      <w:proofErr w:type="spellEnd"/>
+      <w:r>
+        <w:t>).</w:t>
+      </w:r>
+    </w:p>
+    <w:p>
+      <w:pPr>
+        <w:numPr>
+          <w:ilvl w:val="0"/>
+          <w:numId w:val="14"/>
+        </w:numPr>
+      </w:pPr>
+      <w:r>
+        <w:t xml:space="preserve">Arriba de todo, </w:t>
+      </w:r>
+      <w:proofErr w:type="spellStart"/>
+      <w:r>
+        <w:t>agregá</w:t>
+      </w:r>
+      <w:proofErr w:type="spellEnd"/>
+      <w:r>
+        <w:t xml:space="preserve"> los </w:t>
+      </w:r>
+      <w:proofErr w:type="spellStart"/>
+      <w:r>
+        <w:t>using</w:t>
+      </w:r>
+      <w:proofErr w:type="spellEnd"/>
+      <w:r>
+        <w:t xml:space="preserve"> para conectar las capas:</w:t>
+      </w:r>
+    </w:p>
+    <w:p>
+      <w:proofErr w:type="spellStart"/>
+      <w:r>
+        <w:t>using</w:t>
+      </w:r>
+      <w:proofErr w:type="spellEnd"/>
+      <w:r>
+        <w:t xml:space="preserve"> Dominio;</w:t>
+      </w:r>
+    </w:p>
+    <w:p>
+      <w:proofErr w:type="spellStart"/>
+      <w:r>
+        <w:t>using</w:t>
+      </w:r>
+      <w:proofErr w:type="spellEnd"/>
+      <w:r>
+        <w:t xml:space="preserve"> Negocio;</w:t>
+      </w:r>
+    </w:p>
+    <w:p>
+      <w:pPr>
+        <w:pStyle w:val="Prrafodelista"/>
+        <w:numPr>
+          <w:ilvl w:val="0"/>
+          <w:numId w:val="14"/>
+        </w:numPr>
+      </w:pPr>
+      <w:proofErr w:type="spellStart"/>
+      <w:r>
+        <w:t>Reemplazá</w:t>
+      </w:r>
+      <w:proofErr w:type="spellEnd"/>
+      <w:r>
+        <w:t xml:space="preserve"> la clase Default con este código. Vamos a instanciar </w:t>
+      </w:r>
+      <w:proofErr w:type="spellStart"/>
+      <w:r>
+        <w:t>ArticuloNegocio</w:t>
+      </w:r>
+      <w:proofErr w:type="spellEnd"/>
+      <w:r>
+        <w:t xml:space="preserve"> y guardar los artículos en una propiedad pública:</w:t>
+      </w:r>
+    </w:p>
+    <w:p>
+      <w:pPr>
+        <w:pStyle w:val="Prrafodelista"/>
+        <w:rPr>
+          <w:lang w:val="en-US"/>
+        </w:rPr>
+      </w:pPr>
+      <w:r>
+        <w:rPr>
+          <w:lang w:val="en-US"/>
+        </w:rPr>
+        <w:t xml:space="preserve">namespace </w:t>
+      </w:r>
+      <w:proofErr w:type="spellStart"/>
+      <w:r>
+        <w:rPr>
+          <w:lang w:val="en-US"/>
+        </w:rPr>
+        <w:t>e_commerce</w:t>
+      </w:r>
+      <w:proofErr w:type="spellEnd"/>
+    </w:p>
+    <w:p>
+      <w:pPr>
+        <w:pStyle w:val="Prrafodelista"/>
+        <w:rPr>
+          <w:lang w:val="en-US"/>
+        </w:rPr>
+      </w:pPr>
+      <w:r>
+        <w:rPr>
+          <w:lang w:val="en-US"/>
+        </w:rPr>
+        <w:t>{</w:t>
+      </w:r>
+    </w:p>
+    <w:p>
+      <w:pPr>
+        <w:pStyle w:val="Prrafodelista"/>
+        <w:rPr>
+          <w:lang w:val="en-US"/>
+        </w:rPr>
+      </w:pPr>
+      <w:r>
+        <w:rPr>
+          <w:lang w:val="en-US"/>
+        </w:rPr>
+        <w:t xml:space="preserve">    public partial class </w:t>
+      </w:r>
+      <w:proofErr w:type="gramStart"/>
+      <w:r>
+        <w:rPr>
+          <w:lang w:val="en-US"/>
+        </w:rPr>
+        <w:t>Default :</w:t>
+      </w:r>
+      <w:proofErr w:type="gramEnd"/>
+      <w:r>
+        <w:rPr>
+          <w:lang w:val="en-US"/>
+        </w:rPr>
+        <w:t xml:space="preserve"> </w:t>
+      </w:r>
+      <w:proofErr w:type="spellStart"/>
+      <w:r>
+        <w:rPr>
+          <w:lang w:val="en-US"/>
+        </w:rPr>
+        <w:t>System.Web.UI.Page</w:t>
+      </w:r>
+      <w:proofErr w:type="spellEnd"/>
+    </w:p>
+    <w:p>
+      <w:pPr>
+        <w:pStyle w:val="Prrafodelista"/>
+      </w:pPr>
+      <w:r>
+        <w:rPr>
+          <w:lang w:val="en-US"/>
+        </w:rPr>
+        <w:t xml:space="preserve">    </w:t>
+      </w:r>
+      <w:r>
+        <w:t>{</w:t>
+      </w:r>
+    </w:p>
+    <w:p>
+      <w:pPr>
+        <w:pStyle w:val="Prrafodelista"/>
+      </w:pPr>
+      <w:r>
+        <w:t xml:space="preserve">        // Propiedad pública para que el Front-</w:t>
+      </w:r>
+      <w:proofErr w:type="spellStart"/>
+      <w:r>
+        <w:t>End</w:t>
+      </w:r>
+      <w:proofErr w:type="spellEnd"/>
+      <w:r>
+        <w:t xml:space="preserve"> (HTML) pueda leer la lista</w:t>
+      </w:r>
+    </w:p>
+    <w:p>
+      <w:pPr>
+        <w:pStyle w:val="Prrafodelista"/>
+        <w:rPr>
+          <w:lang w:val="en-US"/>
+        </w:rPr>
+      </w:pPr>
+      <w:r>
+        <w:t xml:space="preserve">        </w:t>
+      </w:r>
+      <w:r>
+        <w:rPr>
+          <w:lang w:val="en-US"/>
+        </w:rPr>
+        <w:t>public List&lt;</w:t>
+      </w:r>
+      <w:proofErr w:type="spellStart"/>
+      <w:r>
+        <w:rPr>
+          <w:lang w:val="en-US"/>
+        </w:rPr>
+        <w:t>Articulo</w:t>
+      </w:r>
+      <w:proofErr w:type="spellEnd"/>
+      <w:r>
+        <w:rPr>
+          <w:lang w:val="en-US"/>
+        </w:rPr>
+        <w:t xml:space="preserve">&gt; </w:t>
+      </w:r>
+      <w:proofErr w:type="spellStart"/>
+      <w:r>
+        <w:rPr>
+          <w:lang w:val="en-US"/>
+        </w:rPr>
+        <w:t>ListaArticulos</w:t>
+      </w:r>
+      <w:proofErr w:type="spellEnd"/>
+      <w:r>
+        <w:rPr>
+          <w:lang w:val="en-US"/>
+        </w:rPr>
+        <w:t xml:space="preserve"> </w:t>
+      </w:r>
+      <w:proofErr w:type="gramStart"/>
+      <w:r>
+        <w:rPr>
+          <w:lang w:val="en-US"/>
+        </w:rPr>
+        <w:t>{ get</w:t>
+      </w:r>
+      <w:proofErr w:type="gramEnd"/>
+      <w:r>
+        <w:rPr>
+          <w:lang w:val="en-US"/>
+        </w:rPr>
+        <w:t>; set; }</w:t>
+      </w:r>
+    </w:p>
+    <w:p>
+      <w:pPr>
+        <w:pStyle w:val="Prrafodelista"/>
+        <w:rPr>
+          <w:lang w:val="en-US"/>
+        </w:rPr>
+      </w:pPr>
+    </w:p>
+    <w:p>
+      <w:pPr>
+        <w:pStyle w:val="Prrafodelista"/>
+        <w:rPr>
+          <w:lang w:val="en-US"/>
+        </w:rPr>
+      </w:pPr>
+      <w:r>
+        <w:rPr>
+          <w:lang w:val="en-US"/>
+        </w:rPr>
+        <w:t xml:space="preserve">        protected void </w:t>
+      </w:r>
+      <w:proofErr w:type="spellStart"/>
+      <w:r>
+        <w:rPr>
+          <w:lang w:val="en-US"/>
+        </w:rPr>
+        <w:t>Page_</w:t>
+      </w:r>
+      <w:proofErr w:type="gramStart"/>
+      <w:r>
+        <w:rPr>
+          <w:lang w:val="en-US"/>
+        </w:rPr>
+        <w:t>Load</w:t>
+      </w:r>
+      <w:proofErr w:type="spellEnd"/>
+      <w:r>
+        <w:rPr>
+          <w:lang w:val="en-US"/>
+        </w:rPr>
+        <w:t>(</w:t>
+      </w:r>
+      <w:proofErr w:type="gramEnd"/>
+      <w:r>
+        <w:rPr>
+          <w:lang w:val="en-US"/>
+        </w:rPr>
+        <w:t xml:space="preserve">object sender, </w:t>
+      </w:r>
+      <w:proofErr w:type="spellStart"/>
+      <w:r>
+        <w:rPr>
+          <w:lang w:val="en-US"/>
+        </w:rPr>
+        <w:t>EventArgs</w:t>
+      </w:r>
+      <w:proofErr w:type="spellEnd"/>
+      <w:r>
+        <w:rPr>
+          <w:lang w:val="en-US"/>
+        </w:rPr>
+        <w:t xml:space="preserve"> e)</w:t>
+      </w:r>
+    </w:p>
+    <w:p>
+      <w:pPr>
+        <w:pStyle w:val="Prrafodelista"/>
+      </w:pPr>
+      <w:r>
+        <w:rPr>
+          <w:lang w:val="en-US"/>
+        </w:rPr>
+        <w:t xml:space="preserve">        </w:t>
+      </w:r>
+      <w:r>
+        <w:t>{</w:t>
+      </w:r>
+    </w:p>
+    <w:p>
+      <w:pPr>
+        <w:pStyle w:val="Prrafodelista"/>
+      </w:pPr>
+      <w:r>
+        <w:t xml:space="preserve">            // Instanciamos el negocio que trajimos de tu Nivel 2</w:t>
+      </w:r>
+    </w:p>
+    <w:p>
+      <w:pPr>
+        <w:pStyle w:val="Prrafodelista"/>
+      </w:pPr>
+      <w:r>
+        <w:t xml:space="preserve">            </w:t>
+      </w:r>
+      <w:proofErr w:type="spellStart"/>
+      <w:r>
+        <w:t>ArticuloNegocio</w:t>
+      </w:r>
+      <w:proofErr w:type="spellEnd"/>
+      <w:r>
+        <w:t xml:space="preserve"> negocio = new </w:t>
+      </w:r>
+      <w:proofErr w:type="spellStart"/>
+      <w:proofErr w:type="gramStart"/>
+      <w:r>
+        <w:t>ArticuloNegocio</w:t>
+      </w:r>
+      <w:proofErr w:type="spellEnd"/>
+      <w:r>
+        <w:t>(</w:t>
+      </w:r>
+      <w:proofErr w:type="gramEnd"/>
+      <w:r>
+        <w:t>);</w:t>
+      </w:r>
+    </w:p>
+    <w:p>
+      <w:pPr>
+        <w:pStyle w:val="Prrafodelista"/>
+      </w:pPr>
+      <w:r>
+        <w:t xml:space="preserve">            </w:t>
+      </w:r>
+    </w:p>
+    <w:p>
+      <w:pPr>
+        <w:pStyle w:val="Prrafodelista"/>
+      </w:pPr>
+      <w:r>
+        <w:t xml:space="preserve">            // Llenamos la lista con el método </w:t>
+      </w:r>
+      <w:proofErr w:type="gramStart"/>
+      <w:r>
+        <w:t>listar(</w:t>
+      </w:r>
+      <w:proofErr w:type="gramEnd"/>
+      <w:r>
+        <w:t>)</w:t>
+      </w:r>
+    </w:p>
+    <w:p>
+      <w:pPr>
+        <w:pStyle w:val="Prrafodelista"/>
+      </w:pPr>
+      <w:r>
+        <w:t xml:space="preserve">            </w:t>
+      </w:r>
+      <w:proofErr w:type="spellStart"/>
+      <w:r>
+        <w:t>ListaArticulos</w:t>
+      </w:r>
+      <w:proofErr w:type="spellEnd"/>
+      <w:r>
+        <w:t xml:space="preserve"> = </w:t>
+      </w:r>
+      <w:proofErr w:type="spellStart"/>
+      <w:proofErr w:type="gramStart"/>
+      <w:r>
+        <w:t>negocio.listar</w:t>
+      </w:r>
+      <w:proofErr w:type="spellEnd"/>
+      <w:proofErr w:type="gramEnd"/>
+      <w:r>
+        <w:t xml:space="preserve">(); </w:t>
+      </w:r>
+    </w:p>
+    <w:p>
+      <w:pPr>
+        <w:pStyle w:val="Prrafodelista"/>
+      </w:pPr>
+      <w:r>
+        <w:t xml:space="preserve">        }</w:t>
+      </w:r>
+    </w:p>
+    <w:p>
+      <w:pPr>
+        <w:pStyle w:val="Prrafodelista"/>
+      </w:pPr>
+      <w:r>
+        <w:t xml:space="preserve">    }</w:t>
+      </w:r>
+    </w:p>
+    <w:p>
+      <w:pPr>
+        <w:pStyle w:val="Prrafodelista"/>
+      </w:pPr>
+      <w:r>
+        <w:t>}</w:t>
+      </w:r>
+    </w:p>
+    <w:p>
+      <w:pPr>
+        <w:pStyle w:val="Prrafodelista"/>
+      </w:pPr>
+    </w:p>
+    <w:p>
+      <w:pPr>
+        <w:pStyle w:val="Prrafodelista"/>
+        <w:rPr>
+          <w:b/>
+          <w:bCs/>
+        </w:rPr>
+      </w:pPr>
+      <w:r>
+        <w:rPr>
+          <w:rFonts w:ascii="Segoe UI Emoji" w:hAnsi="Segoe UI Emoji" w:cs="Segoe UI Emoji"/>
+          <w:b/>
+          <w:bCs/>
+        </w:rPr>
+        <w:t>🚀</w:t>
+      </w:r>
+      <w:r>
+        <w:rPr>
+          <w:b/>
+          <w:bCs/>
+        </w:rPr>
+        <w:t xml:space="preserve"> Fase 3: Dibujando las Tarjetas (Default.aspx)</w:t>
+      </w:r>
+    </w:p>
+    <w:p>
+      <w:pPr>
+        <w:pStyle w:val="Prrafodelista"/>
+      </w:pPr>
+      <w:r>
+        <w:t>Con la lista ya cargada en la memoria del servidor, vamos a decirle al HTML que dibuje una "</w:t>
+      </w:r>
+      <w:proofErr w:type="spellStart"/>
+      <w:r>
+        <w:t>Card</w:t>
+      </w:r>
+      <w:proofErr w:type="spellEnd"/>
+      <w:r>
+        <w:t>" (tarjeta) de Bootstrap por cada artículo.</w:t>
+      </w:r>
+    </w:p>
+    <w:p>
+      <w:pPr>
+        <w:pStyle w:val="Prrafodelista"/>
+        <w:numPr>
+          <w:ilvl w:val="0"/>
+          <w:numId w:val="15"/>
+        </w:numPr>
+      </w:pPr>
+      <w:proofErr w:type="spellStart"/>
+      <w:r>
+        <w:t>Volvé</w:t>
+      </w:r>
+      <w:proofErr w:type="spellEnd"/>
+      <w:r>
+        <w:t xml:space="preserve"> a tu archivo visual </w:t>
+      </w:r>
+      <w:r>
+        <w:rPr>
+          <w:b/>
+          <w:bCs/>
+        </w:rPr>
+        <w:t>Default.aspx</w:t>
+      </w:r>
+      <w:r>
+        <w:t>.</w:t>
+      </w:r>
+    </w:p>
+    <w:p>
+      <w:pPr>
+        <w:pStyle w:val="Prrafodelista"/>
+        <w:numPr>
+          <w:ilvl w:val="0"/>
+          <w:numId w:val="15"/>
+        </w:numPr>
+      </w:pPr>
+      <w:proofErr w:type="spellStart"/>
+      <w:r>
+        <w:t>Reemplazá</w:t>
+      </w:r>
+      <w:proofErr w:type="spellEnd"/>
+      <w:r>
+        <w:t xml:space="preserve"> todo el contenido que está adentro de tu &lt;</w:t>
+      </w:r>
+      <w:proofErr w:type="spellStart"/>
+      <w:proofErr w:type="gramStart"/>
+      <w:r>
+        <w:t>asp:Content</w:t>
+      </w:r>
+      <w:proofErr w:type="spellEnd"/>
+      <w:proofErr w:type="gramEnd"/>
+      <w:r>
+        <w:t xml:space="preserve"> ...&gt; por esto:</w:t>
+      </w:r>
+    </w:p>
+    <w:p>
+      <w:pPr>
+        <w:pStyle w:val="Prrafodelista"/>
+      </w:pPr>
+    </w:p>
+    <w:p>
+      <w:pPr>
+        <w:pStyle w:val="Prrafodelista"/>
+        <w:rPr>
+          <w:lang w:val="en-US"/>
+        </w:rPr>
+      </w:pPr>
+      <w:r>
+        <w:rPr>
+          <w:lang w:val="en-US"/>
+        </w:rPr>
+        <w:t>&lt;</w:t>
+      </w:r>
+      <w:proofErr w:type="spellStart"/>
+      <w:proofErr w:type="gramStart"/>
+      <w:r>
+        <w:rPr>
+          <w:lang w:val="en-US"/>
+        </w:rPr>
+        <w:t>asp:Content</w:t>
+      </w:r>
+      <w:proofErr w:type="spellEnd"/>
+      <w:proofErr w:type="gramEnd"/>
+      <w:r>
+        <w:rPr>
+          <w:lang w:val="en-US"/>
+        </w:rPr>
+        <w:t xml:space="preserve"> ID="Content2" </w:t>
+      </w:r>
+      <w:proofErr w:type="spellStart"/>
+      <w:r>
+        <w:rPr>
+          <w:lang w:val="en-US"/>
+        </w:rPr>
+        <w:t>ContentPlaceHolderID</w:t>
+      </w:r>
+      <w:proofErr w:type="spellEnd"/>
+      <w:r>
+        <w:rPr>
+          <w:lang w:val="en-US"/>
+        </w:rPr>
+        <w:t>="</w:t>
+      </w:r>
+      <w:proofErr w:type="spellStart"/>
+      <w:r>
+        <w:rPr>
+          <w:lang w:val="en-US"/>
+        </w:rPr>
+        <w:t>MainContent</w:t>
+      </w:r>
+      <w:proofErr w:type="spellEnd"/>
+      <w:r>
+        <w:rPr>
+          <w:lang w:val="en-US"/>
+        </w:rPr>
+        <w:t xml:space="preserve">" </w:t>
+      </w:r>
+      <w:proofErr w:type="spellStart"/>
+      <w:r>
+        <w:rPr>
+          <w:lang w:val="en-US"/>
+        </w:rPr>
+        <w:t>runat</w:t>
+      </w:r>
+      <w:proofErr w:type="spellEnd"/>
+      <w:r>
+        <w:rPr>
+          <w:lang w:val="en-US"/>
+        </w:rPr>
+        <w:t>="server"&gt;</w:t>
+      </w:r>
+    </w:p>
+    <w:p>
+      <w:pPr>
+        <w:pStyle w:val="Prrafodelista"/>
+        <w:rPr>
+          <w:lang w:val="en-US"/>
+        </w:rPr>
+      </w:pPr>
+      <w:r>
+        <w:rPr>
+          <w:lang w:val="en-US"/>
+        </w:rPr>
+        <w:t xml:space="preserve">    </w:t>
+      </w:r>
+    </w:p>
+    <w:p>
+      <w:pPr>
+        <w:pStyle w:val="Prrafodelista"/>
+      </w:pPr>
+      <w:r>
+        <w:rPr>
+          <w:lang w:val="en-US"/>
+        </w:rPr>
+        <w:t xml:space="preserve">    </w:t>
+      </w:r>
+      <w:r>
+        <w:t xml:space="preserve">&lt;h1 </w:t>
+      </w:r>
+      <w:proofErr w:type="spellStart"/>
+      <w:r>
+        <w:t>class</w:t>
+      </w:r>
+      <w:proofErr w:type="spellEnd"/>
+      <w:r>
+        <w:t>="mb-4"</w:t>
+      </w:r>
+      <w:proofErr w:type="gramStart"/>
+      <w:r>
+        <w:t>&gt;¡</w:t>
+      </w:r>
+      <w:proofErr w:type="gramEnd"/>
+      <w:r>
+        <w:t>Bienvenido a mi Tienda Virtual!&lt;/h1&gt;</w:t>
+      </w:r>
+    </w:p>
+    <w:p>
+      <w:pPr>
+        <w:pStyle w:val="Prrafodelista"/>
+      </w:pPr>
+    </w:p>
+    <w:p>
+      <w:pPr>
+        <w:pStyle w:val="Prrafodelista"/>
+      </w:pPr>
+      <w:r>
+        <w:t xml:space="preserve">    &lt;%-- Grilla de Bootstrap: 1 columna en celulares, 3 columnas en pantallas medianas --%&gt;</w:t>
+      </w:r>
+    </w:p>
+    <w:p>
+      <w:pPr>
+        <w:pStyle w:val="Prrafodelista"/>
+        <w:rPr>
+          <w:lang w:val="en-US"/>
+        </w:rPr>
+      </w:pPr>
+      <w:r>
+        <w:t xml:space="preserve">    </w:t>
+      </w:r>
+      <w:r>
+        <w:rPr>
+          <w:lang w:val="en-US"/>
+        </w:rPr>
+        <w:t>&lt;div class="row row-cols-1 row-cols-md-3 g-4"&gt;</w:t>
+      </w:r>
+    </w:p>
+    <w:p>
+      <w:pPr>
+        <w:pStyle w:val="Prrafodelista"/>
+        <w:rPr>
+          <w:lang w:val="en-US"/>
+        </w:rPr>
+      </w:pPr>
+      <w:r>
+        <w:rPr>
+          <w:lang w:val="en-US"/>
+        </w:rPr>
+        <w:t xml:space="preserve">        </w:t>
+      </w:r>
+    </w:p>
+    <w:p>
+      <w:pPr>
+        <w:pStyle w:val="Prrafodelista"/>
+      </w:pPr>
+      <w:r>
+        <w:rPr>
+          <w:lang w:val="en-US"/>
+        </w:rPr>
+        <w:t xml:space="preserve">        </w:t>
+      </w:r>
+      <w:r>
+        <w:t xml:space="preserve">&lt;%-- Bucle </w:t>
+      </w:r>
+      <w:proofErr w:type="spellStart"/>
+      <w:r>
+        <w:t>foreach</w:t>
+      </w:r>
+      <w:proofErr w:type="spellEnd"/>
+      <w:r>
+        <w:t xml:space="preserve"> nativo de C# incrustado en HTML --%&gt;</w:t>
+      </w:r>
+    </w:p>
+    <w:p>
+      <w:pPr>
+        <w:pStyle w:val="Prrafodelista"/>
+        <w:rPr>
+          <w:lang w:val="en-US"/>
+        </w:rPr>
+      </w:pPr>
+      <w:r>
+        <w:t xml:space="preserve">        </w:t>
+      </w:r>
+      <w:r>
+        <w:rPr>
+          <w:lang w:val="en-US"/>
+        </w:rPr>
+        <w:t>&lt;% foreach (</w:t>
+      </w:r>
+      <w:proofErr w:type="spellStart"/>
+      <w:r>
+        <w:rPr>
+          <w:lang w:val="en-US"/>
+        </w:rPr>
+        <w:t>Dominio.Articulo</w:t>
+      </w:r>
+      <w:proofErr w:type="spellEnd"/>
+      <w:r>
+        <w:rPr>
+          <w:lang w:val="en-US"/>
+        </w:rPr>
+        <w:t xml:space="preserve"> art in </w:t>
+      </w:r>
+      <w:proofErr w:type="spellStart"/>
+      <w:r>
+        <w:rPr>
+          <w:lang w:val="en-US"/>
+        </w:rPr>
+        <w:t>ListaArticulos</w:t>
+      </w:r>
+      <w:proofErr w:type="spellEnd"/>
+      <w:r>
+        <w:rPr>
+          <w:lang w:val="en-US"/>
+        </w:rPr>
+        <w:t>)</w:t>
+      </w:r>
+    </w:p>
+    <w:p>
+      <w:pPr>
+        <w:pStyle w:val="Prrafodelista"/>
+        <w:rPr>
+          <w:lang w:val="en-US"/>
+        </w:rPr>
+      </w:pPr>
+      <w:r>
+        <w:rPr>
+          <w:lang w:val="en-US"/>
+        </w:rPr>
+        <w:t xml:space="preserve">           { %&gt;</w:t>
+      </w:r>
+    </w:p>
+    <w:p>
+      <w:pPr>
+        <w:pStyle w:val="Prrafodelista"/>
+        <w:rPr>
+          <w:lang w:val="en-US"/>
+        </w:rPr>
+      </w:pPr>
+      <w:r>
+        <w:rPr>
+          <w:lang w:val="en-US"/>
+        </w:rPr>
+        <w:t xml:space="preserve">            </w:t>
+      </w:r>
+    </w:p>
+    <w:p>
+      <w:pPr>
+        <w:pStyle w:val="Prrafodelista"/>
+        <w:rPr>
+          <w:lang w:val="en-US"/>
+        </w:rPr>
+      </w:pPr>
+      <w:r>
+        <w:rPr>
+          <w:lang w:val="en-US"/>
+        </w:rPr>
+        <w:t xml:space="preserve">            &lt;div class="col"&gt;</w:t>
+      </w:r>
+    </w:p>
+    <w:p>
+      <w:pPr>
+        <w:pStyle w:val="Prrafodelista"/>
+        <w:rPr>
+          <w:lang w:val="en-US"/>
+        </w:rPr>
+      </w:pPr>
+      <w:r>
+        <w:rPr>
+          <w:lang w:val="en-US"/>
+        </w:rPr>
+        <w:t xml:space="preserve">                &lt;div class="card h-100"&gt;</w:t>
+      </w:r>
+    </w:p>
+    <w:p>
+      <w:pPr>
+        <w:pStyle w:val="Prrafodelista"/>
+      </w:pPr>
+      <w:r>
+        <w:rPr>
+          <w:lang w:val="en-US"/>
+        </w:rPr>
+        <w:t xml:space="preserve">                    </w:t>
+      </w:r>
+      <w:r>
+        <w:t>&lt;%-- Imagen del artículo. Si la URL está rota, el '</w:t>
+      </w:r>
+      <w:proofErr w:type="spellStart"/>
+      <w:r>
+        <w:t>onerror</w:t>
+      </w:r>
+      <w:proofErr w:type="spellEnd"/>
+      <w:r>
+        <w:t>' carga una imagen por defecto --%&gt;</w:t>
+      </w:r>
+    </w:p>
+    <w:p>
+      <w:pPr>
+        <w:pStyle w:val="Prrafodelista"/>
+        <w:rPr>
+          <w:lang w:val="en-US"/>
+        </w:rPr>
+      </w:pPr>
+      <w:r>
+        <w:t xml:space="preserve">                    </w:t>
+      </w:r>
+      <w:r>
+        <w:rPr>
+          <w:lang w:val="en-US"/>
+        </w:rPr>
+        <w:t>&lt;</w:t>
+      </w:r>
+      <w:proofErr w:type="spellStart"/>
+      <w:r>
+        <w:rPr>
+          <w:lang w:val="en-US"/>
+        </w:rPr>
+        <w:t>img</w:t>
+      </w:r>
+      <w:proofErr w:type="spellEnd"/>
+      <w:r>
+        <w:rPr>
+          <w:lang w:val="en-US"/>
+        </w:rPr>
+        <w:t xml:space="preserve"> </w:t>
+      </w:r>
+      <w:proofErr w:type="spellStart"/>
+      <w:r>
+        <w:rPr>
+          <w:lang w:val="en-US"/>
+        </w:rPr>
+        <w:t>src</w:t>
+      </w:r>
+      <w:proofErr w:type="spellEnd"/>
+      <w:r>
+        <w:rPr>
+          <w:lang w:val="en-US"/>
+        </w:rPr>
+        <w:t xml:space="preserve">="&lt;%: </w:t>
+      </w:r>
+      <w:proofErr w:type="spellStart"/>
+      <w:proofErr w:type="gramStart"/>
+      <w:r>
+        <w:rPr>
+          <w:lang w:val="en-US"/>
+        </w:rPr>
+        <w:t>art.ImagenUrl</w:t>
+      </w:r>
+      <w:proofErr w:type="spellEnd"/>
+      <w:proofErr w:type="gramEnd"/>
+      <w:r>
+        <w:rPr>
+          <w:lang w:val="en-US"/>
+        </w:rPr>
+        <w:t xml:space="preserve"> %&gt;" class="card-</w:t>
+      </w:r>
+      <w:proofErr w:type="spellStart"/>
+      <w:r>
+        <w:rPr>
+          <w:lang w:val="en-US"/>
+        </w:rPr>
+        <w:t>img</w:t>
+      </w:r>
+      <w:proofErr w:type="spellEnd"/>
+      <w:r>
+        <w:rPr>
+          <w:lang w:val="en-US"/>
+        </w:rPr>
+        <w:t xml:space="preserve">-top" alt="&lt;%: </w:t>
+      </w:r>
+      <w:proofErr w:type="spellStart"/>
+      <w:r>
+        <w:rPr>
+          <w:lang w:val="en-US"/>
+        </w:rPr>
+        <w:t>art.Nombre</w:t>
+      </w:r>
+      <w:proofErr w:type="spellEnd"/>
+      <w:r>
+        <w:rPr>
+          <w:lang w:val="en-US"/>
+        </w:rPr>
+        <w:t xml:space="preserve"> %&gt;" </w:t>
+      </w:r>
+    </w:p>
+    <w:p>
+      <w:pPr>
+        <w:pStyle w:val="Prrafodelista"/>
+        <w:rPr>
+          <w:lang w:val="en-US"/>
+        </w:rPr>
+      </w:pPr>
+      <w:r>
+        <w:rPr>
+          <w:lang w:val="en-US"/>
+        </w:rPr>
+        <w:t xml:space="preserve">                         onerror="this.src='https://cdn.pixabay.com/photo/2015/10/05/22/37/blank-profile-picture-973460_960_720.png'"&gt;</w:t>
+      </w:r>
+    </w:p>
+    <w:p>
+      <w:pPr>
+        <w:pStyle w:val="Prrafodelista"/>
+        <w:rPr>
+          <w:lang w:val="en-US"/>
+        </w:rPr>
+      </w:pPr>
+      <w:r>
+        <w:rPr>
+          <w:lang w:val="en-US"/>
+        </w:rPr>
+        <w:t xml:space="preserve">                    </w:t>
+      </w:r>
+    </w:p>
+    <w:p>
+      <w:pPr>
+        <w:pStyle w:val="Prrafodelista"/>
+        <w:rPr>
+          <w:lang w:val="en-US"/>
+        </w:rPr>
+      </w:pPr>
+      <w:r>
+        <w:rPr>
+          <w:lang w:val="en-US"/>
+        </w:rPr>
+        <w:t xml:space="preserve">                    &lt;div class="card-body"&gt;</w:t>
+      </w:r>
+    </w:p>
+    <w:p>
+      <w:pPr>
+        <w:pStyle w:val="Prrafodelista"/>
+        <w:rPr>
+          <w:lang w:val="en-US"/>
+        </w:rPr>
+      </w:pPr>
+      <w:r>
+        <w:rPr>
+          <w:lang w:val="en-US"/>
+        </w:rPr>
+        <w:t xml:space="preserve">                        &lt;h5 class="card-title"&gt;&lt;%: </w:t>
+      </w:r>
+      <w:proofErr w:type="spellStart"/>
+      <w:proofErr w:type="gramStart"/>
+      <w:r>
+        <w:rPr>
+          <w:lang w:val="en-US"/>
+        </w:rPr>
+        <w:t>art.Nombre</w:t>
+      </w:r>
+      <w:proofErr w:type="spellEnd"/>
+      <w:proofErr w:type="gramEnd"/>
+      <w:r>
+        <w:rPr>
+          <w:lang w:val="en-US"/>
+        </w:rPr>
+        <w:t xml:space="preserve"> %&gt;&lt;/h5&gt;</w:t>
+      </w:r>
+    </w:p>
+    <w:p>
+      <w:pPr>
+        <w:pStyle w:val="Prrafodelista"/>
+        <w:rPr>
+          <w:lang w:val="en-US"/>
+        </w:rPr>
+      </w:pPr>
+      <w:r>
+        <w:rPr>
+          <w:lang w:val="en-US"/>
+        </w:rPr>
+        <w:t xml:space="preserve">                        &lt;p class="card-text"&gt;&lt;%: </w:t>
+      </w:r>
+      <w:proofErr w:type="spellStart"/>
+      <w:proofErr w:type="gramStart"/>
+      <w:r>
+        <w:rPr>
+          <w:lang w:val="en-US"/>
+        </w:rPr>
+        <w:t>art.Descripcion</w:t>
+      </w:r>
+      <w:proofErr w:type="spellEnd"/>
+      <w:proofErr w:type="gramEnd"/>
+      <w:r>
+        <w:rPr>
+          <w:lang w:val="en-US"/>
+        </w:rPr>
+        <w:t xml:space="preserve"> %&gt;&lt;/p&gt;</w:t>
+      </w:r>
+    </w:p>
+    <w:p>
+      <w:pPr>
+        <w:pStyle w:val="Prrafodelista"/>
+        <w:rPr>
+          <w:lang w:val="en-US"/>
+        </w:rPr>
+      </w:pPr>
+      <w:r>
+        <w:rPr>
+          <w:lang w:val="en-US"/>
+        </w:rPr>
+        <w:t xml:space="preserve">                        &lt;p class="card-text fs-5 text-success </w:t>
+      </w:r>
+      <w:proofErr w:type="spellStart"/>
+      <w:r>
+        <w:rPr>
+          <w:lang w:val="en-US"/>
+        </w:rPr>
+        <w:t>fw</w:t>
+      </w:r>
+      <w:proofErr w:type="spellEnd"/>
+      <w:r>
+        <w:rPr>
+          <w:lang w:val="en-US"/>
+        </w:rPr>
+        <w:t xml:space="preserve">-bold"&gt;$ &lt;%: </w:t>
+      </w:r>
+      <w:proofErr w:type="spellStart"/>
+      <w:proofErr w:type="gramStart"/>
+      <w:r>
+        <w:rPr>
+          <w:lang w:val="en-US"/>
+        </w:rPr>
+        <w:t>art.Precio</w:t>
+      </w:r>
+      <w:proofErr w:type="spellEnd"/>
+      <w:proofErr w:type="gramEnd"/>
+      <w:r>
+        <w:rPr>
+          <w:lang w:val="en-US"/>
+        </w:rPr>
+        <w:t xml:space="preserve"> %&gt;&lt;/p&gt;</w:t>
+      </w:r>
+    </w:p>
+    <w:p>
+      <w:pPr>
+        <w:pStyle w:val="Prrafodelista"/>
+        <w:rPr>
+          <w:lang w:val="en-US"/>
+        </w:rPr>
+      </w:pPr>
+      <w:r>
+        <w:rPr>
+          <w:lang w:val="en-US"/>
+        </w:rPr>
+        <w:t xml:space="preserve">                        </w:t>
+      </w:r>
+    </w:p>
+    <w:p>
+      <w:pPr>
+        <w:pStyle w:val="Prrafodelista"/>
+      </w:pPr>
+      <w:r>
+        <w:rPr>
+          <w:lang w:val="en-US"/>
+        </w:rPr>
+        <w:t xml:space="preserve">                        </w:t>
+      </w:r>
+      <w:r>
+        <w:t>&lt;%-- Botón que nos llevará a la futura pantalla de detalle --%&gt;</w:t>
+      </w:r>
+    </w:p>
+    <w:p>
+      <w:pPr>
+        <w:pStyle w:val="Prrafodelista"/>
+      </w:pPr>
+      <w:r>
+        <w:t xml:space="preserve">                        &lt;a </w:t>
+      </w:r>
+      <w:proofErr w:type="spellStart"/>
+      <w:r>
+        <w:t>href</w:t>
+      </w:r>
+      <w:proofErr w:type="spellEnd"/>
+      <w:r>
+        <w:t>="</w:t>
+      </w:r>
+      <w:proofErr w:type="spellStart"/>
+      <w:r>
+        <w:t>Detalle.aspx?id</w:t>
+      </w:r>
+      <w:proofErr w:type="spellEnd"/>
+      <w:r>
+        <w:t xml:space="preserve">=&lt;%: </w:t>
+      </w:r>
+      <w:proofErr w:type="spellStart"/>
+      <w:proofErr w:type="gramStart"/>
+      <w:r>
+        <w:t>art.Id</w:t>
+      </w:r>
+      <w:proofErr w:type="spellEnd"/>
+      <w:proofErr w:type="gramEnd"/>
+      <w:r>
+        <w:t xml:space="preserve"> %&gt;" </w:t>
+      </w:r>
+      <w:proofErr w:type="spellStart"/>
+      <w:r>
+        <w:t>class</w:t>
+      </w:r>
+      <w:proofErr w:type="spellEnd"/>
+      <w:r>
+        <w:t>="</w:t>
+      </w:r>
+      <w:proofErr w:type="spellStart"/>
+      <w:r>
+        <w:t>btn</w:t>
+      </w:r>
+      <w:proofErr w:type="spellEnd"/>
+      <w:r>
+        <w:t xml:space="preserve"> </w:t>
+      </w:r>
+      <w:proofErr w:type="spellStart"/>
+      <w:r>
+        <w:t>btn-primary</w:t>
+      </w:r>
+      <w:proofErr w:type="spellEnd"/>
+      <w:r>
+        <w:t>"&gt;Ver Detalles&lt;/a&gt;</w:t>
+      </w:r>
+    </w:p>
+    <w:p>
+      <w:pPr>
+        <w:pStyle w:val="Prrafodelista"/>
+      </w:pPr>
+      <w:r>
+        <w:t xml:space="preserve">                    &lt;/</w:t>
+      </w:r>
+      <w:proofErr w:type="spellStart"/>
+      <w:r>
+        <w:t>div</w:t>
+      </w:r>
+      <w:proofErr w:type="spellEnd"/>
+      <w:r>
+        <w:t>&gt;</w:t>
+      </w:r>
+    </w:p>
+    <w:p>
+      <w:pPr>
+        <w:pStyle w:val="Prrafodelista"/>
+      </w:pPr>
+      <w:r>
+        <w:t xml:space="preserve">                &lt;/</w:t>
+      </w:r>
+      <w:proofErr w:type="spellStart"/>
+      <w:r>
+        <w:t>div</w:t>
+      </w:r>
+      <w:proofErr w:type="spellEnd"/>
+      <w:r>
+        <w:t>&gt;</w:t>
+      </w:r>
+    </w:p>
+    <w:p>
+      <w:pPr>
+        <w:pStyle w:val="Prrafodelista"/>
+      </w:pPr>
+      <w:r>
+        <w:t xml:space="preserve">            &lt;/</w:t>
+      </w:r>
+      <w:proofErr w:type="spellStart"/>
+      <w:r>
+        <w:t>div</w:t>
+      </w:r>
+      <w:proofErr w:type="spellEnd"/>
+      <w:r>
+        <w:t>&gt;</w:t>
+      </w:r>
+    </w:p>
+    <w:p>
+      <w:pPr>
+        <w:pStyle w:val="Prrafodelista"/>
+      </w:pPr>
+    </w:p>
+    <w:p>
+      <w:pPr>
+        <w:pStyle w:val="Prrafodelista"/>
+      </w:pPr>
+      <w:r>
+        <w:t xml:space="preserve">        &lt;% } %&gt;</w:t>
+      </w:r>
+    </w:p>
+    <w:p>
+      <w:pPr>
+        <w:pStyle w:val="Prrafodelista"/>
+      </w:pPr>
+    </w:p>
+    <w:p>
+      <w:pPr>
+        <w:pStyle w:val="Prrafodelista"/>
+      </w:pPr>
+      <w:r>
+        <w:t xml:space="preserve">    &lt;/</w:t>
+      </w:r>
+      <w:proofErr w:type="spellStart"/>
+      <w:r>
+        <w:t>div</w:t>
+      </w:r>
+      <w:proofErr w:type="spellEnd"/>
+      <w:r>
+        <w:t>&gt;</w:t>
+      </w:r>
+    </w:p>
+    <w:p>
+      <w:pPr>
+        <w:pStyle w:val="Prrafodelista"/>
+      </w:pPr>
+    </w:p>
+    <w:p>
+      <w:pPr>
+        <w:pStyle w:val="Prrafodelista"/>
+      </w:pPr>
+      <w:r>
+        <w:t>&lt;/</w:t>
+      </w:r>
+      <w:proofErr w:type="spellStart"/>
+      <w:proofErr w:type="gramStart"/>
+      <w:r>
+        <w:t>asp:Content</w:t>
+      </w:r>
+      <w:proofErr w:type="spellEnd"/>
+      <w:proofErr w:type="gramEnd"/>
+      <w:r>
+        <w:t>&gt;</w:t>
+      </w:r>
+    </w:p>
+    <w:p>
+      <w:pPr>
+        <w:pStyle w:val="Prrafodelista"/>
+      </w:pPr>
+    </w:p>
+    <w:p>
+      <w:pPr>
+        <w:pStyle w:val="Prrafodelista"/>
+      </w:pPr>
+    </w:p>
     <w:sectPr>
       <w:pgSz w:w="11906" w:h="16838"/>
       <w:pgMar w:top="720" w:right="720" w:bottom="720" w:left="720" w:header="708" w:footer="708" w:gutter="0"/>
@@ -3753,6 +5099,232 @@
     </w:lvl>
   </w:abstractNum>
   <w:abstractNum w:abstractNumId="5" w15:restartNumberingAfterBreak="0">
+    <w:nsid w:val="30A43877"/>
+    <w:multiLevelType w:val="multilevel"/>
+    <w:tmpl w:val="B2F4EBF4"/>
+    <w:lvl w:ilvl="0">
+      <w:start w:val="1"/>
+      <w:numFmt w:val="decimal"/>
+      <w:lvlText w:val="%1."/>
+      <w:lvlJc w:val="left"/>
+      <w:pPr>
+        <w:tabs>
+          <w:tab w:val="num" w:pos="720"/>
+        </w:tabs>
+        <w:ind w:left="720" w:hanging="360"/>
+      </w:pPr>
+    </w:lvl>
+    <w:lvl w:ilvl="1" w:tentative="1">
+      <w:start w:val="1"/>
+      <w:numFmt w:val="decimal"/>
+      <w:lvlText w:val="%2."/>
+      <w:lvlJc w:val="left"/>
+      <w:pPr>
+        <w:tabs>
+          <w:tab w:val="num" w:pos="1440"/>
+        </w:tabs>
+        <w:ind w:left="1440" w:hanging="360"/>
+      </w:pPr>
+    </w:lvl>
+    <w:lvl w:ilvl="2" w:tentative="1">
+      <w:start w:val="1"/>
+      <w:numFmt w:val="decimal"/>
+      <w:lvlText w:val="%3."/>
+      <w:lvlJc w:val="left"/>
+      <w:pPr>
+        <w:tabs>
+          <w:tab w:val="num" w:pos="2160"/>
+        </w:tabs>
+        <w:ind w:left="2160" w:hanging="360"/>
+      </w:pPr>
+    </w:lvl>
+    <w:lvl w:ilvl="3" w:tentative="1">
+      <w:start w:val="1"/>
+      <w:numFmt w:val="decimal"/>
+      <w:lvlText w:val="%4."/>
+      <w:lvlJc w:val="left"/>
+      <w:pPr>
+        <w:tabs>
+          <w:tab w:val="num" w:pos="2880"/>
+        </w:tabs>
+        <w:ind w:left="2880" w:hanging="360"/>
+      </w:pPr>
+    </w:lvl>
+    <w:lvl w:ilvl="4" w:tentative="1">
+      <w:start w:val="1"/>
+      <w:numFmt w:val="decimal"/>
+      <w:lvlText w:val="%5."/>
+      <w:lvlJc w:val="left"/>
+      <w:pPr>
+        <w:tabs>
+          <w:tab w:val="num" w:pos="3600"/>
+        </w:tabs>
+        <w:ind w:left="3600" w:hanging="360"/>
+      </w:pPr>
+    </w:lvl>
+    <w:lvl w:ilvl="5" w:tentative="1">
+      <w:start w:val="1"/>
+      <w:numFmt w:val="decimal"/>
+      <w:lvlText w:val="%6."/>
+      <w:lvlJc w:val="left"/>
+      <w:pPr>
+        <w:tabs>
+          <w:tab w:val="num" w:pos="4320"/>
+        </w:tabs>
+        <w:ind w:left="4320" w:hanging="360"/>
+      </w:pPr>
+    </w:lvl>
+    <w:lvl w:ilvl="6" w:tentative="1">
+      <w:start w:val="1"/>
+      <w:numFmt w:val="decimal"/>
+      <w:lvlText w:val="%7."/>
+      <w:lvlJc w:val="left"/>
+      <w:pPr>
+        <w:tabs>
+          <w:tab w:val="num" w:pos="5040"/>
+        </w:tabs>
+        <w:ind w:left="5040" w:hanging="360"/>
+      </w:pPr>
+    </w:lvl>
+    <w:lvl w:ilvl="7" w:tentative="1">
+      <w:start w:val="1"/>
+      <w:numFmt w:val="decimal"/>
+      <w:lvlText w:val="%8."/>
+      <w:lvlJc w:val="left"/>
+      <w:pPr>
+        <w:tabs>
+          <w:tab w:val="num" w:pos="5760"/>
+        </w:tabs>
+        <w:ind w:left="5760" w:hanging="360"/>
+      </w:pPr>
+    </w:lvl>
+    <w:lvl w:ilvl="8" w:tentative="1">
+      <w:start w:val="1"/>
+      <w:numFmt w:val="decimal"/>
+      <w:lvlText w:val="%9."/>
+      <w:lvlJc w:val="left"/>
+      <w:pPr>
+        <w:tabs>
+          <w:tab w:val="num" w:pos="6480"/>
+        </w:tabs>
+        <w:ind w:left="6480" w:hanging="360"/>
+      </w:pPr>
+    </w:lvl>
+  </w:abstractNum>
+  <w:abstractNum w:abstractNumId="6" w15:restartNumberingAfterBreak="0">
+    <w:nsid w:val="3FFF5BF2"/>
+    <w:multiLevelType w:val="multilevel"/>
+    <w:tmpl w:val="35F09196"/>
+    <w:lvl w:ilvl="0">
+      <w:start w:val="1"/>
+      <w:numFmt w:val="decimal"/>
+      <w:lvlText w:val="%1."/>
+      <w:lvlJc w:val="left"/>
+      <w:pPr>
+        <w:tabs>
+          <w:tab w:val="num" w:pos="720"/>
+        </w:tabs>
+        <w:ind w:left="720" w:hanging="360"/>
+      </w:pPr>
+    </w:lvl>
+    <w:lvl w:ilvl="1" w:tentative="1">
+      <w:start w:val="1"/>
+      <w:numFmt w:val="decimal"/>
+      <w:lvlText w:val="%2."/>
+      <w:lvlJc w:val="left"/>
+      <w:pPr>
+        <w:tabs>
+          <w:tab w:val="num" w:pos="1440"/>
+        </w:tabs>
+        <w:ind w:left="1440" w:hanging="360"/>
+      </w:pPr>
+    </w:lvl>
+    <w:lvl w:ilvl="2" w:tentative="1">
+      <w:start w:val="1"/>
+      <w:numFmt w:val="decimal"/>
+      <w:lvlText w:val="%3."/>
+      <w:lvlJc w:val="left"/>
+      <w:pPr>
+        <w:tabs>
+          <w:tab w:val="num" w:pos="2160"/>
+        </w:tabs>
+        <w:ind w:left="2160" w:hanging="360"/>
+      </w:pPr>
+    </w:lvl>
+    <w:lvl w:ilvl="3" w:tentative="1">
+      <w:start w:val="1"/>
+      <w:numFmt w:val="decimal"/>
+      <w:lvlText w:val="%4."/>
+      <w:lvlJc w:val="left"/>
+      <w:pPr>
+        <w:tabs>
+          <w:tab w:val="num" w:pos="2880"/>
+        </w:tabs>
+        <w:ind w:left="2880" w:hanging="360"/>
+      </w:pPr>
+    </w:lvl>
+    <w:lvl w:ilvl="4" w:tentative="1">
+      <w:start w:val="1"/>
+      <w:numFmt w:val="decimal"/>
+      <w:lvlText w:val="%5."/>
+      <w:lvlJc w:val="left"/>
+      <w:pPr>
+        <w:tabs>
+          <w:tab w:val="num" w:pos="3600"/>
+        </w:tabs>
+        <w:ind w:left="3600" w:hanging="360"/>
+      </w:pPr>
+    </w:lvl>
+    <w:lvl w:ilvl="5" w:tentative="1">
+      <w:start w:val="1"/>
+      <w:numFmt w:val="decimal"/>
+      <w:lvlText w:val="%6."/>
+      <w:lvlJc w:val="left"/>
+      <w:pPr>
+        <w:tabs>
+          <w:tab w:val="num" w:pos="4320"/>
+        </w:tabs>
+        <w:ind w:left="4320" w:hanging="360"/>
+      </w:pPr>
+    </w:lvl>
+    <w:lvl w:ilvl="6" w:tentative="1">
+      <w:start w:val="1"/>
+      <w:numFmt w:val="decimal"/>
+      <w:lvlText w:val="%7."/>
+      <w:lvlJc w:val="left"/>
+      <w:pPr>
+        <w:tabs>
+          <w:tab w:val="num" w:pos="5040"/>
+        </w:tabs>
+        <w:ind w:left="5040" w:hanging="360"/>
+      </w:pPr>
+    </w:lvl>
+    <w:lvl w:ilvl="7" w:tentative="1">
+      <w:start w:val="1"/>
+      <w:numFmt w:val="decimal"/>
+      <w:lvlText w:val="%8."/>
+      <w:lvlJc w:val="left"/>
+      <w:pPr>
+        <w:tabs>
+          <w:tab w:val="num" w:pos="5760"/>
+        </w:tabs>
+        <w:ind w:left="5760" w:hanging="360"/>
+      </w:pPr>
+    </w:lvl>
+    <w:lvl w:ilvl="8" w:tentative="1">
+      <w:start w:val="1"/>
+      <w:numFmt w:val="decimal"/>
+      <w:lvlText w:val="%9."/>
+      <w:lvlJc w:val="left"/>
+      <w:pPr>
+        <w:tabs>
+          <w:tab w:val="num" w:pos="6480"/>
+        </w:tabs>
+        <w:ind w:left="6480" w:hanging="360"/>
+      </w:pPr>
+    </w:lvl>
+  </w:abstractNum>
+  <w:abstractNum w:abstractNumId="7" w15:restartNumberingAfterBreak="0">
     <w:nsid w:val="41297B1F"/>
     <w:multiLevelType w:val="multilevel"/>
     <w:tmpl w:val="32F8B298"/>
@@ -3865,7 +5437,7 @@
       </w:pPr>
     </w:lvl>
   </w:abstractNum>
-  <w:abstractNum w:abstractNumId="6" w15:restartNumberingAfterBreak="0">
+  <w:abstractNum w:abstractNumId="8" w15:restartNumberingAfterBreak="0">
     <w:nsid w:val="543B2945"/>
     <w:multiLevelType w:val="multilevel"/>
     <w:tmpl w:val="FC4C8AB6"/>
@@ -3978,7 +5550,7 @@
       </w:pPr>
     </w:lvl>
   </w:abstractNum>
-  <w:abstractNum w:abstractNumId="7" w15:restartNumberingAfterBreak="0">
+  <w:abstractNum w:abstractNumId="9" w15:restartNumberingAfterBreak="0">
     <w:nsid w:val="5B156D54"/>
     <w:multiLevelType w:val="multilevel"/>
     <w:tmpl w:val="233C2D02"/>
@@ -4091,7 +5663,7 @@
       </w:pPr>
     </w:lvl>
   </w:abstractNum>
-  <w:abstractNum w:abstractNumId="8" w15:restartNumberingAfterBreak="0">
+  <w:abstractNum w:abstractNumId="10" w15:restartNumberingAfterBreak="0">
     <w:nsid w:val="5C707315"/>
     <w:multiLevelType w:val="multilevel"/>
     <w:tmpl w:val="940AF25C"/>
@@ -4208,7 +5780,7 @@
       </w:pPr>
     </w:lvl>
   </w:abstractNum>
-  <w:abstractNum w:abstractNumId="9" w15:restartNumberingAfterBreak="0">
+  <w:abstractNum w:abstractNumId="11" w15:restartNumberingAfterBreak="0">
     <w:nsid w:val="68D04A78"/>
     <w:multiLevelType w:val="multilevel"/>
     <w:tmpl w:val="361A074E"/>
@@ -4321,7 +5893,7 @@
       </w:pPr>
     </w:lvl>
   </w:abstractNum>
-  <w:abstractNum w:abstractNumId="10" w15:restartNumberingAfterBreak="0">
+  <w:abstractNum w:abstractNumId="12" w15:restartNumberingAfterBreak="0">
     <w:nsid w:val="690D65AF"/>
     <w:multiLevelType w:val="multilevel"/>
     <w:tmpl w:val="580E7FCE"/>
@@ -4434,7 +6006,7 @@
       </w:pPr>
     </w:lvl>
   </w:abstractNum>
-  <w:abstractNum w:abstractNumId="11" w15:restartNumberingAfterBreak="0">
+  <w:abstractNum w:abstractNumId="13" w15:restartNumberingAfterBreak="0">
     <w:nsid w:val="6CF300B4"/>
     <w:multiLevelType w:val="multilevel"/>
     <w:tmpl w:val="45424236"/>
@@ -4547,7 +6119,7 @@
       </w:pPr>
     </w:lvl>
   </w:abstractNum>
-  <w:abstractNum w:abstractNumId="12" w15:restartNumberingAfterBreak="0">
+  <w:abstractNum w:abstractNumId="14" w15:restartNumberingAfterBreak="0">
     <w:nsid w:val="76322DC1"/>
     <w:multiLevelType w:val="multilevel"/>
     <w:tmpl w:val="2786C7E4"/>
@@ -4664,10 +6236,10 @@
     <w:abstractNumId w:val="0"/>
   </w:num>
   <w:num w:numId="2" w16cid:durableId="2145997930">
-    <w:abstractNumId w:val="12"/>
+    <w:abstractNumId w:val="14"/>
   </w:num>
   <w:num w:numId="3" w16cid:durableId="2117168069">
-    <w:abstractNumId w:val="5"/>
+    <w:abstractNumId w:val="7"/>
   </w:num>
   <w:num w:numId="4" w16cid:durableId="1348411223">
     <w:abstractNumId w:val="4"/>
@@ -4676,28 +6248,34 @@
     <w:abstractNumId w:val="1"/>
   </w:num>
   <w:num w:numId="6" w16cid:durableId="2083327884">
-    <w:abstractNumId w:val="7"/>
+    <w:abstractNumId w:val="9"/>
   </w:num>
   <w:num w:numId="7" w16cid:durableId="902758567">
-    <w:abstractNumId w:val="8"/>
+    <w:abstractNumId w:val="10"/>
   </w:num>
   <w:num w:numId="8" w16cid:durableId="981883762">
     <w:abstractNumId w:val="3"/>
   </w:num>
   <w:num w:numId="9" w16cid:durableId="1405031395">
-    <w:abstractNumId w:val="10"/>
+    <w:abstractNumId w:val="12"/>
   </w:num>
   <w:num w:numId="10" w16cid:durableId="110052222">
-    <w:abstractNumId w:val="6"/>
+    <w:abstractNumId w:val="8"/>
   </w:num>
   <w:num w:numId="11" w16cid:durableId="1464351474">
-    <w:abstractNumId w:val="9"/>
+    <w:abstractNumId w:val="11"/>
   </w:num>
   <w:num w:numId="12" w16cid:durableId="1373191211">
     <w:abstractNumId w:val="2"/>
   </w:num>
   <w:num w:numId="13" w16cid:durableId="780151543">
-    <w:abstractNumId w:val="11"/>
+    <w:abstractNumId w:val="13"/>
+  </w:num>
+  <w:num w:numId="14" w16cid:durableId="1349329982">
+    <w:abstractNumId w:val="6"/>
+  </w:num>
+  <w:num w:numId="15" w16cid:durableId="1046835972">
+    <w:abstractNumId w:val="5"/>
   </w:num>
 </w:numbering>
 </file>

</xml_diff>

<commit_message>
feat: implementar pantalla de detalles y ajustar layout con Flexbox. - Creación de Detalle.aspx para visualizar la información completa y ampliada de cada artículo. - Implementación de navegación por URL y recepción de datos mediante Request.QueryString["id"]. - Uso de expresiones Lambda (.Find) en el Code-Behind para filtrar el artículo seleccionado desde la capa de Negocio. - Manejo de excepciones visuales (artículo no encontrado o ID nulo) renderizando alertas de Bootstrap. - Refactorización de MasterPage.Master integrando clases de Flexbox (d-flex, flex-column, min-vh-100, mt-auto) para forzar el anclaje del Footer al final del viewport sin importar la cantidad de contenido.
</commit_message>
<xml_diff>
--- a/TPFinal - Nivel 3 - Web/Documentación_desarrollo_tpFinal.docx
+++ b/TPFinal - Nivel 3 - Web/Documentación_desarrollo_tpFinal.docx
@@ -1559,7 +1559,7 @@
     <w:p>
       <w:r>
         <w:pict w14:anchorId="52A9D0B9">
-          <v:rect id="_x0000_i1031" style="width:0;height:1.5pt" o:hralign="center" o:hrstd="t" o:hr="t" fillcolor="#a0a0a0" stroked="f"/>
+          <v:rect id="_x0000_i1025" style="width:0;height:1.5pt" o:hralign="center" o:hrstd="t" o:hr="t" fillcolor="#a0a0a0" stroked="f"/>
         </w:pict>
       </w:r>
     </w:p>
@@ -3914,526 +3914,2515 @@
         <w:rPr>
           <w:lang w:val="en-US"/>
         </w:rPr>
-        <w:t xml:space="preserve"> art in </w:t>
-      </w:r>
-      <w:proofErr w:type="spellStart"/>
-      <w:r>
-        <w:rPr>
-          <w:lang w:val="en-US"/>
-        </w:rPr>
-        <w:t>ListaArticulos</w:t>
-      </w:r>
-      <w:proofErr w:type="spellEnd"/>
-      <w:r>
-        <w:rPr>
-          <w:lang w:val="en-US"/>
+        <w:t xml:space="preserve"> art in ListaArticulos)</w:t>
+      </w:r>
+    </w:p>
+    <w:p>
+      <w:pPr>
+        <w:pStyle w:val="Prrafodelista"/>
+        <w:rPr>
+          <w:lang w:val="en-US"/>
+        </w:rPr>
+      </w:pPr>
+      <w:r>
+        <w:rPr>
+          <w:lang w:val="en-US"/>
+        </w:rPr>
+        <w:t xml:space="preserve">           { %&gt;</w:t>
+      </w:r>
+    </w:p>
+    <w:p>
+      <w:pPr>
+        <w:pStyle w:val="Prrafodelista"/>
+        <w:rPr>
+          <w:lang w:val="en-US"/>
+        </w:rPr>
+      </w:pPr>
+      <w:r>
+        <w:rPr>
+          <w:lang w:val="en-US"/>
+        </w:rPr>
+        <w:t xml:space="preserve">            </w:t>
+      </w:r>
+    </w:p>
+    <w:p>
+      <w:pPr>
+        <w:pStyle w:val="Prrafodelista"/>
+        <w:rPr>
+          <w:lang w:val="en-US"/>
+        </w:rPr>
+      </w:pPr>
+      <w:r>
+        <w:rPr>
+          <w:lang w:val="en-US"/>
+        </w:rPr>
+        <w:t xml:space="preserve">            &lt;div class="col"&gt;</w:t>
+      </w:r>
+    </w:p>
+    <w:p>
+      <w:pPr>
+        <w:pStyle w:val="Prrafodelista"/>
+        <w:rPr>
+          <w:lang w:val="en-US"/>
+        </w:rPr>
+      </w:pPr>
+      <w:r>
+        <w:rPr>
+          <w:lang w:val="en-US"/>
+        </w:rPr>
+        <w:t xml:space="preserve">                &lt;div class="card h-100"&gt;</w:t>
+      </w:r>
+    </w:p>
+    <w:p>
+      <w:pPr>
+        <w:pStyle w:val="Prrafodelista"/>
+      </w:pPr>
+      <w:r>
+        <w:rPr>
+          <w:lang w:val="en-US"/>
+        </w:rPr>
+        <w:t xml:space="preserve">                    </w:t>
+      </w:r>
+      <w:r>
+        <w:t>&lt;%-- Imagen del artículo. Si la URL está rota, el '</w:t>
+      </w:r>
+      <w:proofErr w:type="spellStart"/>
+      <w:r>
+        <w:t>onerror</w:t>
+      </w:r>
+      <w:proofErr w:type="spellEnd"/>
+      <w:r>
+        <w:t>' carga una imagen por defecto --%&gt;</w:t>
+      </w:r>
+    </w:p>
+    <w:p>
+      <w:pPr>
+        <w:pStyle w:val="Prrafodelista"/>
+        <w:rPr>
+          <w:lang w:val="en-US"/>
+        </w:rPr>
+      </w:pPr>
+      <w:r>
+        <w:t xml:space="preserve">                    </w:t>
+      </w:r>
+      <w:r>
+        <w:rPr>
+          <w:lang w:val="en-US"/>
+        </w:rPr>
+        <w:t>&lt;</w:t>
+      </w:r>
+      <w:proofErr w:type="spellStart"/>
+      <w:r>
+        <w:rPr>
+          <w:lang w:val="en-US"/>
+        </w:rPr>
+        <w:t>img</w:t>
+      </w:r>
+      <w:proofErr w:type="spellEnd"/>
+      <w:r>
+        <w:rPr>
+          <w:lang w:val="en-US"/>
+        </w:rPr>
+        <w:t xml:space="preserve"> </w:t>
+      </w:r>
+      <w:proofErr w:type="spellStart"/>
+      <w:r>
+        <w:rPr>
+          <w:lang w:val="en-US"/>
+        </w:rPr>
+        <w:t>src</w:t>
+      </w:r>
+      <w:proofErr w:type="spellEnd"/>
+      <w:r>
+        <w:rPr>
+          <w:lang w:val="en-US"/>
+        </w:rPr>
+        <w:t xml:space="preserve">="&lt;%: </w:t>
+      </w:r>
+      <w:proofErr w:type="spellStart"/>
+      <w:proofErr w:type="gramStart"/>
+      <w:r>
+        <w:rPr>
+          <w:lang w:val="en-US"/>
+        </w:rPr>
+        <w:t>art.ImagenUrl</w:t>
+      </w:r>
+      <w:proofErr w:type="spellEnd"/>
+      <w:proofErr w:type="gramEnd"/>
+      <w:r>
+        <w:rPr>
+          <w:lang w:val="en-US"/>
+        </w:rPr>
+        <w:t xml:space="preserve"> %&gt;" class="card-</w:t>
+      </w:r>
+      <w:proofErr w:type="spellStart"/>
+      <w:r>
+        <w:rPr>
+          <w:lang w:val="en-US"/>
+        </w:rPr>
+        <w:t>img</w:t>
+      </w:r>
+      <w:proofErr w:type="spellEnd"/>
+      <w:r>
+        <w:rPr>
+          <w:lang w:val="en-US"/>
+        </w:rPr>
+        <w:t xml:space="preserve">-top" alt="&lt;%: </w:t>
+      </w:r>
+      <w:proofErr w:type="spellStart"/>
+      <w:r>
+        <w:rPr>
+          <w:lang w:val="en-US"/>
+        </w:rPr>
+        <w:t>art.Nombre</w:t>
+      </w:r>
+      <w:proofErr w:type="spellEnd"/>
+      <w:r>
+        <w:rPr>
+          <w:lang w:val="en-US"/>
+        </w:rPr>
+        <w:t xml:space="preserve"> %&gt;" </w:t>
+      </w:r>
+    </w:p>
+    <w:p>
+      <w:pPr>
+        <w:pStyle w:val="Prrafodelista"/>
+        <w:rPr>
+          <w:lang w:val="en-US"/>
+        </w:rPr>
+      </w:pPr>
+      <w:r>
+        <w:rPr>
+          <w:lang w:val="en-US"/>
+        </w:rPr>
+        <w:t xml:space="preserve">                         onerror="this.src='https://cdn.pixabay.com/photo/2015/10/05/22/37/blank-profile-picture-973460_960_720.png'"&gt;</w:t>
+      </w:r>
+    </w:p>
+    <w:p>
+      <w:pPr>
+        <w:pStyle w:val="Prrafodelista"/>
+        <w:rPr>
+          <w:lang w:val="en-US"/>
+        </w:rPr>
+      </w:pPr>
+      <w:r>
+        <w:rPr>
+          <w:lang w:val="en-US"/>
+        </w:rPr>
+        <w:t xml:space="preserve">                    </w:t>
+      </w:r>
+    </w:p>
+    <w:p>
+      <w:pPr>
+        <w:pStyle w:val="Prrafodelista"/>
+        <w:rPr>
+          <w:lang w:val="en-US"/>
+        </w:rPr>
+      </w:pPr>
+      <w:r>
+        <w:rPr>
+          <w:lang w:val="en-US"/>
+        </w:rPr>
+        <w:t xml:space="preserve">                    &lt;div class="card-body"&gt;</w:t>
+      </w:r>
+    </w:p>
+    <w:p>
+      <w:pPr>
+        <w:pStyle w:val="Prrafodelista"/>
+        <w:rPr>
+          <w:lang w:val="en-US"/>
+        </w:rPr>
+      </w:pPr>
+      <w:r>
+        <w:rPr>
+          <w:lang w:val="en-US"/>
+        </w:rPr>
+        <w:t xml:space="preserve">                        &lt;h5 class="card-title"&gt;&lt;%: </w:t>
+      </w:r>
+      <w:proofErr w:type="spellStart"/>
+      <w:proofErr w:type="gramStart"/>
+      <w:r>
+        <w:rPr>
+          <w:lang w:val="en-US"/>
+        </w:rPr>
+        <w:t>art.Nombre</w:t>
+      </w:r>
+      <w:proofErr w:type="spellEnd"/>
+      <w:proofErr w:type="gramEnd"/>
+      <w:r>
+        <w:rPr>
+          <w:lang w:val="en-US"/>
+        </w:rPr>
+        <w:t xml:space="preserve"> %&gt;&lt;/h5&gt;</w:t>
+      </w:r>
+    </w:p>
+    <w:p>
+      <w:pPr>
+        <w:pStyle w:val="Prrafodelista"/>
+        <w:rPr>
+          <w:lang w:val="en-US"/>
+        </w:rPr>
+      </w:pPr>
+      <w:r>
+        <w:rPr>
+          <w:lang w:val="en-US"/>
+        </w:rPr>
+        <w:t xml:space="preserve">                        &lt;p class="card-text"&gt;&lt;%: </w:t>
+      </w:r>
+      <w:proofErr w:type="spellStart"/>
+      <w:proofErr w:type="gramStart"/>
+      <w:r>
+        <w:rPr>
+          <w:lang w:val="en-US"/>
+        </w:rPr>
+        <w:t>art.Descripcion</w:t>
+      </w:r>
+      <w:proofErr w:type="spellEnd"/>
+      <w:proofErr w:type="gramEnd"/>
+      <w:r>
+        <w:rPr>
+          <w:lang w:val="en-US"/>
+        </w:rPr>
+        <w:t xml:space="preserve"> %&gt;&lt;/p&gt;</w:t>
+      </w:r>
+    </w:p>
+    <w:p>
+      <w:pPr>
+        <w:pStyle w:val="Prrafodelista"/>
+        <w:rPr>
+          <w:lang w:val="en-US"/>
+        </w:rPr>
+      </w:pPr>
+      <w:r>
+        <w:rPr>
+          <w:lang w:val="en-US"/>
+        </w:rPr>
+        <w:t xml:space="preserve">                        &lt;p class="card-text fs-5 text-success </w:t>
+      </w:r>
+      <w:proofErr w:type="spellStart"/>
+      <w:r>
+        <w:rPr>
+          <w:lang w:val="en-US"/>
+        </w:rPr>
+        <w:t>fw</w:t>
+      </w:r>
+      <w:proofErr w:type="spellEnd"/>
+      <w:r>
+        <w:rPr>
+          <w:lang w:val="en-US"/>
+        </w:rPr>
+        <w:t xml:space="preserve">-bold"&gt;$ &lt;%: </w:t>
+      </w:r>
+      <w:proofErr w:type="gramStart"/>
+      <w:r>
+        <w:rPr>
+          <w:lang w:val="en-US"/>
+        </w:rPr>
+        <w:t>art.Precio</w:t>
+      </w:r>
+      <w:proofErr w:type="gramEnd"/>
+      <w:r>
+        <w:rPr>
+          <w:lang w:val="en-US"/>
+        </w:rPr>
+        <w:t xml:space="preserve"> %&gt;&lt;/p&gt;</w:t>
+      </w:r>
+    </w:p>
+    <w:p>
+      <w:pPr>
+        <w:pStyle w:val="Prrafodelista"/>
+        <w:rPr>
+          <w:lang w:val="en-US"/>
+        </w:rPr>
+      </w:pPr>
+      <w:r>
+        <w:rPr>
+          <w:lang w:val="en-US"/>
+        </w:rPr>
+        <w:t xml:space="preserve">                        </w:t>
+      </w:r>
+    </w:p>
+    <w:p>
+      <w:pPr>
+        <w:pStyle w:val="Prrafodelista"/>
+      </w:pPr>
+      <w:r>
+        <w:rPr>
+          <w:lang w:val="en-US"/>
+        </w:rPr>
+        <w:t xml:space="preserve">                        </w:t>
+      </w:r>
+      <w:r>
+        <w:t>&lt;%-- Botón que nos llevará a la futura pantalla de detalle --%&gt;</w:t>
+      </w:r>
+    </w:p>
+    <w:p>
+      <w:pPr>
+        <w:pStyle w:val="Prrafodelista"/>
+      </w:pPr>
+      <w:r>
+        <w:t xml:space="preserve">                        &lt;a </w:t>
+      </w:r>
+      <w:proofErr w:type="spellStart"/>
+      <w:r>
+        <w:t>href</w:t>
+      </w:r>
+      <w:proofErr w:type="spellEnd"/>
+      <w:r>
+        <w:t>="</w:t>
+      </w:r>
+      <w:proofErr w:type="spellStart"/>
+      <w:r>
+        <w:t>Detalle.aspx?id</w:t>
+      </w:r>
+      <w:proofErr w:type="spellEnd"/>
+      <w:r>
+        <w:t xml:space="preserve">=&lt;%: </w:t>
+      </w:r>
+      <w:proofErr w:type="spellStart"/>
+      <w:proofErr w:type="gramStart"/>
+      <w:r>
+        <w:t>art.Id</w:t>
+      </w:r>
+      <w:proofErr w:type="spellEnd"/>
+      <w:proofErr w:type="gramEnd"/>
+      <w:r>
+        <w:t xml:space="preserve"> %&gt;" </w:t>
+      </w:r>
+      <w:proofErr w:type="spellStart"/>
+      <w:r>
+        <w:t>class</w:t>
+      </w:r>
+      <w:proofErr w:type="spellEnd"/>
+      <w:r>
+        <w:t>="</w:t>
+      </w:r>
+      <w:proofErr w:type="spellStart"/>
+      <w:r>
+        <w:t>btn</w:t>
+      </w:r>
+      <w:proofErr w:type="spellEnd"/>
+      <w:r>
+        <w:t xml:space="preserve"> </w:t>
+      </w:r>
+      <w:proofErr w:type="spellStart"/>
+      <w:r>
+        <w:t>btn-primary</w:t>
+      </w:r>
+      <w:proofErr w:type="spellEnd"/>
+      <w:r>
+        <w:t>"&gt;Ver Detalles&lt;/a&gt;</w:t>
+      </w:r>
+    </w:p>
+    <w:p>
+      <w:pPr>
+        <w:pStyle w:val="Prrafodelista"/>
+      </w:pPr>
+      <w:r>
+        <w:t xml:space="preserve">                    &lt;/</w:t>
+      </w:r>
+      <w:proofErr w:type="spellStart"/>
+      <w:r>
+        <w:t>div</w:t>
+      </w:r>
+      <w:proofErr w:type="spellEnd"/>
+      <w:r>
+        <w:t>&gt;</w:t>
+      </w:r>
+    </w:p>
+    <w:p>
+      <w:pPr>
+        <w:pStyle w:val="Prrafodelista"/>
+      </w:pPr>
+      <w:r>
+        <w:t xml:space="preserve">                &lt;/</w:t>
+      </w:r>
+      <w:proofErr w:type="spellStart"/>
+      <w:r>
+        <w:t>div</w:t>
+      </w:r>
+      <w:proofErr w:type="spellEnd"/>
+      <w:r>
+        <w:t>&gt;</w:t>
+      </w:r>
+    </w:p>
+    <w:p>
+      <w:pPr>
+        <w:pStyle w:val="Prrafodelista"/>
+      </w:pPr>
+      <w:r>
+        <w:t xml:space="preserve">            &lt;/</w:t>
+      </w:r>
+      <w:proofErr w:type="spellStart"/>
+      <w:r>
+        <w:t>div</w:t>
+      </w:r>
+      <w:proofErr w:type="spellEnd"/>
+      <w:r>
+        <w:t>&gt;</w:t>
+      </w:r>
+    </w:p>
+    <w:p>
+      <w:pPr>
+        <w:pStyle w:val="Prrafodelista"/>
+      </w:pPr>
+    </w:p>
+    <w:p>
+      <w:pPr>
+        <w:pStyle w:val="Prrafodelista"/>
+      </w:pPr>
+      <w:r>
+        <w:t xml:space="preserve">        &lt;% } %&gt;</w:t>
+      </w:r>
+    </w:p>
+    <w:p>
+      <w:pPr>
+        <w:pStyle w:val="Prrafodelista"/>
+      </w:pPr>
+    </w:p>
+    <w:p>
+      <w:pPr>
+        <w:pStyle w:val="Prrafodelista"/>
+      </w:pPr>
+      <w:r>
+        <w:t xml:space="preserve">    &lt;/</w:t>
+      </w:r>
+      <w:proofErr w:type="spellStart"/>
+      <w:r>
+        <w:t>div</w:t>
+      </w:r>
+      <w:proofErr w:type="spellEnd"/>
+      <w:r>
+        <w:t>&gt;</w:t>
+      </w:r>
+    </w:p>
+    <w:p>
+      <w:pPr>
+        <w:pStyle w:val="Prrafodelista"/>
+      </w:pPr>
+    </w:p>
+    <w:p>
+      <w:pPr>
+        <w:pStyle w:val="Prrafodelista"/>
+      </w:pPr>
+      <w:r>
+        <w:t>&lt;/</w:t>
+      </w:r>
+      <w:proofErr w:type="spellStart"/>
+      <w:proofErr w:type="gramStart"/>
+      <w:r>
+        <w:t>asp:Content</w:t>
+      </w:r>
+      <w:proofErr w:type="spellEnd"/>
+      <w:proofErr w:type="gramEnd"/>
+      <w:r>
+        <w:t>&gt;</w:t>
+      </w:r>
+    </w:p>
+    <w:p>
+      <w:pPr>
+        <w:pStyle w:val="Prrafodelista"/>
+      </w:pPr>
+    </w:p>
+    <w:p>
+      <w:pPr>
+        <w:pStyle w:val="Prrafodelista"/>
+      </w:pPr>
+    </w:p>
+    <w:p>
+      <w:pPr>
+        <w:pStyle w:val="Prrafodelista"/>
+      </w:pPr>
+    </w:p>
+    <w:p>
+      <w:pPr>
+        <w:pStyle w:val="Prrafodelista"/>
+        <w:rPr>
+          <w:b/>
+          <w:bCs/>
+        </w:rPr>
+      </w:pPr>
+      <w:r>
+        <w:rPr>
+          <w:b/>
+          <w:bCs/>
+        </w:rPr>
+        <w:lastRenderedPageBreak/>
+        <w:t>Crear la pantalla de Detalles</w:t>
+      </w:r>
+    </w:p>
+    <w:p>
+      <w:pPr>
+        <w:pStyle w:val="Prrafodelista"/>
+      </w:pPr>
+      <w:r>
+        <w:t>Vamos a armar el lienzo en blanco para esta nueva sección.</w:t>
+      </w:r>
+    </w:p>
+    <w:p>
+      <w:pPr>
+        <w:pStyle w:val="Prrafodelista"/>
+        <w:numPr>
+          <w:ilvl w:val="0"/>
+          <w:numId w:val="16"/>
+        </w:numPr>
+      </w:pPr>
+      <w:r>
+        <w:t xml:space="preserve">En tu </w:t>
+      </w:r>
+      <w:r>
+        <w:rPr>
+          <w:b/>
+          <w:bCs/>
+        </w:rPr>
+        <w:t>Explorador de Soluciones</w:t>
+      </w:r>
+      <w:r>
+        <w:t xml:space="preserve">, </w:t>
+      </w:r>
+      <w:proofErr w:type="spellStart"/>
+      <w:r>
+        <w:t>hacé</w:t>
+      </w:r>
+      <w:proofErr w:type="spellEnd"/>
+      <w:r>
+        <w:t xml:space="preserve"> clic derecho sobre tu proyecto web </w:t>
+      </w:r>
+      <w:r>
+        <w:rPr>
+          <w:b/>
+          <w:bCs/>
+        </w:rPr>
+        <w:t>e-</w:t>
+      </w:r>
+      <w:proofErr w:type="spellStart"/>
+      <w:r>
+        <w:rPr>
+          <w:b/>
+          <w:bCs/>
+        </w:rPr>
+        <w:t>commerce</w:t>
+      </w:r>
+      <w:proofErr w:type="spellEnd"/>
+      <w:r>
+        <w:t>.</w:t>
+      </w:r>
+    </w:p>
+    <w:p>
+      <w:pPr>
+        <w:pStyle w:val="Prrafodelista"/>
+        <w:numPr>
+          <w:ilvl w:val="0"/>
+          <w:numId w:val="16"/>
+        </w:numPr>
+      </w:pPr>
+      <w:r>
+        <w:t xml:space="preserve">Elegí </w:t>
+      </w:r>
+      <w:r>
+        <w:rPr>
+          <w:b/>
+          <w:bCs/>
+        </w:rPr>
+        <w:t>Agregar -&gt; Nuevo elemento...</w:t>
+      </w:r>
+      <w:r>
+        <w:t xml:space="preserve"> (</w:t>
+      </w:r>
+      <w:proofErr w:type="spellStart"/>
+      <w:r>
+        <w:t>Add</w:t>
+      </w:r>
+      <w:proofErr w:type="spellEnd"/>
+      <w:r>
+        <w:t xml:space="preserve"> -&gt; New </w:t>
+      </w:r>
+      <w:proofErr w:type="spellStart"/>
+      <w:r>
+        <w:t>Item</w:t>
+      </w:r>
+      <w:proofErr w:type="spellEnd"/>
+      <w:r>
+        <w:t>...).</w:t>
+      </w:r>
+    </w:p>
+    <w:p>
+      <w:pPr>
+        <w:pStyle w:val="Prrafodelista"/>
+        <w:numPr>
+          <w:ilvl w:val="0"/>
+          <w:numId w:val="16"/>
+        </w:numPr>
+      </w:pPr>
+      <w:proofErr w:type="spellStart"/>
+      <w:r>
+        <w:t>Buscá</w:t>
+      </w:r>
+      <w:proofErr w:type="spellEnd"/>
+      <w:r>
+        <w:t xml:space="preserve"> y </w:t>
+      </w:r>
+      <w:proofErr w:type="spellStart"/>
+      <w:r>
+        <w:t>seleccioná</w:t>
+      </w:r>
+      <w:proofErr w:type="spellEnd"/>
+      <w:r>
+        <w:t xml:space="preserve"> </w:t>
+      </w:r>
+      <w:r>
+        <w:rPr>
+          <w:b/>
+          <w:bCs/>
+        </w:rPr>
+        <w:t xml:space="preserve">Formulario Web </w:t>
+      </w:r>
+      <w:proofErr w:type="spellStart"/>
+      <w:r>
+        <w:rPr>
+          <w:b/>
+          <w:bCs/>
+        </w:rPr>
+        <w:t>Forms</w:t>
+      </w:r>
+      <w:proofErr w:type="spellEnd"/>
+      <w:r>
+        <w:rPr>
+          <w:b/>
+          <w:bCs/>
+        </w:rPr>
+        <w:t xml:space="preserve"> con página maestra</w:t>
+      </w:r>
+      <w:r>
+        <w:t xml:space="preserve"> (Web </w:t>
+      </w:r>
+      <w:proofErr w:type="spellStart"/>
+      <w:r>
+        <w:t>Form</w:t>
+      </w:r>
+      <w:proofErr w:type="spellEnd"/>
+      <w:r>
+        <w:t xml:space="preserve"> </w:t>
+      </w:r>
+      <w:proofErr w:type="spellStart"/>
+      <w:r>
+        <w:t>with</w:t>
+      </w:r>
+      <w:proofErr w:type="spellEnd"/>
+      <w:r>
+        <w:t xml:space="preserve"> Master Page).</w:t>
+      </w:r>
+    </w:p>
+    <w:p>
+      <w:pPr>
+        <w:pStyle w:val="Prrafodelista"/>
+        <w:numPr>
+          <w:ilvl w:val="0"/>
+          <w:numId w:val="16"/>
+        </w:numPr>
+      </w:pPr>
+      <w:r>
+        <w:t xml:space="preserve">En la parte inferior, </w:t>
+      </w:r>
+      <w:proofErr w:type="spellStart"/>
+      <w:r>
+        <w:t>ponele</w:t>
+      </w:r>
+      <w:proofErr w:type="spellEnd"/>
+      <w:r>
+        <w:t xml:space="preserve"> </w:t>
+      </w:r>
+      <w:r>
+        <w:rPr>
+          <w:b/>
+          <w:bCs/>
+        </w:rPr>
+        <w:t>exactamente</w:t>
+      </w:r>
+      <w:r>
+        <w:t xml:space="preserve"> este nombre: </w:t>
+      </w:r>
+      <w:r>
+        <w:rPr>
+          <w:b/>
+          <w:bCs/>
+        </w:rPr>
+        <w:t>Detalle.aspx</w:t>
+      </w:r>
+      <w:r>
+        <w:t>.</w:t>
+      </w:r>
+    </w:p>
+    <w:p>
+      <w:pPr>
+        <w:pStyle w:val="Prrafodelista"/>
+        <w:numPr>
+          <w:ilvl w:val="0"/>
+          <w:numId w:val="16"/>
+        </w:numPr>
+      </w:pPr>
+      <w:r>
+        <w:t xml:space="preserve">Dale a Agregar, y en la ventanita que te salta, </w:t>
+      </w:r>
+      <w:proofErr w:type="spellStart"/>
+      <w:r>
+        <w:t>seleccioná</w:t>
+      </w:r>
+      <w:proofErr w:type="spellEnd"/>
+      <w:r>
+        <w:t xml:space="preserve"> tu </w:t>
+      </w:r>
+      <w:proofErr w:type="spellStart"/>
+      <w:r>
+        <w:t>MasterPage.Master</w:t>
+      </w:r>
+      <w:proofErr w:type="spellEnd"/>
+      <w:r>
+        <w:t xml:space="preserve"> y dale Aceptar.</w:t>
+      </w:r>
+    </w:p>
+    <w:p>
+      <w:r>
+        <w:rPr>
+          <w:b/>
+          <w:bCs/>
+        </w:rPr>
+        <w:t>TEMA: Envío y Recepción de Parámetros por URL (</w:t>
+      </w:r>
+      <w:proofErr w:type="spellStart"/>
+      <w:r>
+        <w:rPr>
+          <w:b/>
+          <w:bCs/>
+        </w:rPr>
+        <w:t>QueryString</w:t>
+      </w:r>
+      <w:proofErr w:type="spellEnd"/>
+      <w:r>
+        <w:rPr>
+          <w:b/>
+          <w:bCs/>
         </w:rPr>
         <w:t>)</w:t>
       </w:r>
     </w:p>
     <w:p>
       <w:pPr>
-        <w:pStyle w:val="Prrafodelista"/>
-        <w:rPr>
-          <w:lang w:val="en-US"/>
-        </w:rPr>
-      </w:pPr>
-      <w:r>
-        <w:rPr>
-          <w:lang w:val="en-US"/>
-        </w:rPr>
-        <w:t xml:space="preserve">           { %&gt;</w:t>
-      </w:r>
-    </w:p>
-    <w:p>
-      <w:pPr>
-        <w:pStyle w:val="Prrafodelista"/>
-        <w:rPr>
-          <w:lang w:val="en-US"/>
-        </w:rPr>
-      </w:pPr>
-      <w:r>
-        <w:rPr>
-          <w:lang w:val="en-US"/>
+        <w:numPr>
+          <w:ilvl w:val="0"/>
+          <w:numId w:val="17"/>
+        </w:numPr>
+      </w:pPr>
+      <w:r>
+        <w:rPr>
+          <w:b/>
+          <w:bCs/>
+        </w:rPr>
+        <w:t xml:space="preserve">¿Qué es el </w:t>
+      </w:r>
+      <w:proofErr w:type="spellStart"/>
+      <w:r>
+        <w:rPr>
+          <w:b/>
+          <w:bCs/>
+        </w:rPr>
+        <w:t>QueryString</w:t>
+      </w:r>
+      <w:proofErr w:type="spellEnd"/>
+      <w:r>
+        <w:rPr>
+          <w:b/>
+          <w:bCs/>
+        </w:rPr>
+        <w:t>?</w:t>
+      </w:r>
+      <w:r>
+        <w:t xml:space="preserve"> Es la parte de una URL que contiene datos a pasar a la aplicación web. Comienza después del signo de </w:t>
+      </w:r>
+      <w:proofErr w:type="gramStart"/>
+      <w:r>
+        <w:t>interrogación ?</w:t>
+      </w:r>
+      <w:proofErr w:type="gramEnd"/>
+      <w:r>
+        <w:t xml:space="preserve"> y se estructura en formato clave-valor (</w:t>
+      </w:r>
+      <w:proofErr w:type="spellStart"/>
+      <w:r>
+        <w:t>ej</w:t>
+      </w:r>
+      <w:proofErr w:type="spellEnd"/>
+      <w:r>
+        <w:t>: ?id=5&amp;nombre=juan).</w:t>
+      </w:r>
+    </w:p>
+    <w:p>
+      <w:pPr>
+        <w:numPr>
+          <w:ilvl w:val="0"/>
+          <w:numId w:val="17"/>
+        </w:numPr>
+      </w:pPr>
+      <w:r>
+        <w:rPr>
+          <w:b/>
+          <w:bCs/>
+        </w:rPr>
+        <w:t>¿Cómo se envían?</w:t>
+      </w:r>
+      <w:r>
+        <w:t xml:space="preserve"> En HTML, simplemente armamos el enlace de forma dinámica: &lt;a </w:t>
+      </w:r>
+      <w:proofErr w:type="spellStart"/>
+      <w:r>
+        <w:t>href</w:t>
+      </w:r>
+      <w:proofErr w:type="spellEnd"/>
+      <w:r>
+        <w:t>="</w:t>
+      </w:r>
+      <w:proofErr w:type="spellStart"/>
+      <w:r>
+        <w:t>Detalle.aspx?id</w:t>
+      </w:r>
+      <w:proofErr w:type="spellEnd"/>
+      <w:r>
+        <w:t>=5"&gt;Ver&lt;/a&gt;.</w:t>
+      </w:r>
+    </w:p>
+    <w:p>
+      <w:pPr>
+        <w:numPr>
+          <w:ilvl w:val="0"/>
+          <w:numId w:val="17"/>
+        </w:numPr>
+      </w:pPr>
+      <w:r>
+        <w:rPr>
+          <w:b/>
+          <w:bCs/>
+        </w:rPr>
+        <w:t>¿Cómo se reciben en C#?</w:t>
+      </w:r>
+      <w:r>
+        <w:t xml:space="preserve"> Utilizamos la colección </w:t>
+      </w:r>
+      <w:proofErr w:type="spellStart"/>
+      <w:r>
+        <w:t>Request.QueryString</w:t>
+      </w:r>
+      <w:proofErr w:type="spellEnd"/>
+      <w:r>
+        <w:t>.</w:t>
+      </w:r>
+    </w:p>
+    <w:p>
+      <w:pPr>
+        <w:numPr>
+          <w:ilvl w:val="1"/>
+          <w:numId w:val="17"/>
+        </w:numPr>
+      </w:pPr>
+      <w:proofErr w:type="spellStart"/>
+      <w:r>
+        <w:t>Request.QueryString</w:t>
+      </w:r>
+      <w:proofErr w:type="spellEnd"/>
+      <w:r>
+        <w:t xml:space="preserve">["id"] busca en la URL si existe la palabra "id" y nos devuelve su valor en formato </w:t>
+      </w:r>
+      <w:proofErr w:type="spellStart"/>
+      <w:r>
+        <w:t>string</w:t>
+      </w:r>
+      <w:proofErr w:type="spellEnd"/>
+      <w:r>
+        <w:t>.</w:t>
+      </w:r>
+    </w:p>
+    <w:p>
+      <w:pPr>
+        <w:numPr>
+          <w:ilvl w:val="1"/>
+          <w:numId w:val="17"/>
+        </w:numPr>
+      </w:pPr>
+      <w:r>
+        <w:t>Si la palabra no existe en la URL, devuelve nulo (</w:t>
+      </w:r>
+      <w:proofErr w:type="spellStart"/>
+      <w:r>
+        <w:t>null</w:t>
+      </w:r>
+      <w:proofErr w:type="spellEnd"/>
+      <w:r>
+        <w:t xml:space="preserve">), por lo que siempre debemos validar esto antes de intentar transformar el dato a número con </w:t>
+      </w:r>
+      <w:proofErr w:type="spellStart"/>
+      <w:proofErr w:type="gramStart"/>
+      <w:r>
+        <w:t>int.Parse</w:t>
+      </w:r>
+      <w:proofErr w:type="spellEnd"/>
+      <w:proofErr w:type="gramEnd"/>
+      <w:r>
+        <w:t>() para que la aplicación no explote.</w:t>
+      </w:r>
+    </w:p>
+    <w:p>
+      <w:r>
+        <w:t xml:space="preserve">Tu instinto de usar </w:t>
+      </w:r>
+      <w:proofErr w:type="spellStart"/>
+      <w:r>
+        <w:t>Session</w:t>
+      </w:r>
+      <w:proofErr w:type="spellEnd"/>
+      <w:r>
+        <w:t xml:space="preserve"> es súper lógico porque lo usamos mucho para proteger datos. Sin embargo, para </w:t>
+      </w:r>
+      <w:r>
+        <w:rPr>
+          <w:b/>
+          <w:bCs/>
+        </w:rPr>
+        <w:t>Catálogos de E-Commerce</w:t>
+      </w:r>
+      <w:r>
+        <w:t>, usar la URL (</w:t>
+      </w:r>
+      <w:proofErr w:type="spellStart"/>
+      <w:r>
+        <w:t>QueryString</w:t>
+      </w:r>
+      <w:proofErr w:type="spellEnd"/>
+      <w:r>
+        <w:t xml:space="preserve">) no solo es mejor, sino que es el </w:t>
+      </w:r>
+      <w:r>
+        <w:rPr>
+          <w:b/>
+          <w:bCs/>
+        </w:rPr>
+        <w:t>Estándar de la Industria</w:t>
+      </w:r>
+      <w:r>
+        <w:t>. Te explico por qué con casos reales:</w:t>
+      </w:r>
+    </w:p>
+    <w:p>
+      <w:pPr>
+        <w:numPr>
+          <w:ilvl w:val="0"/>
+          <w:numId w:val="18"/>
+        </w:numPr>
+      </w:pPr>
+      <w:r>
+        <w:rPr>
+          <w:b/>
+          <w:bCs/>
+        </w:rPr>
+        <w:t>La prueba de WhatsApp (Compartir enlaces):</w:t>
+      </w:r>
+      <w:r>
+        <w:t xml:space="preserve"> </w:t>
+      </w:r>
+      <w:proofErr w:type="spellStart"/>
+      <w:r>
+        <w:t>Imaginate</w:t>
+      </w:r>
+      <w:proofErr w:type="spellEnd"/>
+      <w:r>
+        <w:t xml:space="preserve"> que estás navegando por tu tienda, ves el Galaxy S10 y le querés mandar el link a tu mamá por WhatsApp para que lo vea.</w:t>
+      </w:r>
+    </w:p>
+    <w:p>
+      <w:pPr>
+        <w:numPr>
+          <w:ilvl w:val="1"/>
+          <w:numId w:val="18"/>
+        </w:numPr>
+      </w:pPr>
+      <w:proofErr w:type="gramStart"/>
+      <w:r>
+        <w:t xml:space="preserve">Si </w:t>
+      </w:r>
+      <w:proofErr w:type="spellStart"/>
+      <w:r>
+        <w:t>usás</w:t>
+      </w:r>
+      <w:proofErr w:type="spellEnd"/>
+      <w:r>
+        <w:t xml:space="preserve"> </w:t>
+      </w:r>
+      <w:r>
+        <w:rPr>
+          <w:b/>
+          <w:bCs/>
+        </w:rPr>
+        <w:t>URL</w:t>
+      </w:r>
+      <w:r>
+        <w:t xml:space="preserve"> (</w:t>
+      </w:r>
+      <w:proofErr w:type="spellStart"/>
+      <w:r>
+        <w:t>Detalle.aspx?</w:t>
+      </w:r>
+      <w:proofErr w:type="gramEnd"/>
+      <w:r>
+        <w:t>id</w:t>
+      </w:r>
+      <w:proofErr w:type="spellEnd"/>
+      <w:r>
+        <w:t>=5), ella hace clic y su navegador lee el "5", va a la base de datos y le muestra el celular perfecto.</w:t>
+      </w:r>
+    </w:p>
+    <w:p>
+      <w:pPr>
+        <w:numPr>
+          <w:ilvl w:val="1"/>
+          <w:numId w:val="18"/>
+        </w:numPr>
+      </w:pPr>
+      <w:r>
+        <w:t xml:space="preserve">Si </w:t>
+      </w:r>
+      <w:proofErr w:type="spellStart"/>
+      <w:r>
+        <w:t>usás</w:t>
+      </w:r>
+      <w:proofErr w:type="spellEnd"/>
+      <w:r>
+        <w:t xml:space="preserve"> </w:t>
+      </w:r>
+      <w:proofErr w:type="spellStart"/>
+      <w:r>
+        <w:rPr>
+          <w:b/>
+          <w:bCs/>
+        </w:rPr>
+        <w:t>Session</w:t>
+      </w:r>
+      <w:proofErr w:type="spellEnd"/>
+      <w:r>
+        <w:t>, la URL que le mandarías sería solo Detalle.aspx. Al hacer clic, como ella recién entra, su "</w:t>
+      </w:r>
+      <w:proofErr w:type="spellStart"/>
+      <w:r>
+        <w:t>Session</w:t>
+      </w:r>
+      <w:proofErr w:type="spellEnd"/>
+      <w:r>
+        <w:t>" está vacía y la página le tiraría un error o se vería en blanco.</w:t>
+      </w:r>
+    </w:p>
+    <w:p>
+      <w:pPr>
+        <w:numPr>
+          <w:ilvl w:val="0"/>
+          <w:numId w:val="18"/>
+        </w:numPr>
+      </w:pPr>
+      <w:r>
+        <w:rPr>
+          <w:b/>
+          <w:bCs/>
+        </w:rPr>
+        <w:t>La prueba de las Pestañas Múltiples:</w:t>
+      </w:r>
+      <w:r>
+        <w:t xml:space="preserve"> ¿Qué pasa si abrís el catálogo, </w:t>
+      </w:r>
+      <w:proofErr w:type="spellStart"/>
+      <w:r>
+        <w:t>hacés</w:t>
+      </w:r>
+      <w:proofErr w:type="spellEnd"/>
+      <w:r>
+        <w:t xml:space="preserve"> clic derecho en la Play 4 y </w:t>
+      </w:r>
+      <w:proofErr w:type="spellStart"/>
+      <w:r>
+        <w:t>ponés</w:t>
+      </w:r>
+      <w:proofErr w:type="spellEnd"/>
+      <w:r>
+        <w:t xml:space="preserve"> </w:t>
+      </w:r>
+      <w:r>
+        <w:rPr>
+          <w:i/>
+          <w:iCs/>
+        </w:rPr>
+        <w:t>"</w:t>
+      </w:r>
+      <w:proofErr w:type="gramStart"/>
+      <w:r>
+        <w:rPr>
+          <w:i/>
+          <w:iCs/>
+        </w:rPr>
+        <w:t>Abrir en pestaña nueva"</w:t>
+      </w:r>
+      <w:r>
+        <w:t xml:space="preserve">, y luego </w:t>
+      </w:r>
+      <w:proofErr w:type="spellStart"/>
+      <w:r>
+        <w:t>hacés</w:t>
+      </w:r>
+      <w:proofErr w:type="spellEnd"/>
+      <w:r>
+        <w:t xml:space="preserve"> lo mismo con el Apple TV?</w:t>
+      </w:r>
+      <w:proofErr w:type="gramEnd"/>
+    </w:p>
+    <w:p>
+      <w:pPr>
+        <w:numPr>
+          <w:ilvl w:val="1"/>
+          <w:numId w:val="18"/>
+        </w:numPr>
+      </w:pPr>
+      <w:r>
+        <w:t xml:space="preserve">Con </w:t>
+      </w:r>
+      <w:proofErr w:type="spellStart"/>
+      <w:r>
+        <w:rPr>
+          <w:b/>
+          <w:bCs/>
+        </w:rPr>
+        <w:t>Session</w:t>
+      </w:r>
+      <w:proofErr w:type="spellEnd"/>
+      <w:r>
+        <w:t>, el servidor se confunde. La variable "</w:t>
+      </w:r>
+      <w:proofErr w:type="spellStart"/>
+      <w:r>
+        <w:t>ArticuloSeleccionado</w:t>
+      </w:r>
+      <w:proofErr w:type="spellEnd"/>
+      <w:r>
+        <w:t xml:space="preserve">" se </w:t>
+      </w:r>
+      <w:proofErr w:type="spellStart"/>
+      <w:r>
+        <w:t>sobreescribe</w:t>
+      </w:r>
+      <w:proofErr w:type="spellEnd"/>
+      <w:r>
+        <w:t xml:space="preserve"> con el último clic. ¡De repente ambas pestañas mostrarían el Apple TV!</w:t>
+      </w:r>
+    </w:p>
+    <w:p>
+      <w:pPr>
+        <w:numPr>
+          <w:ilvl w:val="1"/>
+          <w:numId w:val="18"/>
+        </w:numPr>
+      </w:pPr>
+      <w:r>
+        <w:t xml:space="preserve">Con </w:t>
+      </w:r>
+      <w:r>
+        <w:rPr>
+          <w:b/>
+          <w:bCs/>
+        </w:rPr>
+        <w:t>URL</w:t>
+      </w:r>
+      <w:r>
+        <w:t xml:space="preserve">, cada pestaña tiene su propio ID independiente en la barra de direcciones (?id=3 </w:t>
+      </w:r>
+      <w:proofErr w:type="gramStart"/>
+      <w:r>
+        <w:t>y ?id</w:t>
+      </w:r>
+      <w:proofErr w:type="gramEnd"/>
+      <w:r>
+        <w:t>=5). Cero conflictos.</w:t>
+      </w:r>
+    </w:p>
+    <w:p>
+      <w:pPr>
+        <w:numPr>
+          <w:ilvl w:val="0"/>
+          <w:numId w:val="18"/>
+        </w:numPr>
+      </w:pPr>
+      <w:r>
+        <w:rPr>
+          <w:b/>
+          <w:bCs/>
+        </w:rPr>
+        <w:t>SEO (Google):</w:t>
+      </w:r>
+      <w:r>
+        <w:t xml:space="preserve"> Google indexa los productos leyendo las </w:t>
+      </w:r>
+      <w:proofErr w:type="spellStart"/>
+      <w:r>
+        <w:t>URLs</w:t>
+      </w:r>
+      <w:proofErr w:type="spellEnd"/>
+      <w:r>
+        <w:t>. Si no hay parámetros en la URL, Google piensa que tu e-</w:t>
+      </w:r>
+      <w:proofErr w:type="spellStart"/>
+      <w:r>
+        <w:t>commerce</w:t>
+      </w:r>
+      <w:proofErr w:type="spellEnd"/>
+      <w:r>
+        <w:t xml:space="preserve"> tiene una sola página vacía.</w:t>
+      </w:r>
+    </w:p>
+    <w:p>
+      <w:r>
+        <w:rPr>
+          <w:b/>
+          <w:bCs/>
+        </w:rPr>
+        <w:lastRenderedPageBreak/>
+        <w:t xml:space="preserve">¿Cuándo usamos </w:t>
+      </w:r>
+      <w:proofErr w:type="spellStart"/>
+      <w:r>
+        <w:rPr>
+          <w:b/>
+          <w:bCs/>
+        </w:rPr>
+        <w:t>Session</w:t>
+      </w:r>
+      <w:proofErr w:type="spellEnd"/>
+      <w:r>
+        <w:rPr>
+          <w:b/>
+          <w:bCs/>
+        </w:rPr>
+        <w:t xml:space="preserve"> entonces?</w:t>
+      </w:r>
+      <w:r>
+        <w:t xml:space="preserve"> Para datos privados y únicos de cada computadora: El carrito de compras, o saber quién es el usuario que hizo </w:t>
+      </w:r>
+      <w:proofErr w:type="spellStart"/>
+      <w:r>
+        <w:t>Login</w:t>
+      </w:r>
+      <w:proofErr w:type="spellEnd"/>
+      <w:r>
+        <w:t>. ¡Esas cosas no se pueden pasar por URL!</w:t>
+      </w:r>
+    </w:p>
+    <w:p/>
+    <w:p>
+      <w:pPr>
+        <w:pStyle w:val="Prrafodelista"/>
+        <w:spacing w:before="100" w:beforeAutospacing="1" w:after="100" w:afterAutospacing="1" w:line="240" w:lineRule="auto"/>
+        <w:outlineLvl w:val="1"/>
+        <w:rPr>
+          <w:rFonts w:eastAsia="Times New Roman" w:cs="Times New Roman"/>
+          <w:b/>
+          <w:bCs/>
+          <w:kern w:val="0"/>
+          <w:sz w:val="28"/>
+          <w:szCs w:val="28"/>
+          <w:lang w:eastAsia="es-AR"/>
+          <w14:ligatures w14:val="none"/>
+        </w:rPr>
+      </w:pPr>
+      <w:r>
+        <w:rPr>
+          <w:rFonts w:ascii="Segoe UI Emoji" w:eastAsia="Times New Roman" w:hAnsi="Segoe UI Emoji" w:cs="Segoe UI Emoji"/>
+          <w:b/>
+          <w:bCs/>
+          <w:kern w:val="0"/>
+          <w:sz w:val="28"/>
+          <w:szCs w:val="28"/>
+          <w:lang w:eastAsia="es-AR"/>
+          <w14:ligatures w14:val="none"/>
+        </w:rPr>
+        <w:t>🚀</w:t>
+      </w:r>
+      <w:r>
+        <w:rPr>
+          <w:rFonts w:eastAsia="Times New Roman" w:cs="Times New Roman"/>
+          <w:b/>
+          <w:bCs/>
+          <w:kern w:val="0"/>
+          <w:sz w:val="28"/>
+          <w:szCs w:val="28"/>
+          <w:lang w:eastAsia="es-AR"/>
+          <w14:ligatures w14:val="none"/>
+        </w:rPr>
+        <w:t xml:space="preserve">Atrapar el ID en el </w:t>
+      </w:r>
+      <w:proofErr w:type="spellStart"/>
+      <w:r>
+        <w:rPr>
+          <w:rFonts w:eastAsia="Times New Roman" w:cs="Times New Roman"/>
+          <w:b/>
+          <w:bCs/>
+          <w:kern w:val="0"/>
+          <w:sz w:val="28"/>
+          <w:szCs w:val="28"/>
+          <w:lang w:eastAsia="es-AR"/>
+          <w14:ligatures w14:val="none"/>
+        </w:rPr>
+        <w:t>Code-Behind</w:t>
+      </w:r>
+      <w:proofErr w:type="spellEnd"/>
+      <w:r>
+        <w:rPr>
+          <w:rFonts w:eastAsia="Times New Roman" w:cs="Times New Roman"/>
+          <w:b/>
+          <w:bCs/>
+          <w:kern w:val="0"/>
+          <w:sz w:val="28"/>
+          <w:szCs w:val="28"/>
+          <w:lang w:eastAsia="es-AR"/>
+          <w14:ligatures w14:val="none"/>
+        </w:rPr>
+        <w:t xml:space="preserve"> (</w:t>
+      </w:r>
+      <w:proofErr w:type="spellStart"/>
+      <w:r>
+        <w:rPr>
+          <w:rFonts w:eastAsia="Times New Roman" w:cs="Courier New"/>
+          <w:b/>
+          <w:bCs/>
+          <w:kern w:val="0"/>
+          <w:sz w:val="28"/>
+          <w:szCs w:val="28"/>
+          <w:lang w:eastAsia="es-AR"/>
+          <w14:ligatures w14:val="none"/>
+        </w:rPr>
+        <w:t>Detalle.aspx.cs</w:t>
+      </w:r>
+      <w:proofErr w:type="spellEnd"/>
+      <w:r>
+        <w:rPr>
+          <w:rFonts w:eastAsia="Times New Roman" w:cs="Times New Roman"/>
+          <w:b/>
+          <w:bCs/>
+          <w:kern w:val="0"/>
+          <w:sz w:val="28"/>
+          <w:szCs w:val="28"/>
+          <w:lang w:eastAsia="es-AR"/>
+          <w14:ligatures w14:val="none"/>
+        </w:rPr>
+        <w:t>)</w:t>
+      </w:r>
+    </w:p>
+    <w:p>
+      <w:pPr>
+        <w:pStyle w:val="Prrafodelista"/>
+        <w:spacing w:before="100" w:beforeAutospacing="1" w:after="100" w:afterAutospacing="1" w:line="240" w:lineRule="auto"/>
+        <w:rPr>
+          <w:rFonts w:eastAsia="Times New Roman" w:cs="Times New Roman"/>
+          <w:kern w:val="0"/>
+          <w:lang w:eastAsia="es-AR"/>
+          <w14:ligatures w14:val="none"/>
+        </w:rPr>
+      </w:pPr>
+      <w:r>
+        <w:rPr>
+          <w:rFonts w:eastAsia="Times New Roman" w:cs="Times New Roman"/>
+          <w:kern w:val="0"/>
+          <w:lang w:eastAsia="es-AR"/>
+          <w14:ligatures w14:val="none"/>
+        </w:rPr>
+        <w:t>Vamos a escribir el código del servidor para recibir ese ID y buscar el artículo.</w:t>
+      </w:r>
+    </w:p>
+    <w:p>
+      <w:pPr>
+        <w:pStyle w:val="Prrafodelista"/>
+        <w:spacing w:before="100" w:beforeAutospacing="1" w:after="100" w:afterAutospacing="1" w:line="240" w:lineRule="auto"/>
+        <w:rPr>
+          <w:rFonts w:eastAsia="Times New Roman" w:cs="Times New Roman"/>
+          <w:kern w:val="0"/>
+          <w:lang w:val="en-US" w:eastAsia="es-AR"/>
+          <w14:ligatures w14:val="none"/>
+        </w:rPr>
+      </w:pPr>
+      <w:r>
+        <w:rPr>
+          <w:rFonts w:eastAsia="Times New Roman" w:cs="Times New Roman"/>
+          <w:kern w:val="0"/>
+          <w:lang w:val="en-US" w:eastAsia="es-AR"/>
+          <w14:ligatures w14:val="none"/>
+        </w:rPr>
+        <w:t xml:space="preserve">namespace </w:t>
+      </w:r>
+      <w:proofErr w:type="spellStart"/>
+      <w:r>
+        <w:rPr>
+          <w:rFonts w:eastAsia="Times New Roman" w:cs="Times New Roman"/>
+          <w:kern w:val="0"/>
+          <w:lang w:val="en-US" w:eastAsia="es-AR"/>
+          <w14:ligatures w14:val="none"/>
+        </w:rPr>
+        <w:t>e_commerce</w:t>
+      </w:r>
+      <w:proofErr w:type="spellEnd"/>
+    </w:p>
+    <w:p>
+      <w:pPr>
+        <w:pStyle w:val="Prrafodelista"/>
+        <w:spacing w:before="100" w:beforeAutospacing="1" w:after="100" w:afterAutospacing="1" w:line="240" w:lineRule="auto"/>
+        <w:rPr>
+          <w:rFonts w:eastAsia="Times New Roman" w:cs="Times New Roman"/>
+          <w:kern w:val="0"/>
+          <w:lang w:val="en-US" w:eastAsia="es-AR"/>
+          <w14:ligatures w14:val="none"/>
+        </w:rPr>
+      </w:pPr>
+      <w:r>
+        <w:rPr>
+          <w:rFonts w:eastAsia="Times New Roman" w:cs="Times New Roman"/>
+          <w:kern w:val="0"/>
+          <w:lang w:val="en-US" w:eastAsia="es-AR"/>
+          <w14:ligatures w14:val="none"/>
+        </w:rPr>
+        <w:t>{</w:t>
+      </w:r>
+    </w:p>
+    <w:p>
+      <w:pPr>
+        <w:pStyle w:val="Prrafodelista"/>
+        <w:spacing w:before="100" w:beforeAutospacing="1" w:after="100" w:afterAutospacing="1" w:line="240" w:lineRule="auto"/>
+        <w:rPr>
+          <w:rFonts w:eastAsia="Times New Roman" w:cs="Times New Roman"/>
+          <w:kern w:val="0"/>
+          <w:lang w:val="en-US" w:eastAsia="es-AR"/>
+          <w14:ligatures w14:val="none"/>
+        </w:rPr>
+      </w:pPr>
+      <w:r>
+        <w:rPr>
+          <w:rFonts w:eastAsia="Times New Roman" w:cs="Times New Roman"/>
+          <w:kern w:val="0"/>
+          <w:lang w:val="en-US" w:eastAsia="es-AR"/>
+          <w14:ligatures w14:val="none"/>
+        </w:rPr>
+        <w:t xml:space="preserve">    public partial class </w:t>
+      </w:r>
+      <w:proofErr w:type="spellStart"/>
+      <w:proofErr w:type="gramStart"/>
+      <w:r>
+        <w:rPr>
+          <w:rFonts w:eastAsia="Times New Roman" w:cs="Times New Roman"/>
+          <w:kern w:val="0"/>
+          <w:lang w:val="en-US" w:eastAsia="es-AR"/>
+          <w14:ligatures w14:val="none"/>
+        </w:rPr>
+        <w:t>Detalle</w:t>
+      </w:r>
+      <w:proofErr w:type="spellEnd"/>
+      <w:r>
+        <w:rPr>
+          <w:rFonts w:eastAsia="Times New Roman" w:cs="Times New Roman"/>
+          <w:kern w:val="0"/>
+          <w:lang w:val="en-US" w:eastAsia="es-AR"/>
+          <w14:ligatures w14:val="none"/>
+        </w:rPr>
+        <w:t xml:space="preserve"> :</w:t>
+      </w:r>
+      <w:proofErr w:type="gramEnd"/>
+      <w:r>
+        <w:rPr>
+          <w:rFonts w:eastAsia="Times New Roman" w:cs="Times New Roman"/>
+          <w:kern w:val="0"/>
+          <w:lang w:val="en-US" w:eastAsia="es-AR"/>
+          <w14:ligatures w14:val="none"/>
+        </w:rPr>
+        <w:t xml:space="preserve"> </w:t>
+      </w:r>
+      <w:proofErr w:type="spellStart"/>
+      <w:r>
+        <w:rPr>
+          <w:rFonts w:eastAsia="Times New Roman" w:cs="Times New Roman"/>
+          <w:kern w:val="0"/>
+          <w:lang w:val="en-US" w:eastAsia="es-AR"/>
+          <w14:ligatures w14:val="none"/>
+        </w:rPr>
+        <w:t>System.Web.UI.Page</w:t>
+      </w:r>
+      <w:proofErr w:type="spellEnd"/>
+    </w:p>
+    <w:p>
+      <w:pPr>
+        <w:pStyle w:val="Prrafodelista"/>
+        <w:spacing w:before="100" w:beforeAutospacing="1" w:after="100" w:afterAutospacing="1" w:line="240" w:lineRule="auto"/>
+        <w:rPr>
+          <w:rFonts w:eastAsia="Times New Roman" w:cs="Times New Roman"/>
+          <w:kern w:val="0"/>
+          <w:lang w:eastAsia="es-AR"/>
+          <w14:ligatures w14:val="none"/>
+        </w:rPr>
+      </w:pPr>
+      <w:r>
+        <w:rPr>
+          <w:rFonts w:eastAsia="Times New Roman" w:cs="Times New Roman"/>
+          <w:kern w:val="0"/>
+          <w:lang w:val="en-US" w:eastAsia="es-AR"/>
+          <w14:ligatures w14:val="none"/>
+        </w:rPr>
+        <w:t xml:space="preserve">    </w:t>
+      </w:r>
+      <w:r>
+        <w:rPr>
+          <w:rFonts w:eastAsia="Times New Roman" w:cs="Times New Roman"/>
+          <w:kern w:val="0"/>
+          <w:lang w:eastAsia="es-AR"/>
+          <w14:ligatures w14:val="none"/>
+        </w:rPr>
+        <w:t>{</w:t>
+      </w:r>
+    </w:p>
+    <w:p>
+      <w:pPr>
+        <w:pStyle w:val="Prrafodelista"/>
+        <w:spacing w:before="100" w:beforeAutospacing="1" w:after="100" w:afterAutospacing="1" w:line="240" w:lineRule="auto"/>
+        <w:rPr>
+          <w:rFonts w:eastAsia="Times New Roman" w:cs="Times New Roman"/>
+          <w:kern w:val="0"/>
+          <w:lang w:eastAsia="es-AR"/>
+          <w14:ligatures w14:val="none"/>
+        </w:rPr>
+      </w:pPr>
+      <w:r>
+        <w:rPr>
+          <w:rFonts w:eastAsia="Times New Roman" w:cs="Times New Roman"/>
+          <w:kern w:val="0"/>
+          <w:lang w:eastAsia="es-AR"/>
+          <w14:ligatures w14:val="none"/>
+        </w:rPr>
+        <w:t xml:space="preserve">        // 1. Creamos una propiedad pública para guardar el artículo y que el HTML lo pueda leer</w:t>
+      </w:r>
+    </w:p>
+    <w:p>
+      <w:pPr>
+        <w:pStyle w:val="Prrafodelista"/>
+        <w:spacing w:before="100" w:beforeAutospacing="1" w:after="100" w:afterAutospacing="1" w:line="240" w:lineRule="auto"/>
+        <w:rPr>
+          <w:rFonts w:eastAsia="Times New Roman" w:cs="Times New Roman"/>
+          <w:kern w:val="0"/>
+          <w:lang w:val="en-US" w:eastAsia="es-AR"/>
+          <w14:ligatures w14:val="none"/>
+        </w:rPr>
+      </w:pPr>
+      <w:r>
+        <w:rPr>
+          <w:rFonts w:eastAsia="Times New Roman" w:cs="Times New Roman"/>
+          <w:kern w:val="0"/>
+          <w:lang w:eastAsia="es-AR"/>
+          <w14:ligatures w14:val="none"/>
+        </w:rPr>
+        <w:t xml:space="preserve">        </w:t>
+      </w:r>
+      <w:r>
+        <w:rPr>
+          <w:rFonts w:eastAsia="Times New Roman" w:cs="Times New Roman"/>
+          <w:kern w:val="0"/>
+          <w:lang w:val="en-US" w:eastAsia="es-AR"/>
+          <w14:ligatures w14:val="none"/>
+        </w:rPr>
+        <w:t xml:space="preserve">public </w:t>
+      </w:r>
+      <w:proofErr w:type="spellStart"/>
+      <w:r>
+        <w:rPr>
+          <w:rFonts w:eastAsia="Times New Roman" w:cs="Times New Roman"/>
+          <w:kern w:val="0"/>
+          <w:lang w:val="en-US" w:eastAsia="es-AR"/>
+          <w14:ligatures w14:val="none"/>
+        </w:rPr>
+        <w:t>Articulo</w:t>
+      </w:r>
+      <w:proofErr w:type="spellEnd"/>
+      <w:r>
+        <w:rPr>
+          <w:rFonts w:eastAsia="Times New Roman" w:cs="Times New Roman"/>
+          <w:kern w:val="0"/>
+          <w:lang w:val="en-US" w:eastAsia="es-AR"/>
+          <w14:ligatures w14:val="none"/>
+        </w:rPr>
+        <w:t xml:space="preserve"> </w:t>
+      </w:r>
+      <w:proofErr w:type="spellStart"/>
+      <w:r>
+        <w:rPr>
+          <w:rFonts w:eastAsia="Times New Roman" w:cs="Times New Roman"/>
+          <w:kern w:val="0"/>
+          <w:lang w:val="en-US" w:eastAsia="es-AR"/>
+          <w14:ligatures w14:val="none"/>
+        </w:rPr>
+        <w:t>ArticuloSeleccionado</w:t>
+      </w:r>
+      <w:proofErr w:type="spellEnd"/>
+      <w:r>
+        <w:rPr>
+          <w:rFonts w:eastAsia="Times New Roman" w:cs="Times New Roman"/>
+          <w:kern w:val="0"/>
+          <w:lang w:val="en-US" w:eastAsia="es-AR"/>
+          <w14:ligatures w14:val="none"/>
+        </w:rPr>
+        <w:t xml:space="preserve"> </w:t>
+      </w:r>
+      <w:proofErr w:type="gramStart"/>
+      <w:r>
+        <w:rPr>
+          <w:rFonts w:eastAsia="Times New Roman" w:cs="Times New Roman"/>
+          <w:kern w:val="0"/>
+          <w:lang w:val="en-US" w:eastAsia="es-AR"/>
+          <w14:ligatures w14:val="none"/>
+        </w:rPr>
+        <w:t>{ get</w:t>
+      </w:r>
+      <w:proofErr w:type="gramEnd"/>
+      <w:r>
+        <w:rPr>
+          <w:rFonts w:eastAsia="Times New Roman" w:cs="Times New Roman"/>
+          <w:kern w:val="0"/>
+          <w:lang w:val="en-US" w:eastAsia="es-AR"/>
+          <w14:ligatures w14:val="none"/>
+        </w:rPr>
+        <w:t>; set; }</w:t>
+      </w:r>
+    </w:p>
+    <w:p>
+      <w:pPr>
+        <w:pStyle w:val="Prrafodelista"/>
+        <w:spacing w:before="100" w:beforeAutospacing="1" w:after="100" w:afterAutospacing="1" w:line="240" w:lineRule="auto"/>
+        <w:rPr>
+          <w:rFonts w:eastAsia="Times New Roman" w:cs="Times New Roman"/>
+          <w:kern w:val="0"/>
+          <w:lang w:val="en-US" w:eastAsia="es-AR"/>
+          <w14:ligatures w14:val="none"/>
+        </w:rPr>
+      </w:pPr>
+    </w:p>
+    <w:p>
+      <w:pPr>
+        <w:pStyle w:val="Prrafodelista"/>
+        <w:spacing w:before="100" w:beforeAutospacing="1" w:after="100" w:afterAutospacing="1" w:line="240" w:lineRule="auto"/>
+        <w:rPr>
+          <w:rFonts w:eastAsia="Times New Roman" w:cs="Times New Roman"/>
+          <w:kern w:val="0"/>
+          <w:lang w:val="en-US" w:eastAsia="es-AR"/>
+          <w14:ligatures w14:val="none"/>
+        </w:rPr>
+      </w:pPr>
+      <w:r>
+        <w:rPr>
+          <w:rFonts w:eastAsia="Times New Roman" w:cs="Times New Roman"/>
+          <w:kern w:val="0"/>
+          <w:lang w:val="en-US" w:eastAsia="es-AR"/>
+          <w14:ligatures w14:val="none"/>
+        </w:rPr>
+        <w:t xml:space="preserve">        protected void </w:t>
+      </w:r>
+      <w:proofErr w:type="spellStart"/>
+      <w:r>
+        <w:rPr>
+          <w:rFonts w:eastAsia="Times New Roman" w:cs="Times New Roman"/>
+          <w:kern w:val="0"/>
+          <w:lang w:val="en-US" w:eastAsia="es-AR"/>
+          <w14:ligatures w14:val="none"/>
+        </w:rPr>
+        <w:t>Page_</w:t>
+      </w:r>
+      <w:proofErr w:type="gramStart"/>
+      <w:r>
+        <w:rPr>
+          <w:rFonts w:eastAsia="Times New Roman" w:cs="Times New Roman"/>
+          <w:kern w:val="0"/>
+          <w:lang w:val="en-US" w:eastAsia="es-AR"/>
+          <w14:ligatures w14:val="none"/>
+        </w:rPr>
+        <w:t>Load</w:t>
+      </w:r>
+      <w:proofErr w:type="spellEnd"/>
+      <w:r>
+        <w:rPr>
+          <w:rFonts w:eastAsia="Times New Roman" w:cs="Times New Roman"/>
+          <w:kern w:val="0"/>
+          <w:lang w:val="en-US" w:eastAsia="es-AR"/>
+          <w14:ligatures w14:val="none"/>
+        </w:rPr>
+        <w:t>(</w:t>
+      </w:r>
+      <w:proofErr w:type="gramEnd"/>
+      <w:r>
+        <w:rPr>
+          <w:rFonts w:eastAsia="Times New Roman" w:cs="Times New Roman"/>
+          <w:kern w:val="0"/>
+          <w:lang w:val="en-US" w:eastAsia="es-AR"/>
+          <w14:ligatures w14:val="none"/>
+        </w:rPr>
+        <w:t xml:space="preserve">object sender, </w:t>
+      </w:r>
+      <w:proofErr w:type="spellStart"/>
+      <w:r>
+        <w:rPr>
+          <w:rFonts w:eastAsia="Times New Roman" w:cs="Times New Roman"/>
+          <w:kern w:val="0"/>
+          <w:lang w:val="en-US" w:eastAsia="es-AR"/>
+          <w14:ligatures w14:val="none"/>
+        </w:rPr>
+        <w:t>EventArgs</w:t>
+      </w:r>
+      <w:proofErr w:type="spellEnd"/>
+      <w:r>
+        <w:rPr>
+          <w:rFonts w:eastAsia="Times New Roman" w:cs="Times New Roman"/>
+          <w:kern w:val="0"/>
+          <w:lang w:val="en-US" w:eastAsia="es-AR"/>
+          <w14:ligatures w14:val="none"/>
+        </w:rPr>
+        <w:t xml:space="preserve"> e)</w:t>
+      </w:r>
+    </w:p>
+    <w:p>
+      <w:pPr>
+        <w:pStyle w:val="Prrafodelista"/>
+        <w:spacing w:before="100" w:beforeAutospacing="1" w:after="100" w:afterAutospacing="1" w:line="240" w:lineRule="auto"/>
+        <w:rPr>
+          <w:rFonts w:eastAsia="Times New Roman" w:cs="Times New Roman"/>
+          <w:kern w:val="0"/>
+          <w:lang w:eastAsia="es-AR"/>
+          <w14:ligatures w14:val="none"/>
+        </w:rPr>
+      </w:pPr>
+      <w:r>
+        <w:rPr>
+          <w:rFonts w:eastAsia="Times New Roman" w:cs="Times New Roman"/>
+          <w:kern w:val="0"/>
+          <w:lang w:val="en-US" w:eastAsia="es-AR"/>
+          <w14:ligatures w14:val="none"/>
+        </w:rPr>
+        <w:t xml:space="preserve">        </w:t>
+      </w:r>
+      <w:r>
+        <w:rPr>
+          <w:rFonts w:eastAsia="Times New Roman" w:cs="Times New Roman"/>
+          <w:kern w:val="0"/>
+          <w:lang w:eastAsia="es-AR"/>
+          <w14:ligatures w14:val="none"/>
+        </w:rPr>
+        <w:t>{</w:t>
+      </w:r>
+    </w:p>
+    <w:p>
+      <w:pPr>
+        <w:pStyle w:val="Prrafodelista"/>
+        <w:spacing w:before="100" w:beforeAutospacing="1" w:after="100" w:afterAutospacing="1" w:line="240" w:lineRule="auto"/>
+        <w:rPr>
+          <w:rFonts w:eastAsia="Times New Roman" w:cs="Times New Roman"/>
+          <w:kern w:val="0"/>
+          <w:lang w:eastAsia="es-AR"/>
+          <w14:ligatures w14:val="none"/>
+        </w:rPr>
+      </w:pPr>
+      <w:r>
+        <w:rPr>
+          <w:rFonts w:eastAsia="Times New Roman" w:cs="Times New Roman"/>
+          <w:kern w:val="0"/>
+          <w:lang w:eastAsia="es-AR"/>
+          <w14:ligatures w14:val="none"/>
+        </w:rPr>
+        <w:t xml:space="preserve">            // 2. Revisamos si en la URL viene el famoso parámetro "id"</w:t>
+      </w:r>
+    </w:p>
+    <w:p>
+      <w:pPr>
+        <w:pStyle w:val="Prrafodelista"/>
+        <w:spacing w:before="100" w:beforeAutospacing="1" w:after="100" w:afterAutospacing="1" w:line="240" w:lineRule="auto"/>
+        <w:rPr>
+          <w:rFonts w:eastAsia="Times New Roman" w:cs="Times New Roman"/>
+          <w:kern w:val="0"/>
+          <w:lang w:val="en-US" w:eastAsia="es-AR"/>
+          <w14:ligatures w14:val="none"/>
+        </w:rPr>
+      </w:pPr>
+      <w:r>
+        <w:rPr>
+          <w:rFonts w:eastAsia="Times New Roman" w:cs="Times New Roman"/>
+          <w:kern w:val="0"/>
+          <w:lang w:eastAsia="es-AR"/>
+          <w14:ligatures w14:val="none"/>
         </w:rPr>
         <w:t xml:space="preserve">            </w:t>
       </w:r>
-    </w:p>
-    <w:p>
-      <w:pPr>
-        <w:pStyle w:val="Prrafodelista"/>
-        <w:rPr>
-          <w:lang w:val="en-US"/>
-        </w:rPr>
-      </w:pPr>
-      <w:r>
-        <w:rPr>
-          <w:lang w:val="en-US"/>
-        </w:rPr>
-        <w:t xml:space="preserve">            &lt;div class="col"&gt;</w:t>
-      </w:r>
-    </w:p>
-    <w:p>
-      <w:pPr>
-        <w:pStyle w:val="Prrafodelista"/>
-        <w:rPr>
-          <w:lang w:val="en-US"/>
-        </w:rPr>
-      </w:pPr>
-      <w:r>
-        <w:rPr>
-          <w:lang w:val="en-US"/>
-        </w:rPr>
-        <w:t xml:space="preserve">                &lt;div class="card h-100"&gt;</w:t>
-      </w:r>
-    </w:p>
-    <w:p>
-      <w:pPr>
-        <w:pStyle w:val="Prrafodelista"/>
-      </w:pPr>
-      <w:r>
-        <w:rPr>
-          <w:lang w:val="en-US"/>
-        </w:rPr>
-        <w:t xml:space="preserve">                    </w:t>
-      </w:r>
-      <w:r>
-        <w:t>&lt;%-- Imagen del artículo. Si la URL está rota, el '</w:t>
-      </w:r>
-      <w:proofErr w:type="spellStart"/>
-      <w:r>
-        <w:t>onerror</w:t>
-      </w:r>
-      <w:proofErr w:type="spellEnd"/>
-      <w:r>
-        <w:t>' carga una imagen por defecto --%&gt;</w:t>
-      </w:r>
-    </w:p>
-    <w:p>
-      <w:pPr>
-        <w:pStyle w:val="Prrafodelista"/>
-        <w:rPr>
-          <w:lang w:val="en-US"/>
-        </w:rPr>
-      </w:pPr>
-      <w:r>
-        <w:t xml:space="preserve">                    </w:t>
-      </w:r>
-      <w:r>
-        <w:rPr>
-          <w:lang w:val="en-US"/>
-        </w:rPr>
-        <w:t>&lt;</w:t>
-      </w:r>
-      <w:proofErr w:type="spellStart"/>
-      <w:r>
-        <w:rPr>
-          <w:lang w:val="en-US"/>
-        </w:rPr>
-        <w:t>img</w:t>
-      </w:r>
-      <w:proofErr w:type="spellEnd"/>
-      <w:r>
-        <w:rPr>
-          <w:lang w:val="en-US"/>
-        </w:rPr>
-        <w:t xml:space="preserve"> </w:t>
-      </w:r>
-      <w:proofErr w:type="spellStart"/>
-      <w:r>
-        <w:rPr>
-          <w:lang w:val="en-US"/>
-        </w:rPr>
-        <w:t>src</w:t>
-      </w:r>
-      <w:proofErr w:type="spellEnd"/>
-      <w:r>
-        <w:rPr>
-          <w:lang w:val="en-US"/>
-        </w:rPr>
-        <w:t xml:space="preserve">="&lt;%: </w:t>
-      </w:r>
-      <w:proofErr w:type="spellStart"/>
+      <w:r>
+        <w:rPr>
+          <w:rFonts w:eastAsia="Times New Roman" w:cs="Times New Roman"/>
+          <w:kern w:val="0"/>
+          <w:lang w:val="en-US" w:eastAsia="es-AR"/>
+          <w14:ligatures w14:val="none"/>
+        </w:rPr>
+        <w:t>if (</w:t>
+      </w:r>
+      <w:proofErr w:type="spellStart"/>
+      <w:r>
+        <w:rPr>
+          <w:rFonts w:eastAsia="Times New Roman" w:cs="Times New Roman"/>
+          <w:kern w:val="0"/>
+          <w:lang w:val="en-US" w:eastAsia="es-AR"/>
+          <w14:ligatures w14:val="none"/>
+        </w:rPr>
+        <w:t>Request.QueryString</w:t>
+      </w:r>
+      <w:proofErr w:type="spellEnd"/>
+      <w:r>
+        <w:rPr>
+          <w:rFonts w:eastAsia="Times New Roman" w:cs="Times New Roman"/>
+          <w:kern w:val="0"/>
+          <w:lang w:val="en-US" w:eastAsia="es-AR"/>
+          <w14:ligatures w14:val="none"/>
+        </w:rPr>
+        <w:t>["id"</w:t>
+      </w:r>
       <w:proofErr w:type="gramStart"/>
       <w:r>
         <w:rPr>
-          <w:lang w:val="en-US"/>
-        </w:rPr>
-        <w:t>art.ImagenUrl</w:t>
-      </w:r>
-      <w:proofErr w:type="spellEnd"/>
+          <w:rFonts w:eastAsia="Times New Roman" w:cs="Times New Roman"/>
+          <w:kern w:val="0"/>
+          <w:lang w:val="en-US" w:eastAsia="es-AR"/>
+          <w14:ligatures w14:val="none"/>
+        </w:rPr>
+        <w:t>] !</w:t>
+      </w:r>
       <w:proofErr w:type="gramEnd"/>
       <w:r>
         <w:rPr>
-          <w:lang w:val="en-US"/>
-        </w:rPr>
-        <w:t xml:space="preserve"> %&gt;" class="card-</w:t>
-      </w:r>
-      <w:proofErr w:type="spellStart"/>
-      <w:r>
-        <w:rPr>
-          <w:lang w:val="en-US"/>
-        </w:rPr>
-        <w:t>img</w:t>
-      </w:r>
-      <w:proofErr w:type="spellEnd"/>
-      <w:r>
-        <w:rPr>
-          <w:lang w:val="en-US"/>
-        </w:rPr>
-        <w:t xml:space="preserve">-top" alt="&lt;%: </w:t>
-      </w:r>
-      <w:proofErr w:type="spellStart"/>
-      <w:r>
-        <w:rPr>
-          <w:lang w:val="en-US"/>
-        </w:rPr>
-        <w:t>art.Nombre</w:t>
-      </w:r>
-      <w:proofErr w:type="spellEnd"/>
-      <w:r>
-        <w:rPr>
-          <w:lang w:val="en-US"/>
-        </w:rPr>
-        <w:t xml:space="preserve"> %&gt;" </w:t>
-      </w:r>
-    </w:p>
-    <w:p>
-      <w:pPr>
-        <w:pStyle w:val="Prrafodelista"/>
-        <w:rPr>
-          <w:lang w:val="en-US"/>
-        </w:rPr>
-      </w:pPr>
-      <w:r>
-        <w:rPr>
-          <w:lang w:val="en-US"/>
-        </w:rPr>
-        <w:t xml:space="preserve">                         onerror="this.src='https://cdn.pixabay.com/photo/2015/10/05/22/37/blank-profile-picture-973460_960_720.png'"&gt;</w:t>
-      </w:r>
-    </w:p>
-    <w:p>
-      <w:pPr>
-        <w:pStyle w:val="Prrafodelista"/>
-        <w:rPr>
-          <w:lang w:val="en-US"/>
-        </w:rPr>
-      </w:pPr>
-      <w:r>
-        <w:rPr>
-          <w:lang w:val="en-US"/>
-        </w:rPr>
-        <w:t xml:space="preserve">                    </w:t>
-      </w:r>
-    </w:p>
-    <w:p>
-      <w:pPr>
-        <w:pStyle w:val="Prrafodelista"/>
-        <w:rPr>
-          <w:lang w:val="en-US"/>
-        </w:rPr>
-      </w:pPr>
-      <w:r>
-        <w:rPr>
-          <w:lang w:val="en-US"/>
-        </w:rPr>
-        <w:t xml:space="preserve">                    &lt;div class="card-body"&gt;</w:t>
-      </w:r>
-    </w:p>
-    <w:p>
-      <w:pPr>
-        <w:pStyle w:val="Prrafodelista"/>
-        <w:rPr>
-          <w:lang w:val="en-US"/>
-        </w:rPr>
-      </w:pPr>
-      <w:r>
-        <w:rPr>
-          <w:lang w:val="en-US"/>
-        </w:rPr>
-        <w:t xml:space="preserve">                        &lt;h5 class="card-title"&gt;&lt;%: </w:t>
+          <w:rFonts w:eastAsia="Times New Roman" w:cs="Times New Roman"/>
+          <w:kern w:val="0"/>
+          <w:lang w:val="en-US" w:eastAsia="es-AR"/>
+          <w14:ligatures w14:val="none"/>
+        </w:rPr>
+        <w:t>= null)</w:t>
+      </w:r>
+    </w:p>
+    <w:p>
+      <w:pPr>
+        <w:pStyle w:val="Prrafodelista"/>
+        <w:spacing w:before="100" w:beforeAutospacing="1" w:after="100" w:afterAutospacing="1" w:line="240" w:lineRule="auto"/>
+        <w:rPr>
+          <w:rFonts w:eastAsia="Times New Roman" w:cs="Times New Roman"/>
+          <w:kern w:val="0"/>
+          <w:lang w:eastAsia="es-AR"/>
+          <w14:ligatures w14:val="none"/>
+        </w:rPr>
+      </w:pPr>
+      <w:r>
+        <w:rPr>
+          <w:rFonts w:eastAsia="Times New Roman" w:cs="Times New Roman"/>
+          <w:kern w:val="0"/>
+          <w:lang w:val="en-US" w:eastAsia="es-AR"/>
+          <w14:ligatures w14:val="none"/>
+        </w:rPr>
+        <w:t xml:space="preserve">            </w:t>
+      </w:r>
+      <w:r>
+        <w:rPr>
+          <w:rFonts w:eastAsia="Times New Roman" w:cs="Times New Roman"/>
+          <w:kern w:val="0"/>
+          <w:lang w:eastAsia="es-AR"/>
+          <w14:ligatures w14:val="none"/>
+        </w:rPr>
+        <w:t>{</w:t>
+      </w:r>
+    </w:p>
+    <w:p>
+      <w:pPr>
+        <w:pStyle w:val="Prrafodelista"/>
+        <w:spacing w:before="100" w:beforeAutospacing="1" w:after="100" w:afterAutospacing="1" w:line="240" w:lineRule="auto"/>
+        <w:rPr>
+          <w:rFonts w:eastAsia="Times New Roman" w:cs="Times New Roman"/>
+          <w:kern w:val="0"/>
+          <w:lang w:eastAsia="es-AR"/>
+          <w14:ligatures w14:val="none"/>
+        </w:rPr>
+      </w:pPr>
+      <w:r>
+        <w:rPr>
+          <w:rFonts w:eastAsia="Times New Roman" w:cs="Times New Roman"/>
+          <w:kern w:val="0"/>
+          <w:lang w:eastAsia="es-AR"/>
+          <w14:ligatures w14:val="none"/>
+        </w:rPr>
+        <w:t xml:space="preserve">                // 3. Lo extraemos de la URL (viene como texto) y lo convertimos a número entero</w:t>
+      </w:r>
+    </w:p>
+    <w:p>
+      <w:pPr>
+        <w:pStyle w:val="Prrafodelista"/>
+        <w:spacing w:before="100" w:beforeAutospacing="1" w:after="100" w:afterAutospacing="1" w:line="240" w:lineRule="auto"/>
+        <w:rPr>
+          <w:rFonts w:eastAsia="Times New Roman" w:cs="Times New Roman"/>
+          <w:kern w:val="0"/>
+          <w:lang w:val="en-US" w:eastAsia="es-AR"/>
+          <w14:ligatures w14:val="none"/>
+        </w:rPr>
+      </w:pPr>
+      <w:r>
+        <w:rPr>
+          <w:rFonts w:eastAsia="Times New Roman" w:cs="Times New Roman"/>
+          <w:kern w:val="0"/>
+          <w:lang w:eastAsia="es-AR"/>
+          <w14:ligatures w14:val="none"/>
+        </w:rPr>
+        <w:t xml:space="preserve">                </w:t>
+      </w:r>
+      <w:r>
+        <w:rPr>
+          <w:rFonts w:eastAsia="Times New Roman" w:cs="Times New Roman"/>
+          <w:kern w:val="0"/>
+          <w:lang w:val="en-US" w:eastAsia="es-AR"/>
+          <w14:ligatures w14:val="none"/>
+        </w:rPr>
+        <w:t xml:space="preserve">int id = </w:t>
       </w:r>
       <w:proofErr w:type="spellStart"/>
       <w:proofErr w:type="gramStart"/>
       <w:r>
         <w:rPr>
-          <w:lang w:val="en-US"/>
-        </w:rPr>
-        <w:t>art.Nombre</w:t>
+          <w:rFonts w:eastAsia="Times New Roman" w:cs="Times New Roman"/>
+          <w:kern w:val="0"/>
+          <w:lang w:val="en-US" w:eastAsia="es-AR"/>
+          <w14:ligatures w14:val="none"/>
+        </w:rPr>
+        <w:t>int.Parse</w:t>
       </w:r>
       <w:proofErr w:type="spellEnd"/>
       <w:proofErr w:type="gramEnd"/>
       <w:r>
         <w:rPr>
-          <w:lang w:val="en-US"/>
-        </w:rPr>
-        <w:t xml:space="preserve"> %&gt;&lt;/h5&gt;</w:t>
-      </w:r>
-    </w:p>
-    <w:p>
-      <w:pPr>
-        <w:pStyle w:val="Prrafodelista"/>
-        <w:rPr>
-          <w:lang w:val="en-US"/>
-        </w:rPr>
-      </w:pPr>
-      <w:r>
-        <w:rPr>
-          <w:lang w:val="en-US"/>
-        </w:rPr>
-        <w:t xml:space="preserve">                        &lt;p class="card-text"&gt;&lt;%: </w:t>
+          <w:rFonts w:eastAsia="Times New Roman" w:cs="Times New Roman"/>
+          <w:kern w:val="0"/>
+          <w:lang w:val="en-US" w:eastAsia="es-AR"/>
+          <w14:ligatures w14:val="none"/>
+        </w:rPr>
+        <w:t>(</w:t>
+      </w:r>
+      <w:proofErr w:type="spellStart"/>
+      <w:r>
+        <w:rPr>
+          <w:rFonts w:eastAsia="Times New Roman" w:cs="Times New Roman"/>
+          <w:kern w:val="0"/>
+          <w:lang w:val="en-US" w:eastAsia="es-AR"/>
+          <w14:ligatures w14:val="none"/>
+        </w:rPr>
+        <w:t>Request.QueryString</w:t>
+      </w:r>
+      <w:proofErr w:type="spellEnd"/>
+      <w:r>
+        <w:rPr>
+          <w:rFonts w:eastAsia="Times New Roman" w:cs="Times New Roman"/>
+          <w:kern w:val="0"/>
+          <w:lang w:val="en-US" w:eastAsia="es-AR"/>
+          <w14:ligatures w14:val="none"/>
+        </w:rPr>
+        <w:t>["id"]);</w:t>
+      </w:r>
+    </w:p>
+    <w:p>
+      <w:pPr>
+        <w:pStyle w:val="Prrafodelista"/>
+        <w:spacing w:before="100" w:beforeAutospacing="1" w:after="100" w:afterAutospacing="1" w:line="240" w:lineRule="auto"/>
+        <w:rPr>
+          <w:rFonts w:eastAsia="Times New Roman" w:cs="Times New Roman"/>
+          <w:kern w:val="0"/>
+          <w:lang w:val="en-US" w:eastAsia="es-AR"/>
+          <w14:ligatures w14:val="none"/>
+        </w:rPr>
+      </w:pPr>
+    </w:p>
+    <w:p>
+      <w:pPr>
+        <w:pStyle w:val="Prrafodelista"/>
+        <w:spacing w:before="100" w:beforeAutospacing="1" w:after="100" w:afterAutospacing="1" w:line="240" w:lineRule="auto"/>
+        <w:rPr>
+          <w:rFonts w:eastAsia="Times New Roman" w:cs="Times New Roman"/>
+          <w:kern w:val="0"/>
+          <w:lang w:eastAsia="es-AR"/>
+          <w14:ligatures w14:val="none"/>
+        </w:rPr>
+      </w:pPr>
+      <w:r>
+        <w:rPr>
+          <w:rFonts w:eastAsia="Times New Roman" w:cs="Times New Roman"/>
+          <w:kern w:val="0"/>
+          <w:lang w:val="en-US" w:eastAsia="es-AR"/>
+          <w14:ligatures w14:val="none"/>
+        </w:rPr>
+        <w:t xml:space="preserve">                </w:t>
+      </w:r>
+      <w:r>
+        <w:rPr>
+          <w:rFonts w:eastAsia="Times New Roman" w:cs="Times New Roman"/>
+          <w:kern w:val="0"/>
+          <w:lang w:eastAsia="es-AR"/>
+          <w14:ligatures w14:val="none"/>
+        </w:rPr>
+        <w:t>// 4. Instanciamos el negocio para ir a buscar a la base de datos</w:t>
+      </w:r>
+    </w:p>
+    <w:p>
+      <w:pPr>
+        <w:pStyle w:val="Prrafodelista"/>
+        <w:spacing w:before="100" w:beforeAutospacing="1" w:after="100" w:afterAutospacing="1" w:line="240" w:lineRule="auto"/>
+        <w:rPr>
+          <w:rFonts w:eastAsia="Times New Roman" w:cs="Times New Roman"/>
+          <w:kern w:val="0"/>
+          <w:lang w:eastAsia="es-AR"/>
+          <w14:ligatures w14:val="none"/>
+        </w:rPr>
+      </w:pPr>
+      <w:r>
+        <w:rPr>
+          <w:rFonts w:eastAsia="Times New Roman" w:cs="Times New Roman"/>
+          <w:kern w:val="0"/>
+          <w:lang w:eastAsia="es-AR"/>
+          <w14:ligatures w14:val="none"/>
+        </w:rPr>
+        <w:t xml:space="preserve">                </w:t>
+      </w:r>
+      <w:proofErr w:type="spellStart"/>
+      <w:r>
+        <w:rPr>
+          <w:rFonts w:eastAsia="Times New Roman" w:cs="Times New Roman"/>
+          <w:kern w:val="0"/>
+          <w:lang w:eastAsia="es-AR"/>
+          <w14:ligatures w14:val="none"/>
+        </w:rPr>
+        <w:t>ArticuloNegocio</w:t>
+      </w:r>
+      <w:proofErr w:type="spellEnd"/>
+      <w:r>
+        <w:rPr>
+          <w:rFonts w:eastAsia="Times New Roman" w:cs="Times New Roman"/>
+          <w:kern w:val="0"/>
+          <w:lang w:eastAsia="es-AR"/>
+          <w14:ligatures w14:val="none"/>
+        </w:rPr>
+        <w:t xml:space="preserve"> negocio = new </w:t>
       </w:r>
       <w:proofErr w:type="spellStart"/>
       <w:proofErr w:type="gramStart"/>
       <w:r>
         <w:rPr>
-          <w:lang w:val="en-US"/>
-        </w:rPr>
-        <w:t>art.Descripcion</w:t>
-      </w:r>
-      <w:proofErr w:type="spellEnd"/>
+          <w:rFonts w:eastAsia="Times New Roman" w:cs="Times New Roman"/>
+          <w:kern w:val="0"/>
+          <w:lang w:eastAsia="es-AR"/>
+          <w14:ligatures w14:val="none"/>
+        </w:rPr>
+        <w:t>ArticuloNegocio</w:t>
+      </w:r>
+      <w:proofErr w:type="spellEnd"/>
+      <w:r>
+        <w:rPr>
+          <w:rFonts w:eastAsia="Times New Roman" w:cs="Times New Roman"/>
+          <w:kern w:val="0"/>
+          <w:lang w:eastAsia="es-AR"/>
+          <w14:ligatures w14:val="none"/>
+        </w:rPr>
+        <w:t>(</w:t>
+      </w:r>
       <w:proofErr w:type="gramEnd"/>
       <w:r>
         <w:rPr>
-          <w:lang w:val="en-US"/>
-        </w:rPr>
-        <w:t xml:space="preserve"> %&gt;&lt;/p&gt;</w:t>
-      </w:r>
-    </w:p>
-    <w:p>
-      <w:pPr>
-        <w:pStyle w:val="Prrafodelista"/>
-        <w:rPr>
-          <w:lang w:val="en-US"/>
-        </w:rPr>
-      </w:pPr>
-      <w:r>
-        <w:rPr>
-          <w:lang w:val="en-US"/>
-        </w:rPr>
-        <w:t xml:space="preserve">                        &lt;p class="card-text fs-5 text-success </w:t>
-      </w:r>
-      <w:proofErr w:type="spellStart"/>
-      <w:r>
-        <w:rPr>
-          <w:lang w:val="en-US"/>
-        </w:rPr>
-        <w:t>fw</w:t>
-      </w:r>
-      <w:proofErr w:type="spellEnd"/>
-      <w:r>
-        <w:rPr>
-          <w:lang w:val="en-US"/>
-        </w:rPr>
-        <w:t xml:space="preserve">-bold"&gt;$ &lt;%: </w:t>
-      </w:r>
-      <w:proofErr w:type="spellStart"/>
+          <w:rFonts w:eastAsia="Times New Roman" w:cs="Times New Roman"/>
+          <w:kern w:val="0"/>
+          <w:lang w:eastAsia="es-AR"/>
+          <w14:ligatures w14:val="none"/>
+        </w:rPr>
+        <w:t>);</w:t>
+      </w:r>
+    </w:p>
+    <w:p>
+      <w:pPr>
+        <w:pStyle w:val="Prrafodelista"/>
+        <w:spacing w:before="100" w:beforeAutospacing="1" w:after="100" w:afterAutospacing="1" w:line="240" w:lineRule="auto"/>
+        <w:rPr>
+          <w:rFonts w:eastAsia="Times New Roman" w:cs="Times New Roman"/>
+          <w:kern w:val="0"/>
+          <w:lang w:eastAsia="es-AR"/>
+          <w14:ligatures w14:val="none"/>
+        </w:rPr>
+      </w:pPr>
+      <w:r>
+        <w:rPr>
+          <w:rFonts w:eastAsia="Times New Roman" w:cs="Times New Roman"/>
+          <w:kern w:val="0"/>
+          <w:lang w:eastAsia="es-AR"/>
+          <w14:ligatures w14:val="none"/>
+        </w:rPr>
+        <w:t xml:space="preserve">                </w:t>
+      </w:r>
+    </w:p>
+    <w:p>
+      <w:pPr>
+        <w:pStyle w:val="Prrafodelista"/>
+        <w:spacing w:before="100" w:beforeAutospacing="1" w:after="100" w:afterAutospacing="1" w:line="240" w:lineRule="auto"/>
+        <w:rPr>
+          <w:rFonts w:eastAsia="Times New Roman" w:cs="Times New Roman"/>
+          <w:kern w:val="0"/>
+          <w:lang w:eastAsia="es-AR"/>
+          <w14:ligatures w14:val="none"/>
+        </w:rPr>
+      </w:pPr>
+      <w:r>
+        <w:rPr>
+          <w:rFonts w:eastAsia="Times New Roman" w:cs="Times New Roman"/>
+          <w:kern w:val="0"/>
+          <w:lang w:eastAsia="es-AR"/>
+          <w14:ligatures w14:val="none"/>
+        </w:rPr>
+        <w:t xml:space="preserve">                // 5. Traemos todos los artículos y usamos el método de </w:t>
+      </w:r>
       <w:proofErr w:type="gramStart"/>
       <w:r>
         <w:rPr>
-          <w:lang w:val="en-US"/>
-        </w:rPr>
-        <w:t>art.Precio</w:t>
+          <w:rFonts w:eastAsia="Times New Roman" w:cs="Times New Roman"/>
+          <w:kern w:val="0"/>
+          <w:lang w:eastAsia="es-AR"/>
+          <w14:ligatures w14:val="none"/>
+        </w:rPr>
+        <w:t>C# .</w:t>
+      </w:r>
+      <w:proofErr w:type="spellStart"/>
+      <w:r>
+        <w:rPr>
+          <w:rFonts w:eastAsia="Times New Roman" w:cs="Times New Roman"/>
+          <w:kern w:val="0"/>
+          <w:lang w:eastAsia="es-AR"/>
+          <w14:ligatures w14:val="none"/>
+        </w:rPr>
+        <w:t>Find</w:t>
       </w:r>
       <w:proofErr w:type="spellEnd"/>
       <w:proofErr w:type="gramEnd"/>
       <w:r>
         <w:rPr>
-          <w:lang w:val="en-US"/>
-        </w:rPr>
-        <w:t xml:space="preserve"> %&gt;&lt;/p&gt;</w:t>
-      </w:r>
-    </w:p>
-    <w:p>
-      <w:pPr>
-        <w:pStyle w:val="Prrafodelista"/>
-        <w:rPr>
-          <w:lang w:val="en-US"/>
-        </w:rPr>
-      </w:pPr>
-      <w:r>
-        <w:rPr>
-          <w:lang w:val="en-US"/>
-        </w:rPr>
-        <w:t xml:space="preserve">                        </w:t>
-      </w:r>
-    </w:p>
-    <w:p>
-      <w:pPr>
-        <w:pStyle w:val="Prrafodelista"/>
-      </w:pPr>
-      <w:r>
-        <w:rPr>
-          <w:lang w:val="en-US"/>
-        </w:rPr>
-        <w:t xml:space="preserve">                        </w:t>
-      </w:r>
-      <w:r>
-        <w:t>&lt;%-- Botón que nos llevará a la futura pantalla de detalle --%&gt;</w:t>
-      </w:r>
-    </w:p>
-    <w:p>
-      <w:pPr>
-        <w:pStyle w:val="Prrafodelista"/>
-      </w:pPr>
-      <w:r>
-        <w:t xml:space="preserve">                        &lt;a </w:t>
-      </w:r>
-      <w:proofErr w:type="spellStart"/>
-      <w:r>
-        <w:t>href</w:t>
-      </w:r>
-      <w:proofErr w:type="spellEnd"/>
-      <w:r>
-        <w:t>="</w:t>
-      </w:r>
-      <w:proofErr w:type="spellStart"/>
-      <w:r>
-        <w:t>Detalle.aspx?id</w:t>
-      </w:r>
-      <w:proofErr w:type="spellEnd"/>
-      <w:r>
-        <w:t xml:space="preserve">=&lt;%: </w:t>
+          <w:rFonts w:eastAsia="Times New Roman" w:cs="Times New Roman"/>
+          <w:kern w:val="0"/>
+          <w:lang w:eastAsia="es-AR"/>
+          <w14:ligatures w14:val="none"/>
+        </w:rPr>
+        <w:t xml:space="preserve">() para encontrar </w:t>
+      </w:r>
+    </w:p>
+    <w:p>
+      <w:pPr>
+        <w:pStyle w:val="Prrafodelista"/>
+        <w:spacing w:before="100" w:beforeAutospacing="1" w:after="100" w:afterAutospacing="1" w:line="240" w:lineRule="auto"/>
+        <w:rPr>
+          <w:rFonts w:eastAsia="Times New Roman" w:cs="Times New Roman"/>
+          <w:kern w:val="0"/>
+          <w:lang w:eastAsia="es-AR"/>
+          <w14:ligatures w14:val="none"/>
+        </w:rPr>
+      </w:pPr>
+      <w:r>
+        <w:rPr>
+          <w:rFonts w:eastAsia="Times New Roman" w:cs="Times New Roman"/>
+          <w:kern w:val="0"/>
+          <w:lang w:eastAsia="es-AR"/>
+          <w14:ligatures w14:val="none"/>
+        </w:rPr>
+        <w:t xml:space="preserve">                // exactamente el que tenga el Id igual al de la URL (Expresión Lambda).</w:t>
+      </w:r>
+    </w:p>
+    <w:p>
+      <w:pPr>
+        <w:pStyle w:val="Prrafodelista"/>
+        <w:spacing w:before="100" w:beforeAutospacing="1" w:after="100" w:afterAutospacing="1" w:line="240" w:lineRule="auto"/>
+        <w:rPr>
+          <w:rFonts w:eastAsia="Times New Roman" w:cs="Times New Roman"/>
+          <w:kern w:val="0"/>
+          <w:lang w:eastAsia="es-AR"/>
+          <w14:ligatures w14:val="none"/>
+        </w:rPr>
+      </w:pPr>
+      <w:r>
+        <w:rPr>
+          <w:rFonts w:eastAsia="Times New Roman" w:cs="Times New Roman"/>
+          <w:kern w:val="0"/>
+          <w:lang w:eastAsia="es-AR"/>
+          <w14:ligatures w14:val="none"/>
+        </w:rPr>
+        <w:t xml:space="preserve">                </w:t>
+      </w:r>
+      <w:proofErr w:type="spellStart"/>
+      <w:r>
+        <w:rPr>
+          <w:rFonts w:eastAsia="Times New Roman" w:cs="Times New Roman"/>
+          <w:kern w:val="0"/>
+          <w:lang w:eastAsia="es-AR"/>
+          <w14:ligatures w14:val="none"/>
+        </w:rPr>
+        <w:t>ArticuloSeleccionado</w:t>
+      </w:r>
+      <w:proofErr w:type="spellEnd"/>
+      <w:r>
+        <w:rPr>
+          <w:rFonts w:eastAsia="Times New Roman" w:cs="Times New Roman"/>
+          <w:kern w:val="0"/>
+          <w:lang w:eastAsia="es-AR"/>
+          <w14:ligatures w14:val="none"/>
+        </w:rPr>
+        <w:t xml:space="preserve"> = </w:t>
       </w:r>
       <w:proofErr w:type="spellStart"/>
       <w:proofErr w:type="gramStart"/>
       <w:r>
-        <w:t>art.Id</w:t>
+        <w:rPr>
+          <w:rFonts w:eastAsia="Times New Roman" w:cs="Times New Roman"/>
+          <w:kern w:val="0"/>
+          <w:lang w:eastAsia="es-AR"/>
+          <w14:ligatures w14:val="none"/>
+        </w:rPr>
+        <w:t>negocio.Listar</w:t>
       </w:r>
       <w:proofErr w:type="spellEnd"/>
       <w:proofErr w:type="gramEnd"/>
       <w:r>
-        <w:t xml:space="preserve"> %&gt;" </w:t>
-      </w:r>
-      <w:proofErr w:type="spellStart"/>
-      <w:r>
-        <w:t>class</w:t>
-      </w:r>
-      <w:proofErr w:type="spellEnd"/>
-      <w:r>
-        <w:t>="</w:t>
-      </w:r>
-      <w:proofErr w:type="spellStart"/>
-      <w:r>
-        <w:t>btn</w:t>
-      </w:r>
-      <w:proofErr w:type="spellEnd"/>
-      <w:r>
-        <w:t xml:space="preserve"> </w:t>
-      </w:r>
-      <w:proofErr w:type="spellStart"/>
-      <w:r>
-        <w:t>btn-primary</w:t>
-      </w:r>
-      <w:proofErr w:type="spellEnd"/>
-      <w:r>
-        <w:t>"&gt;Ver Detalles&lt;/a&gt;</w:t>
-      </w:r>
-    </w:p>
-    <w:p>
-      <w:pPr>
-        <w:pStyle w:val="Prrafodelista"/>
-      </w:pPr>
-      <w:r>
-        <w:t xml:space="preserve">                    &lt;/</w:t>
-      </w:r>
-      <w:proofErr w:type="spellStart"/>
-      <w:r>
-        <w:t>div</w:t>
-      </w:r>
-      <w:proofErr w:type="spellEnd"/>
-      <w:r>
-        <w:t>&gt;</w:t>
-      </w:r>
-    </w:p>
-    <w:p>
-      <w:pPr>
-        <w:pStyle w:val="Prrafodelista"/>
-      </w:pPr>
-      <w:r>
-        <w:t xml:space="preserve">                &lt;/</w:t>
-      </w:r>
-      <w:proofErr w:type="spellStart"/>
-      <w:r>
-        <w:t>div</w:t>
-      </w:r>
-      <w:proofErr w:type="spellEnd"/>
-      <w:r>
-        <w:t>&gt;</w:t>
-      </w:r>
-    </w:p>
-    <w:p>
-      <w:pPr>
-        <w:pStyle w:val="Prrafodelista"/>
-      </w:pPr>
-      <w:r>
-        <w:t xml:space="preserve">            &lt;/</w:t>
-      </w:r>
-      <w:proofErr w:type="spellStart"/>
-      <w:r>
-        <w:t>div</w:t>
-      </w:r>
-      <w:proofErr w:type="spellEnd"/>
-      <w:r>
-        <w:t>&gt;</w:t>
-      </w:r>
-    </w:p>
-    <w:p>
-      <w:pPr>
-        <w:pStyle w:val="Prrafodelista"/>
-      </w:pPr>
-    </w:p>
-    <w:p>
-      <w:pPr>
-        <w:pStyle w:val="Prrafodelista"/>
-      </w:pPr>
-      <w:r>
-        <w:t xml:space="preserve">        &lt;% } %&gt;</w:t>
-      </w:r>
-    </w:p>
-    <w:p>
-      <w:pPr>
-        <w:pStyle w:val="Prrafodelista"/>
-      </w:pPr>
-    </w:p>
-    <w:p>
-      <w:pPr>
-        <w:pStyle w:val="Prrafodelista"/>
-      </w:pPr>
-      <w:r>
-        <w:t xml:space="preserve">    &lt;/</w:t>
-      </w:r>
-      <w:proofErr w:type="spellStart"/>
-      <w:r>
-        <w:t>div</w:t>
-      </w:r>
-      <w:proofErr w:type="spellEnd"/>
-      <w:r>
-        <w:t>&gt;</w:t>
-      </w:r>
-    </w:p>
-    <w:p>
-      <w:pPr>
-        <w:pStyle w:val="Prrafodelista"/>
-      </w:pPr>
-    </w:p>
-    <w:p>
-      <w:pPr>
-        <w:pStyle w:val="Prrafodelista"/>
-      </w:pPr>
-      <w:r>
-        <w:t>&lt;/</w:t>
-      </w:r>
-      <w:proofErr w:type="spellStart"/>
-      <w:proofErr w:type="gramStart"/>
-      <w:r>
-        <w:t>asp:Content</w:t>
-      </w:r>
-      <w:proofErr w:type="spellEnd"/>
-      <w:proofErr w:type="gramEnd"/>
-      <w:r>
-        <w:t>&gt;</w:t>
-      </w:r>
+        <w:rPr>
+          <w:rFonts w:eastAsia="Times New Roman" w:cs="Times New Roman"/>
+          <w:kern w:val="0"/>
+          <w:lang w:eastAsia="es-AR"/>
+          <w14:ligatures w14:val="none"/>
+        </w:rPr>
+        <w:t>().</w:t>
+      </w:r>
+      <w:proofErr w:type="spellStart"/>
+      <w:r>
+        <w:rPr>
+          <w:rFonts w:eastAsia="Times New Roman" w:cs="Times New Roman"/>
+          <w:kern w:val="0"/>
+          <w:lang w:eastAsia="es-AR"/>
+          <w14:ligatures w14:val="none"/>
+        </w:rPr>
+        <w:t>Find</w:t>
+      </w:r>
+      <w:proofErr w:type="spellEnd"/>
+      <w:r>
+        <w:rPr>
+          <w:rFonts w:eastAsia="Times New Roman" w:cs="Times New Roman"/>
+          <w:kern w:val="0"/>
+          <w:lang w:eastAsia="es-AR"/>
+          <w14:ligatures w14:val="none"/>
+        </w:rPr>
+        <w:t xml:space="preserve">(x =&gt; </w:t>
+      </w:r>
+      <w:proofErr w:type="spellStart"/>
+      <w:r>
+        <w:rPr>
+          <w:rFonts w:eastAsia="Times New Roman" w:cs="Times New Roman"/>
+          <w:kern w:val="0"/>
+          <w:lang w:eastAsia="es-AR"/>
+          <w14:ligatures w14:val="none"/>
+        </w:rPr>
+        <w:t>x.Id</w:t>
+      </w:r>
+      <w:proofErr w:type="spellEnd"/>
+      <w:r>
+        <w:rPr>
+          <w:rFonts w:eastAsia="Times New Roman" w:cs="Times New Roman"/>
+          <w:kern w:val="0"/>
+          <w:lang w:eastAsia="es-AR"/>
+          <w14:ligatures w14:val="none"/>
+        </w:rPr>
+        <w:t xml:space="preserve"> == id);</w:t>
+      </w:r>
+    </w:p>
+    <w:p>
+      <w:pPr>
+        <w:pStyle w:val="Prrafodelista"/>
+        <w:spacing w:before="100" w:beforeAutospacing="1" w:after="100" w:afterAutospacing="1" w:line="240" w:lineRule="auto"/>
+        <w:rPr>
+          <w:rFonts w:eastAsia="Times New Roman" w:cs="Times New Roman"/>
+          <w:kern w:val="0"/>
+          <w:lang w:eastAsia="es-AR"/>
+          <w14:ligatures w14:val="none"/>
+        </w:rPr>
+      </w:pPr>
+      <w:r>
+        <w:rPr>
+          <w:rFonts w:eastAsia="Times New Roman" w:cs="Times New Roman"/>
+          <w:kern w:val="0"/>
+          <w:lang w:eastAsia="es-AR"/>
+          <w14:ligatures w14:val="none"/>
+        </w:rPr>
+        <w:t xml:space="preserve">            }</w:t>
+      </w:r>
+    </w:p>
+    <w:p>
+      <w:pPr>
+        <w:pStyle w:val="Prrafodelista"/>
+        <w:spacing w:before="100" w:beforeAutospacing="1" w:after="100" w:afterAutospacing="1" w:line="240" w:lineRule="auto"/>
+        <w:rPr>
+          <w:rFonts w:eastAsia="Times New Roman" w:cs="Times New Roman"/>
+          <w:kern w:val="0"/>
+          <w:lang w:eastAsia="es-AR"/>
+          <w14:ligatures w14:val="none"/>
+        </w:rPr>
+      </w:pPr>
+      <w:r>
+        <w:rPr>
+          <w:rFonts w:eastAsia="Times New Roman" w:cs="Times New Roman"/>
+          <w:kern w:val="0"/>
+          <w:lang w:eastAsia="es-AR"/>
+          <w14:ligatures w14:val="none"/>
+        </w:rPr>
+        <w:t xml:space="preserve">        }</w:t>
+      </w:r>
+    </w:p>
+    <w:p>
+      <w:pPr>
+        <w:pStyle w:val="Prrafodelista"/>
+        <w:spacing w:before="100" w:beforeAutospacing="1" w:after="100" w:afterAutospacing="1" w:line="240" w:lineRule="auto"/>
+        <w:rPr>
+          <w:rFonts w:eastAsia="Times New Roman" w:cs="Times New Roman"/>
+          <w:kern w:val="0"/>
+          <w:lang w:eastAsia="es-AR"/>
+          <w14:ligatures w14:val="none"/>
+        </w:rPr>
+      </w:pPr>
+      <w:r>
+        <w:rPr>
+          <w:rFonts w:eastAsia="Times New Roman" w:cs="Times New Roman"/>
+          <w:kern w:val="0"/>
+          <w:lang w:eastAsia="es-AR"/>
+          <w14:ligatures w14:val="none"/>
+        </w:rPr>
+        <w:t xml:space="preserve">    }</w:t>
+      </w:r>
+    </w:p>
+    <w:p>
+      <w:pPr>
+        <w:pStyle w:val="Prrafodelista"/>
+        <w:spacing w:before="100" w:beforeAutospacing="1" w:after="100" w:afterAutospacing="1" w:line="240" w:lineRule="auto"/>
+        <w:rPr>
+          <w:rFonts w:eastAsia="Times New Roman" w:cs="Times New Roman"/>
+          <w:kern w:val="0"/>
+          <w:lang w:eastAsia="es-AR"/>
+          <w14:ligatures w14:val="none"/>
+        </w:rPr>
+      </w:pPr>
+      <w:r>
+        <w:rPr>
+          <w:rFonts w:eastAsia="Times New Roman" w:cs="Times New Roman"/>
+          <w:kern w:val="0"/>
+          <w:lang w:eastAsia="es-AR"/>
+          <w14:ligatures w14:val="none"/>
+        </w:rPr>
+        <w:t>}</w:t>
+      </w:r>
+    </w:p>
+    <w:p>
+      <w:pPr>
+        <w:pStyle w:val="Prrafodelista"/>
+        <w:spacing w:before="100" w:beforeAutospacing="1" w:after="100" w:afterAutospacing="1" w:line="240" w:lineRule="auto"/>
+        <w:rPr>
+          <w:rFonts w:eastAsia="Times New Roman" w:cs="Times New Roman"/>
+          <w:kern w:val="0"/>
+          <w:lang w:eastAsia="es-AR"/>
+          <w14:ligatures w14:val="none"/>
+        </w:rPr>
+      </w:pPr>
+    </w:p>
+    <w:p>
+      <w:pPr>
+        <w:pStyle w:val="Prrafodelista"/>
+        <w:rPr>
+          <w:rFonts w:eastAsia="Times New Roman" w:cs="Times New Roman"/>
+          <w:b/>
+          <w:bCs/>
+          <w:kern w:val="0"/>
+          <w:lang w:eastAsia="es-AR"/>
+          <w14:ligatures w14:val="none"/>
+        </w:rPr>
+      </w:pPr>
+      <w:r>
+        <w:rPr>
+          <w:rFonts w:eastAsia="Times New Roman" w:cs="Times New Roman"/>
+          <w:b/>
+          <w:bCs/>
+          <w:kern w:val="0"/>
+          <w:lang w:eastAsia="es-AR"/>
+          <w14:ligatures w14:val="none"/>
+        </w:rPr>
+        <w:t>Maquetar el Detalle Visual (Detalle.aspx)</w:t>
+      </w:r>
+    </w:p>
+    <w:p>
+      <w:pPr>
+        <w:pStyle w:val="Prrafodelista"/>
+        <w:rPr>
+          <w:rFonts w:eastAsia="Times New Roman" w:cs="Times New Roman"/>
+          <w:kern w:val="0"/>
+          <w:lang w:eastAsia="es-AR"/>
+          <w14:ligatures w14:val="none"/>
+        </w:rPr>
+      </w:pPr>
+      <w:r>
+        <w:rPr>
+          <w:rFonts w:eastAsia="Times New Roman" w:cs="Times New Roman"/>
+          <w:kern w:val="0"/>
+          <w:lang w:eastAsia="es-AR"/>
+          <w14:ligatures w14:val="none"/>
+        </w:rPr>
+        <w:t>Ahora que el servidor ya tiene el artículo en la mano (o no, en caso de que alguien haya entrado por error), vamos a decirle a Bootstrap que dibuje dos columnas: una para la foto gigante y otra para todos los datos detallados.</w:t>
+      </w:r>
+    </w:p>
+    <w:p>
+      <w:pPr>
+        <w:pStyle w:val="Prrafodelista"/>
+        <w:rPr>
+          <w:rFonts w:eastAsia="Times New Roman" w:cs="Times New Roman"/>
+          <w:kern w:val="0"/>
+          <w:lang w:eastAsia="es-AR"/>
+          <w14:ligatures w14:val="none"/>
+        </w:rPr>
+      </w:pPr>
+    </w:p>
+    <w:p>
+      <w:pPr>
+        <w:pStyle w:val="Prrafodelista"/>
+        <w:rPr>
+          <w:rFonts w:eastAsia="Times New Roman" w:cs="Times New Roman"/>
+          <w:kern w:val="0"/>
+          <w:lang w:eastAsia="es-AR"/>
+          <w14:ligatures w14:val="none"/>
+        </w:rPr>
+      </w:pPr>
+    </w:p>
+    <w:p>
+      <w:pPr>
+        <w:pStyle w:val="Prrafodelista"/>
+        <w:spacing w:before="100" w:beforeAutospacing="1" w:after="100" w:afterAutospacing="1" w:line="240" w:lineRule="auto"/>
+        <w:rPr>
+          <w:rFonts w:eastAsia="Times New Roman" w:cs="Times New Roman"/>
+          <w:kern w:val="0"/>
+          <w:lang w:eastAsia="es-AR"/>
+          <w14:ligatures w14:val="none"/>
+        </w:rPr>
+      </w:pPr>
+    </w:p>
+    <w:p/>
+    <w:p/>
+    <w:p>
+      <w:pPr>
+        <w:pStyle w:val="Prrafodelista"/>
+      </w:pPr>
     </w:p>
     <w:p>
       <w:pPr>
@@ -4458,6 +6447,123 @@
 <file path=word/numbering.xml><?xml version="1.0" encoding="utf-8"?>
 <w:numbering xmlns:wpc="http://schemas.microsoft.com/office/word/2010/wordprocessingCanvas" xmlns:cx="http://schemas.microsoft.com/office/drawing/2014/chartex" xmlns:cx1="http://schemas.microsoft.com/office/drawing/2015/9/8/chartex" xmlns:cx2="http://schemas.microsoft.com/office/drawing/2015/10/21/chartex" xmlns:cx3="http://schemas.microsoft.com/office/drawing/2016/5/9/chartex" xmlns:cx4="http://schemas.microsoft.com/office/drawing/2016/5/10/chartex" xmlns:cx5="http://schemas.microsoft.com/office/drawing/2016/5/11/chartex" xmlns:cx6="http://schemas.microsoft.com/office/drawing/2016/5/12/chartex" xmlns:cx7="http://schemas.microsoft.com/office/drawing/2016/5/13/chartex" xmlns:cx8="http://schemas.microsoft.com/office/drawing/2016/5/14/chartex" xmlns:mc="http://schemas.openxmlformats.org/markup-compatibility/2006" xmlns:aink="http://schemas.microsoft.com/office/drawing/2016/ink" xmlns:am3d="http://schemas.microsoft.com/office/drawing/2017/model3d" xmlns:o="urn:schemas-microsoft-com:office:office" xmlns:oel="http://schemas.microsoft.com/office/2019/extlst" xmlns:r="http://schemas.openxmlformats.org/officeDocument/2006/relationships" xmlns:m="http://schemas.openxmlformats.org/officeDocument/2006/math" xmlns:v="urn:schemas-microsoft-com:vml" xmlns:wp14="http://schemas.microsoft.com/office/word/2010/wordprocessingDrawing" xmlns:wp="http://schemas.openxmlformats.org/drawingml/2006/wordprocessingDrawing" xmlns:w10="urn:schemas-microsoft-com:office:word" xmlns:w="http://schemas.openxmlformats.org/wordprocessingml/2006/main" xmlns:w14="http://schemas.microsoft.com/office/word/2010/wordml" xmlns:w15="http://schemas.microsoft.com/office/word/2012/wordml" xmlns:w16cex="http://schemas.microsoft.com/office/word/2018/wordml/cex" xmlns:w16cid="http://schemas.microsoft.com/office/word/2016/wordml/cid" xmlns:w16="http://schemas.microsoft.com/office/word/2018/wordml" xmlns:w16sdtdh="http://schemas.microsoft.com/office/word/2020/wordml/sdtdatahash" xmlns:w16se="http://schemas.microsoft.com/office/word/2015/wordml/symex" xmlns:wpg="http://schemas.microsoft.com/office/word/2010/wordprocessingGroup" xmlns:wpi="http://schemas.microsoft.com/office/word/2010/wordprocessingInk" xmlns:wne="http://schemas.microsoft.com/office/word/2006/wordml" xmlns:wps="http://schemas.microsoft.com/office/word/2010/wordprocessingShape" mc:Ignorable="w14 w15 w16se w16cid w16 w16cex w16sdtdh wp14">
   <w:abstractNum w:abstractNumId="0" w15:restartNumberingAfterBreak="0">
+    <w:nsid w:val="03CC6B1F"/>
+    <w:multiLevelType w:val="multilevel"/>
+    <w:tmpl w:val="B8CC1624"/>
+    <w:lvl w:ilvl="0">
+      <w:start w:val="1"/>
+      <w:numFmt w:val="decimal"/>
+      <w:lvlText w:val="%1."/>
+      <w:lvlJc w:val="left"/>
+      <w:pPr>
+        <w:tabs>
+          <w:tab w:val="num" w:pos="720"/>
+        </w:tabs>
+        <w:ind w:left="720" w:hanging="360"/>
+      </w:pPr>
+    </w:lvl>
+    <w:lvl w:ilvl="1">
+      <w:start w:val="1"/>
+      <w:numFmt w:val="bullet"/>
+      <w:lvlText w:val="o"/>
+      <w:lvlJc w:val="left"/>
+      <w:pPr>
+        <w:tabs>
+          <w:tab w:val="num" w:pos="1440"/>
+        </w:tabs>
+        <w:ind w:left="1440" w:hanging="360"/>
+      </w:pPr>
+      <w:rPr>
+        <w:rFonts w:ascii="Courier New" w:hAnsi="Courier New" w:hint="default"/>
+        <w:sz w:val="20"/>
+      </w:rPr>
+    </w:lvl>
+    <w:lvl w:ilvl="2" w:tentative="1">
+      <w:start w:val="1"/>
+      <w:numFmt w:val="decimal"/>
+      <w:lvlText w:val="%3."/>
+      <w:lvlJc w:val="left"/>
+      <w:pPr>
+        <w:tabs>
+          <w:tab w:val="num" w:pos="2160"/>
+        </w:tabs>
+        <w:ind w:left="2160" w:hanging="360"/>
+      </w:pPr>
+    </w:lvl>
+    <w:lvl w:ilvl="3" w:tentative="1">
+      <w:start w:val="1"/>
+      <w:numFmt w:val="decimal"/>
+      <w:lvlText w:val="%4."/>
+      <w:lvlJc w:val="left"/>
+      <w:pPr>
+        <w:tabs>
+          <w:tab w:val="num" w:pos="2880"/>
+        </w:tabs>
+        <w:ind w:left="2880" w:hanging="360"/>
+      </w:pPr>
+    </w:lvl>
+    <w:lvl w:ilvl="4" w:tentative="1">
+      <w:start w:val="1"/>
+      <w:numFmt w:val="decimal"/>
+      <w:lvlText w:val="%5."/>
+      <w:lvlJc w:val="left"/>
+      <w:pPr>
+        <w:tabs>
+          <w:tab w:val="num" w:pos="3600"/>
+        </w:tabs>
+        <w:ind w:left="3600" w:hanging="360"/>
+      </w:pPr>
+    </w:lvl>
+    <w:lvl w:ilvl="5" w:tentative="1">
+      <w:start w:val="1"/>
+      <w:numFmt w:val="decimal"/>
+      <w:lvlText w:val="%6."/>
+      <w:lvlJc w:val="left"/>
+      <w:pPr>
+        <w:tabs>
+          <w:tab w:val="num" w:pos="4320"/>
+        </w:tabs>
+        <w:ind w:left="4320" w:hanging="360"/>
+      </w:pPr>
+    </w:lvl>
+    <w:lvl w:ilvl="6" w:tentative="1">
+      <w:start w:val="1"/>
+      <w:numFmt w:val="decimal"/>
+      <w:lvlText w:val="%7."/>
+      <w:lvlJc w:val="left"/>
+      <w:pPr>
+        <w:tabs>
+          <w:tab w:val="num" w:pos="5040"/>
+        </w:tabs>
+        <w:ind w:left="5040" w:hanging="360"/>
+      </w:pPr>
+    </w:lvl>
+    <w:lvl w:ilvl="7" w:tentative="1">
+      <w:start w:val="1"/>
+      <w:numFmt w:val="decimal"/>
+      <w:lvlText w:val="%8."/>
+      <w:lvlJc w:val="left"/>
+      <w:pPr>
+        <w:tabs>
+          <w:tab w:val="num" w:pos="5760"/>
+        </w:tabs>
+        <w:ind w:left="5760" w:hanging="360"/>
+      </w:pPr>
+    </w:lvl>
+    <w:lvl w:ilvl="8" w:tentative="1">
+      <w:start w:val="1"/>
+      <w:numFmt w:val="decimal"/>
+      <w:lvlText w:val="%9."/>
+      <w:lvlJc w:val="left"/>
+      <w:pPr>
+        <w:tabs>
+          <w:tab w:val="num" w:pos="6480"/>
+        </w:tabs>
+        <w:ind w:left="6480" w:hanging="360"/>
+      </w:pPr>
+    </w:lvl>
+  </w:abstractNum>
+  <w:abstractNum w:abstractNumId="1" w15:restartNumberingAfterBreak="0">
     <w:nsid w:val="07F31939"/>
     <w:multiLevelType w:val="multilevel"/>
     <w:tmpl w:val="A77817FA"/>
@@ -4606,7 +6712,120 @@
       </w:rPr>
     </w:lvl>
   </w:abstractNum>
-  <w:abstractNum w:abstractNumId="1" w15:restartNumberingAfterBreak="0">
+  <w:abstractNum w:abstractNumId="2" w15:restartNumberingAfterBreak="0">
+    <w:nsid w:val="08376455"/>
+    <w:multiLevelType w:val="multilevel"/>
+    <w:tmpl w:val="B8562AB8"/>
+    <w:lvl w:ilvl="0">
+      <w:start w:val="1"/>
+      <w:numFmt w:val="decimal"/>
+      <w:lvlText w:val="%1."/>
+      <w:lvlJc w:val="left"/>
+      <w:pPr>
+        <w:tabs>
+          <w:tab w:val="num" w:pos="720"/>
+        </w:tabs>
+        <w:ind w:left="720" w:hanging="360"/>
+      </w:pPr>
+    </w:lvl>
+    <w:lvl w:ilvl="1" w:tentative="1">
+      <w:start w:val="1"/>
+      <w:numFmt w:val="decimal"/>
+      <w:lvlText w:val="%2."/>
+      <w:lvlJc w:val="left"/>
+      <w:pPr>
+        <w:tabs>
+          <w:tab w:val="num" w:pos="1440"/>
+        </w:tabs>
+        <w:ind w:left="1440" w:hanging="360"/>
+      </w:pPr>
+    </w:lvl>
+    <w:lvl w:ilvl="2" w:tentative="1">
+      <w:start w:val="1"/>
+      <w:numFmt w:val="decimal"/>
+      <w:lvlText w:val="%3."/>
+      <w:lvlJc w:val="left"/>
+      <w:pPr>
+        <w:tabs>
+          <w:tab w:val="num" w:pos="2160"/>
+        </w:tabs>
+        <w:ind w:left="2160" w:hanging="360"/>
+      </w:pPr>
+    </w:lvl>
+    <w:lvl w:ilvl="3" w:tentative="1">
+      <w:start w:val="1"/>
+      <w:numFmt w:val="decimal"/>
+      <w:lvlText w:val="%4."/>
+      <w:lvlJc w:val="left"/>
+      <w:pPr>
+        <w:tabs>
+          <w:tab w:val="num" w:pos="2880"/>
+        </w:tabs>
+        <w:ind w:left="2880" w:hanging="360"/>
+      </w:pPr>
+    </w:lvl>
+    <w:lvl w:ilvl="4" w:tentative="1">
+      <w:start w:val="1"/>
+      <w:numFmt w:val="decimal"/>
+      <w:lvlText w:val="%5."/>
+      <w:lvlJc w:val="left"/>
+      <w:pPr>
+        <w:tabs>
+          <w:tab w:val="num" w:pos="3600"/>
+        </w:tabs>
+        <w:ind w:left="3600" w:hanging="360"/>
+      </w:pPr>
+    </w:lvl>
+    <w:lvl w:ilvl="5" w:tentative="1">
+      <w:start w:val="1"/>
+      <w:numFmt w:val="decimal"/>
+      <w:lvlText w:val="%6."/>
+      <w:lvlJc w:val="left"/>
+      <w:pPr>
+        <w:tabs>
+          <w:tab w:val="num" w:pos="4320"/>
+        </w:tabs>
+        <w:ind w:left="4320" w:hanging="360"/>
+      </w:pPr>
+    </w:lvl>
+    <w:lvl w:ilvl="6" w:tentative="1">
+      <w:start w:val="1"/>
+      <w:numFmt w:val="decimal"/>
+      <w:lvlText w:val="%7."/>
+      <w:lvlJc w:val="left"/>
+      <w:pPr>
+        <w:tabs>
+          <w:tab w:val="num" w:pos="5040"/>
+        </w:tabs>
+        <w:ind w:left="5040" w:hanging="360"/>
+      </w:pPr>
+    </w:lvl>
+    <w:lvl w:ilvl="7" w:tentative="1">
+      <w:start w:val="1"/>
+      <w:numFmt w:val="decimal"/>
+      <w:lvlText w:val="%8."/>
+      <w:lvlJc w:val="left"/>
+      <w:pPr>
+        <w:tabs>
+          <w:tab w:val="num" w:pos="5760"/>
+        </w:tabs>
+        <w:ind w:left="5760" w:hanging="360"/>
+      </w:pPr>
+    </w:lvl>
+    <w:lvl w:ilvl="8" w:tentative="1">
+      <w:start w:val="1"/>
+      <w:numFmt w:val="decimal"/>
+      <w:lvlText w:val="%9."/>
+      <w:lvlJc w:val="left"/>
+      <w:pPr>
+        <w:tabs>
+          <w:tab w:val="num" w:pos="6480"/>
+        </w:tabs>
+        <w:ind w:left="6480" w:hanging="360"/>
+      </w:pPr>
+    </w:lvl>
+  </w:abstractNum>
+  <w:abstractNum w:abstractNumId="3" w15:restartNumberingAfterBreak="0">
     <w:nsid w:val="0B1E2D4A"/>
     <w:multiLevelType w:val="multilevel"/>
     <w:tmpl w:val="4E6CFB3C"/>
@@ -4719,7 +6938,7 @@
       </w:pPr>
     </w:lvl>
   </w:abstractNum>
-  <w:abstractNum w:abstractNumId="2" w15:restartNumberingAfterBreak="0">
+  <w:abstractNum w:abstractNumId="4" w15:restartNumberingAfterBreak="0">
     <w:nsid w:val="1C441FC6"/>
     <w:multiLevelType w:val="multilevel"/>
     <w:tmpl w:val="3138A190"/>
@@ -4868,7 +7087,156 @@
       </w:rPr>
     </w:lvl>
   </w:abstractNum>
-  <w:abstractNum w:abstractNumId="3" w15:restartNumberingAfterBreak="0">
+  <w:abstractNum w:abstractNumId="5" w15:restartNumberingAfterBreak="0">
+    <w:nsid w:val="228B648B"/>
+    <w:multiLevelType w:val="multilevel"/>
+    <w:tmpl w:val="C422098E"/>
+    <w:lvl w:ilvl="0">
+      <w:start w:val="1"/>
+      <w:numFmt w:val="bullet"/>
+      <w:lvlText w:val=""/>
+      <w:lvlJc w:val="left"/>
+      <w:pPr>
+        <w:tabs>
+          <w:tab w:val="num" w:pos="720"/>
+        </w:tabs>
+        <w:ind w:left="720" w:hanging="360"/>
+      </w:pPr>
+      <w:rPr>
+        <w:rFonts w:ascii="Symbol" w:hAnsi="Symbol" w:hint="default"/>
+        <w:sz w:val="20"/>
+      </w:rPr>
+    </w:lvl>
+    <w:lvl w:ilvl="1">
+      <w:start w:val="1"/>
+      <w:numFmt w:val="bullet"/>
+      <w:lvlText w:val="o"/>
+      <w:lvlJc w:val="left"/>
+      <w:pPr>
+        <w:tabs>
+          <w:tab w:val="num" w:pos="1440"/>
+        </w:tabs>
+        <w:ind w:left="1440" w:hanging="360"/>
+      </w:pPr>
+      <w:rPr>
+        <w:rFonts w:ascii="Courier New" w:hAnsi="Courier New" w:hint="default"/>
+        <w:sz w:val="20"/>
+      </w:rPr>
+    </w:lvl>
+    <w:lvl w:ilvl="2" w:tentative="1">
+      <w:start w:val="1"/>
+      <w:numFmt w:val="bullet"/>
+      <w:lvlText w:val=""/>
+      <w:lvlJc w:val="left"/>
+      <w:pPr>
+        <w:tabs>
+          <w:tab w:val="num" w:pos="2160"/>
+        </w:tabs>
+        <w:ind w:left="2160" w:hanging="360"/>
+      </w:pPr>
+      <w:rPr>
+        <w:rFonts w:ascii="Wingdings" w:hAnsi="Wingdings" w:hint="default"/>
+        <w:sz w:val="20"/>
+      </w:rPr>
+    </w:lvl>
+    <w:lvl w:ilvl="3" w:tentative="1">
+      <w:start w:val="1"/>
+      <w:numFmt w:val="bullet"/>
+      <w:lvlText w:val=""/>
+      <w:lvlJc w:val="left"/>
+      <w:pPr>
+        <w:tabs>
+          <w:tab w:val="num" w:pos="2880"/>
+        </w:tabs>
+        <w:ind w:left="2880" w:hanging="360"/>
+      </w:pPr>
+      <w:rPr>
+        <w:rFonts w:ascii="Wingdings" w:hAnsi="Wingdings" w:hint="default"/>
+        <w:sz w:val="20"/>
+      </w:rPr>
+    </w:lvl>
+    <w:lvl w:ilvl="4" w:tentative="1">
+      <w:start w:val="1"/>
+      <w:numFmt w:val="bullet"/>
+      <w:lvlText w:val=""/>
+      <w:lvlJc w:val="left"/>
+      <w:pPr>
+        <w:tabs>
+          <w:tab w:val="num" w:pos="3600"/>
+        </w:tabs>
+        <w:ind w:left="3600" w:hanging="360"/>
+      </w:pPr>
+      <w:rPr>
+        <w:rFonts w:ascii="Wingdings" w:hAnsi="Wingdings" w:hint="default"/>
+        <w:sz w:val="20"/>
+      </w:rPr>
+    </w:lvl>
+    <w:lvl w:ilvl="5" w:tentative="1">
+      <w:start w:val="1"/>
+      <w:numFmt w:val="bullet"/>
+      <w:lvlText w:val=""/>
+      <w:lvlJc w:val="left"/>
+      <w:pPr>
+        <w:tabs>
+          <w:tab w:val="num" w:pos="4320"/>
+        </w:tabs>
+        <w:ind w:left="4320" w:hanging="360"/>
+      </w:pPr>
+      <w:rPr>
+        <w:rFonts w:ascii="Wingdings" w:hAnsi="Wingdings" w:hint="default"/>
+        <w:sz w:val="20"/>
+      </w:rPr>
+    </w:lvl>
+    <w:lvl w:ilvl="6" w:tentative="1">
+      <w:start w:val="1"/>
+      <w:numFmt w:val="bullet"/>
+      <w:lvlText w:val=""/>
+      <w:lvlJc w:val="left"/>
+      <w:pPr>
+        <w:tabs>
+          <w:tab w:val="num" w:pos="5040"/>
+        </w:tabs>
+        <w:ind w:left="5040" w:hanging="360"/>
+      </w:pPr>
+      <w:rPr>
+        <w:rFonts w:ascii="Wingdings" w:hAnsi="Wingdings" w:hint="default"/>
+        <w:sz w:val="20"/>
+      </w:rPr>
+    </w:lvl>
+    <w:lvl w:ilvl="7" w:tentative="1">
+      <w:start w:val="1"/>
+      <w:numFmt w:val="bullet"/>
+      <w:lvlText w:val=""/>
+      <w:lvlJc w:val="left"/>
+      <w:pPr>
+        <w:tabs>
+          <w:tab w:val="num" w:pos="5760"/>
+        </w:tabs>
+        <w:ind w:left="5760" w:hanging="360"/>
+      </w:pPr>
+      <w:rPr>
+        <w:rFonts w:ascii="Wingdings" w:hAnsi="Wingdings" w:hint="default"/>
+        <w:sz w:val="20"/>
+      </w:rPr>
+    </w:lvl>
+    <w:lvl w:ilvl="8" w:tentative="1">
+      <w:start w:val="1"/>
+      <w:numFmt w:val="bullet"/>
+      <w:lvlText w:val=""/>
+      <w:lvlJc w:val="left"/>
+      <w:pPr>
+        <w:tabs>
+          <w:tab w:val="num" w:pos="6480"/>
+        </w:tabs>
+        <w:ind w:left="6480" w:hanging="360"/>
+      </w:pPr>
+      <w:rPr>
+        <w:rFonts w:ascii="Wingdings" w:hAnsi="Wingdings" w:hint="default"/>
+        <w:sz w:val="20"/>
+      </w:rPr>
+    </w:lvl>
+  </w:abstractNum>
+  <w:abstractNum w:abstractNumId="6" w15:restartNumberingAfterBreak="0">
     <w:nsid w:val="23B22E91"/>
     <w:multiLevelType w:val="multilevel"/>
     <w:tmpl w:val="4F8E66A0"/>
@@ -4985,7 +7353,7 @@
       </w:pPr>
     </w:lvl>
   </w:abstractNum>
-  <w:abstractNum w:abstractNumId="4" w15:restartNumberingAfterBreak="0">
+  <w:abstractNum w:abstractNumId="7" w15:restartNumberingAfterBreak="0">
     <w:nsid w:val="28464458"/>
     <w:multiLevelType w:val="multilevel"/>
     <w:tmpl w:val="3E824E50"/>
@@ -5098,7 +7466,7 @@
       </w:pPr>
     </w:lvl>
   </w:abstractNum>
-  <w:abstractNum w:abstractNumId="5" w15:restartNumberingAfterBreak="0">
+  <w:abstractNum w:abstractNumId="8" w15:restartNumberingAfterBreak="0">
     <w:nsid w:val="30A43877"/>
     <w:multiLevelType w:val="multilevel"/>
     <w:tmpl w:val="B2F4EBF4"/>
@@ -5211,7 +7579,7 @@
       </w:pPr>
     </w:lvl>
   </w:abstractNum>
-  <w:abstractNum w:abstractNumId="6" w15:restartNumberingAfterBreak="0">
+  <w:abstractNum w:abstractNumId="9" w15:restartNumberingAfterBreak="0">
     <w:nsid w:val="3FFF5BF2"/>
     <w:multiLevelType w:val="multilevel"/>
     <w:tmpl w:val="35F09196"/>
@@ -5324,7 +7692,7 @@
       </w:pPr>
     </w:lvl>
   </w:abstractNum>
-  <w:abstractNum w:abstractNumId="7" w15:restartNumberingAfterBreak="0">
+  <w:abstractNum w:abstractNumId="10" w15:restartNumberingAfterBreak="0">
     <w:nsid w:val="41297B1F"/>
     <w:multiLevelType w:val="multilevel"/>
     <w:tmpl w:val="32F8B298"/>
@@ -5437,7 +7805,7 @@
       </w:pPr>
     </w:lvl>
   </w:abstractNum>
-  <w:abstractNum w:abstractNumId="8" w15:restartNumberingAfterBreak="0">
+  <w:abstractNum w:abstractNumId="11" w15:restartNumberingAfterBreak="0">
     <w:nsid w:val="543B2945"/>
     <w:multiLevelType w:val="multilevel"/>
     <w:tmpl w:val="FC4C8AB6"/>
@@ -5550,7 +7918,7 @@
       </w:pPr>
     </w:lvl>
   </w:abstractNum>
-  <w:abstractNum w:abstractNumId="9" w15:restartNumberingAfterBreak="0">
+  <w:abstractNum w:abstractNumId="12" w15:restartNumberingAfterBreak="0">
     <w:nsid w:val="5B156D54"/>
     <w:multiLevelType w:val="multilevel"/>
     <w:tmpl w:val="233C2D02"/>
@@ -5663,7 +8031,7 @@
       </w:pPr>
     </w:lvl>
   </w:abstractNum>
-  <w:abstractNum w:abstractNumId="10" w15:restartNumberingAfterBreak="0">
+  <w:abstractNum w:abstractNumId="13" w15:restartNumberingAfterBreak="0">
     <w:nsid w:val="5C707315"/>
     <w:multiLevelType w:val="multilevel"/>
     <w:tmpl w:val="940AF25C"/>
@@ -5780,7 +8148,7 @@
       </w:pPr>
     </w:lvl>
   </w:abstractNum>
-  <w:abstractNum w:abstractNumId="11" w15:restartNumberingAfterBreak="0">
+  <w:abstractNum w:abstractNumId="14" w15:restartNumberingAfterBreak="0">
     <w:nsid w:val="68D04A78"/>
     <w:multiLevelType w:val="multilevel"/>
     <w:tmpl w:val="361A074E"/>
@@ -5893,7 +8261,7 @@
       </w:pPr>
     </w:lvl>
   </w:abstractNum>
-  <w:abstractNum w:abstractNumId="12" w15:restartNumberingAfterBreak="0">
+  <w:abstractNum w:abstractNumId="15" w15:restartNumberingAfterBreak="0">
     <w:nsid w:val="690D65AF"/>
     <w:multiLevelType w:val="multilevel"/>
     <w:tmpl w:val="580E7FCE"/>
@@ -6006,7 +8374,7 @@
       </w:pPr>
     </w:lvl>
   </w:abstractNum>
-  <w:abstractNum w:abstractNumId="13" w15:restartNumberingAfterBreak="0">
+  <w:abstractNum w:abstractNumId="16" w15:restartNumberingAfterBreak="0">
     <w:nsid w:val="6CF300B4"/>
     <w:multiLevelType w:val="multilevel"/>
     <w:tmpl w:val="45424236"/>
@@ -6119,7 +8487,7 @@
       </w:pPr>
     </w:lvl>
   </w:abstractNum>
-  <w:abstractNum w:abstractNumId="14" w15:restartNumberingAfterBreak="0">
+  <w:abstractNum w:abstractNumId="17" w15:restartNumberingAfterBreak="0">
     <w:nsid w:val="76322DC1"/>
     <w:multiLevelType w:val="multilevel"/>
     <w:tmpl w:val="2786C7E4"/>
@@ -6233,49 +8601,58 @@
     </w:lvl>
   </w:abstractNum>
   <w:num w:numId="1" w16cid:durableId="558901959">
-    <w:abstractNumId w:val="0"/>
+    <w:abstractNumId w:val="1"/>
   </w:num>
   <w:num w:numId="2" w16cid:durableId="2145997930">
+    <w:abstractNumId w:val="17"/>
+  </w:num>
+  <w:num w:numId="3" w16cid:durableId="2117168069">
+    <w:abstractNumId w:val="10"/>
+  </w:num>
+  <w:num w:numId="4" w16cid:durableId="1348411223">
+    <w:abstractNumId w:val="7"/>
+  </w:num>
+  <w:num w:numId="5" w16cid:durableId="1518350167">
+    <w:abstractNumId w:val="3"/>
+  </w:num>
+  <w:num w:numId="6" w16cid:durableId="2083327884">
+    <w:abstractNumId w:val="12"/>
+  </w:num>
+  <w:num w:numId="7" w16cid:durableId="902758567">
+    <w:abstractNumId w:val="13"/>
+  </w:num>
+  <w:num w:numId="8" w16cid:durableId="981883762">
+    <w:abstractNumId w:val="6"/>
+  </w:num>
+  <w:num w:numId="9" w16cid:durableId="1405031395">
+    <w:abstractNumId w:val="15"/>
+  </w:num>
+  <w:num w:numId="10" w16cid:durableId="110052222">
+    <w:abstractNumId w:val="11"/>
+  </w:num>
+  <w:num w:numId="11" w16cid:durableId="1464351474">
     <w:abstractNumId w:val="14"/>
   </w:num>
-  <w:num w:numId="3" w16cid:durableId="2117168069">
-    <w:abstractNumId w:val="7"/>
-  </w:num>
-  <w:num w:numId="4" w16cid:durableId="1348411223">
+  <w:num w:numId="12" w16cid:durableId="1373191211">
     <w:abstractNumId w:val="4"/>
   </w:num>
-  <w:num w:numId="5" w16cid:durableId="1518350167">
-    <w:abstractNumId w:val="1"/>
+  <w:num w:numId="13" w16cid:durableId="780151543">
+    <w:abstractNumId w:val="16"/>
   </w:num>
-  <w:num w:numId="6" w16cid:durableId="2083327884">
+  <w:num w:numId="14" w16cid:durableId="1349329982">
     <w:abstractNumId w:val="9"/>
   </w:num>
-  <w:num w:numId="7" w16cid:durableId="902758567">
-    <w:abstractNumId w:val="10"/>
-  </w:num>
-  <w:num w:numId="8" w16cid:durableId="981883762">
-    <w:abstractNumId w:val="3"/>
-  </w:num>
-  <w:num w:numId="9" w16cid:durableId="1405031395">
-    <w:abstractNumId w:val="12"/>
-  </w:num>
-  <w:num w:numId="10" w16cid:durableId="110052222">
+  <w:num w:numId="15" w16cid:durableId="1046835972">
     <w:abstractNumId w:val="8"/>
   </w:num>
-  <w:num w:numId="11" w16cid:durableId="1464351474">
-    <w:abstractNumId w:val="11"/>
-  </w:num>
-  <w:num w:numId="12" w16cid:durableId="1373191211">
+  <w:num w:numId="16" w16cid:durableId="256596019">
     <w:abstractNumId w:val="2"/>
   </w:num>
-  <w:num w:numId="13" w16cid:durableId="780151543">
-    <w:abstractNumId w:val="13"/>
+  <w:num w:numId="17" w16cid:durableId="1872717459">
+    <w:abstractNumId w:val="5"/>
   </w:num>
-  <w:num w:numId="14" w16cid:durableId="1349329982">
-    <w:abstractNumId w:val="6"/>
-  </w:num>
-  <w:num w:numId="15" w16cid:durableId="1046835972">
-    <w:abstractNumId w:val="5"/>
+  <w:num w:numId="18" w16cid:durableId="1426683210">
+    <w:abstractNumId w:val="0"/>
   </w:num>
 </w:numbering>
 </file>
@@ -6708,7 +9085,6 @@
     <w:next w:val="Normal"/>
     <w:link w:val="Ttulo2Car"/>
     <w:uiPriority w:val="9"/>
-    <w:semiHidden/>
     <w:unhideWhenUsed/>
     <w:qFormat/>
     <w:rsid w:val="00527173"/>
@@ -6924,7 +9300,6 @@
     <w:basedOn w:val="Fuentedeprrafopredeter"/>
     <w:link w:val="Ttulo2"/>
     <w:uiPriority w:val="9"/>
-    <w:semiHidden/>
     <w:rsid w:val="00527173"/>
     <w:rPr>
       <w:rFonts w:asciiTheme="majorHAnsi" w:eastAsiaTheme="majorEastAsia" w:hAnsiTheme="majorHAnsi" w:cstheme="majorBidi"/>
@@ -7194,6 +9569,36 @@
       <w:smallCaps/>
       <w:color w:val="0F4761" w:themeColor="accent1" w:themeShade="BF"/>
       <w:spacing w:val="5"/>
+    </w:rPr>
+  </w:style>
+  <w:style w:type="character" w:styleId="CdigoHTML">
+    <w:name w:val="HTML Code"/>
+    <w:basedOn w:val="Fuentedeprrafopredeter"/>
+    <w:uiPriority w:val="99"/>
+    <w:semiHidden/>
+    <w:unhideWhenUsed/>
+    <w:rsid w:val="00F1616F"/>
+    <w:rPr>
+      <w:rFonts w:ascii="Courier New" w:eastAsia="Times New Roman" w:hAnsi="Courier New" w:cs="Courier New"/>
+      <w:sz w:val="20"/>
+      <w:szCs w:val="20"/>
+    </w:rPr>
+  </w:style>
+  <w:style w:type="paragraph" w:styleId="NormalWeb">
+    <w:name w:val="Normal (Web)"/>
+    <w:basedOn w:val="Normal"/>
+    <w:uiPriority w:val="99"/>
+    <w:semiHidden/>
+    <w:unhideWhenUsed/>
+    <w:rsid w:val="00F1616F"/>
+    <w:pPr>
+      <w:spacing w:before="100" w:beforeAutospacing="1" w:after="100" w:afterAutospacing="1" w:line="240" w:lineRule="auto"/>
+    </w:pPr>
+    <w:rPr>
+      <w:rFonts w:ascii="Times New Roman" w:eastAsia="Times New Roman" w:hAnsi="Times New Roman" w:cs="Times New Roman"/>
+      <w:kern w:val="0"/>
+      <w:lang w:eastAsia="es-AR"/>
+      <w14:ligatures w14:val="none"/>
     </w:rPr>
   </w:style>
 </w:styles>

</xml_diff>